<commit_message>
Expand §5 with per-rule walkthrough cards for all 37 rules
Every rule (GEN-01..04, PSM-01..12, SMX-02..05, SLO-01..09,
PKG-01..07) now gets a colour-coded card carrying:
- Rule ID + title with severity chip
- What it checks
- Passes when (concrete pass example)
- Fails when (concrete fail example + the message the engine emits)
- Why it matters (root-cause / business impact)

The summary tables in §5.1–§5.5 remain for at-a-glance reference;
the new walkthroughs sit beneath each table so the document is both
scannable and detailed.

Implementation: rule data lifted into GEN_RULES / PSM_RULES /
SMX_RULES / SLO_RULES / PKG_RULES; rule_card() helper renders each.
lead() moved to top-level helpers (was previously scoped inside §11).

Co-Authored-By: Claude Opus 4.7 <noreply@anthropic.com>
</commit_message>
<xml_diff>
--- a/docs/PROJECT_REPORT_v2.docx
+++ b/docs/PROJECT_REPORT_v2.docx
@@ -2006,6 +2006,455 @@
     </w:tbl>
     <w:p>
       <w:pPr>
+        <w:spacing w:before="200" w:after="40"/>
+      </w:pPr>
+      <w:r>
+        <w:rPr>
+          <w:b/>
+          <w:color w:val="334155"/>
+          <w:sz w:val="24"/>
+        </w:rPr>
+        <w:t>Walkthrough — General Rules</w:t>
+      </w:r>
+    </w:p>
+    <w:p>
+      <w:pPr>
+        <w:spacing w:before="200" w:after="40"/>
+      </w:pPr>
+      <w:r>
+        <w:rPr>
+          <w:b/>
+          <w:color w:val="334155"/>
+          <w:sz w:val="22"/>
+        </w:rPr>
+        <w:t xml:space="preserve">GEN-01  </w:t>
+      </w:r>
+      <w:r>
+        <w:rPr>
+          <w:b/>
+          <w:color w:val="102A43"/>
+          <w:sz w:val="22"/>
+        </w:rPr>
+        <w:t>Streaming silence &gt; 5 min during production hours</w:t>
+      </w:r>
+      <w:r>
+        <w:rPr>
+          <w:b/>
+          <w:color w:val="C98A0C"/>
+          <w:sz w:val="18"/>
+        </w:rPr>
+        <w:t xml:space="preserve">  [WARNING]</w:t>
+      </w:r>
+    </w:p>
+    <w:p>
+      <w:pPr>
+        <w:spacing w:after="20"/>
+        <w:ind w:left="170"/>
+      </w:pPr>
+      <w:r>
+        <w:rPr>
+          <w:b/>
+          <w:color w:val="06768A"/>
+          <w:sz w:val="20"/>
+        </w:rPr>
+        <w:t xml:space="preserve">What it checks. </w:t>
+      </w:r>
+      <w:r>
+        <w:rPr>
+          <w:sz w:val="20"/>
+        </w:rPr>
+        <w:t>A tag must keep publishing during production hours (06:00–22:00 IST). Any silence longer than 5 min mid-shift is flagged as a comms drop.</w:t>
+      </w:r>
+    </w:p>
+    <w:p>
+      <w:pPr>
+        <w:spacing w:after="20"/>
+        <w:ind w:left="170"/>
+      </w:pPr>
+      <w:r>
+        <w:rPr>
+          <w:b/>
+          <w:color w:val="06768A"/>
+          <w:sz w:val="20"/>
+        </w:rPr>
+        <w:t xml:space="preserve">Passes when. </w:t>
+      </w:r>
+      <w:r>
+        <w:rPr>
+          <w:sz w:val="20"/>
+        </w:rPr>
+        <w:t>Reading at 14:32:15, next at 14:33:14 — gap 59 s. OK.</w:t>
+      </w:r>
+    </w:p>
+    <w:p>
+      <w:pPr>
+        <w:spacing w:after="20"/>
+        <w:ind w:left="170"/>
+      </w:pPr>
+      <w:r>
+        <w:rPr>
+          <w:b/>
+          <w:color w:val="06768A"/>
+          <w:sz w:val="20"/>
+        </w:rPr>
+        <w:t xml:space="preserve">Fails when. </w:t>
+      </w:r>
+      <w:r>
+        <w:rPr>
+          <w:sz w:val="20"/>
+        </w:rPr>
+        <w:t>Reading at 14:32:15, next at 14:42:18 — gap 10 m 3 s during shift. Emits "Streaming stopped 10m3s".</w:t>
+      </w:r>
+    </w:p>
+    <w:p>
+      <w:pPr>
+        <w:spacing w:after="20"/>
+        <w:ind w:left="170"/>
+      </w:pPr>
+      <w:r>
+        <w:rPr>
+          <w:b/>
+          <w:color w:val="06768A"/>
+          <w:sz w:val="20"/>
+        </w:rPr>
+        <w:t xml:space="preserve">Why it matters. </w:t>
+      </w:r>
+      <w:r>
+        <w:rPr>
+          <w:sz w:val="20"/>
+        </w:rPr>
+        <w:t>Silent sensors are the most common pre-failure signal. Catching them within minutes is the difference between a hot fix and a halted line.</w:t>
+      </w:r>
+    </w:p>
+    <w:p>
+      <w:pPr>
+        <w:spacing w:before="200" w:after="40"/>
+      </w:pPr>
+      <w:r>
+        <w:rPr>
+          <w:b/>
+          <w:color w:val="334155"/>
+          <w:sz w:val="22"/>
+        </w:rPr>
+        <w:t xml:space="preserve">GEN-02  </w:t>
+      </w:r>
+      <w:r>
+        <w:rPr>
+          <w:b/>
+          <w:color w:val="102A43"/>
+          <w:sz w:val="22"/>
+        </w:rPr>
+        <w:t>Null or empty value</w:t>
+      </w:r>
+      <w:r>
+        <w:rPr>
+          <w:b/>
+          <w:color w:val="C98A0C"/>
+          <w:sz w:val="18"/>
+        </w:rPr>
+        <w:t xml:space="preserve">  [WARNING]</w:t>
+      </w:r>
+    </w:p>
+    <w:p>
+      <w:pPr>
+        <w:spacing w:after="20"/>
+        <w:ind w:left="170"/>
+      </w:pPr>
+      <w:r>
+        <w:rPr>
+          <w:b/>
+          <w:color w:val="06768A"/>
+          <w:sz w:val="20"/>
+        </w:rPr>
+        <w:t xml:space="preserve">What it checks. </w:t>
+      </w:r>
+      <w:r>
+        <w:rPr>
+          <w:sz w:val="20"/>
+        </w:rPr>
+        <w:t>A row's Value must not be null or whitespace. Bag-out idle (a single ",") is exempt because that is a legitimate "no bag in dispenser" state.</w:t>
+      </w:r>
+    </w:p>
+    <w:p>
+      <w:pPr>
+        <w:spacing w:after="20"/>
+        <w:ind w:left="170"/>
+      </w:pPr>
+      <w:r>
+        <w:rPr>
+          <w:b/>
+          <w:color w:val="06768A"/>
+          <w:sz w:val="20"/>
+        </w:rPr>
+        <w:t xml:space="preserve">Passes when. </w:t>
+      </w:r>
+      <w:r>
+        <w:rPr>
+          <w:sz w:val="20"/>
+        </w:rPr>
+        <w:t>Value = "D:202641,S:3,B:38,..." — OK.</w:t>
+      </w:r>
+    </w:p>
+    <w:p>
+      <w:pPr>
+        <w:spacing w:after="20"/>
+        <w:ind w:left="170"/>
+      </w:pPr>
+      <w:r>
+        <w:rPr>
+          <w:b/>
+          <w:color w:val="06768A"/>
+          <w:sz w:val="20"/>
+        </w:rPr>
+        <w:t xml:space="preserve">Fails when. </w:t>
+      </w:r>
+      <w:r>
+        <w:rPr>
+          <w:sz w:val="20"/>
+        </w:rPr>
+        <w:t>Value = "" — emits "Null or empty value".</w:t>
+      </w:r>
+    </w:p>
+    <w:p>
+      <w:pPr>
+        <w:spacing w:after="20"/>
+        <w:ind w:left="170"/>
+      </w:pPr>
+      <w:r>
+        <w:rPr>
+          <w:b/>
+          <w:color w:val="06768A"/>
+          <w:sz w:val="20"/>
+        </w:rPr>
+        <w:t xml:space="preserve">Why it matters. </w:t>
+      </w:r>
+      <w:r>
+        <w:rPr>
+          <w:sz w:val="20"/>
+        </w:rPr>
+        <w:t>A null on the wire usually means the PLC tag was unbound or the read failed; the value cannot be trusted by any downstream rule.</w:t>
+      </w:r>
+    </w:p>
+    <w:p>
+      <w:pPr>
+        <w:spacing w:before="200" w:after="40"/>
+      </w:pPr>
+      <w:r>
+        <w:rPr>
+          <w:b/>
+          <w:color w:val="334155"/>
+          <w:sz w:val="22"/>
+        </w:rPr>
+        <w:t xml:space="preserve">GEN-03  </w:t>
+      </w:r>
+      <w:r>
+        <w:rPr>
+          <w:b/>
+          <w:color w:val="102A43"/>
+          <w:sz w:val="22"/>
+        </w:rPr>
+        <w:t>Timestamps must be monotonically increasing per tag</w:t>
+      </w:r>
+      <w:r>
+        <w:rPr>
+          <w:b/>
+          <w:color w:val="426BA5"/>
+          <w:sz w:val="18"/>
+        </w:rPr>
+        <w:t xml:space="preserve">  [INFO]</w:t>
+      </w:r>
+    </w:p>
+    <w:p>
+      <w:pPr>
+        <w:spacing w:after="20"/>
+        <w:ind w:left="170"/>
+      </w:pPr>
+      <w:r>
+        <w:rPr>
+          <w:b/>
+          <w:color w:val="06768A"/>
+          <w:sz w:val="20"/>
+        </w:rPr>
+        <w:t xml:space="preserve">What it checks. </w:t>
+      </w:r>
+      <w:r>
+        <w:rPr>
+          <w:sz w:val="20"/>
+        </w:rPr>
+        <w:t>Successive readings on the same tag must have non-decreasing timestamps.</w:t>
+      </w:r>
+    </w:p>
+    <w:p>
+      <w:pPr>
+        <w:spacing w:after="20"/>
+        <w:ind w:left="170"/>
+      </w:pPr>
+      <w:r>
+        <w:rPr>
+          <w:b/>
+          <w:color w:val="06768A"/>
+          <w:sz w:val="20"/>
+        </w:rPr>
+        <w:t xml:space="preserve">Passes when. </w:t>
+      </w:r>
+      <w:r>
+        <w:rPr>
+          <w:sz w:val="20"/>
+        </w:rPr>
+        <w:t>T1 = 14:32:15, T2 = 14:33:14 — OK.</w:t>
+      </w:r>
+    </w:p>
+    <w:p>
+      <w:pPr>
+        <w:spacing w:after="20"/>
+        <w:ind w:left="170"/>
+      </w:pPr>
+      <w:r>
+        <w:rPr>
+          <w:b/>
+          <w:color w:val="06768A"/>
+          <w:sz w:val="20"/>
+        </w:rPr>
+        <w:t xml:space="preserve">Fails when. </w:t>
+      </w:r>
+      <w:r>
+        <w:rPr>
+          <w:sz w:val="20"/>
+        </w:rPr>
+        <w:t>T1 = 14:33:14, T2 = 14:32:15 — emits "Out-of-order TS".</w:t>
+      </w:r>
+    </w:p>
+    <w:p>
+      <w:pPr>
+        <w:spacing w:after="20"/>
+        <w:ind w:left="170"/>
+      </w:pPr>
+      <w:r>
+        <w:rPr>
+          <w:b/>
+          <w:color w:val="06768A"/>
+          <w:sz w:val="20"/>
+        </w:rPr>
+        <w:t xml:space="preserve">Why it matters. </w:t>
+      </w:r>
+      <w:r>
+        <w:rPr>
+          <w:sz w:val="20"/>
+        </w:rPr>
+        <w:t>Out-of-order timestamps indicate gateway clock skew, message replay, or buffer flushes that distort every downstream time-series calculation.</w:t>
+      </w:r>
+    </w:p>
+    <w:p>
+      <w:pPr>
+        <w:spacing w:before="200" w:after="40"/>
+      </w:pPr>
+      <w:r>
+        <w:rPr>
+          <w:b/>
+          <w:color w:val="334155"/>
+          <w:sz w:val="22"/>
+        </w:rPr>
+        <w:t xml:space="preserve">GEN-04  </w:t>
+      </w:r>
+      <w:r>
+        <w:rPr>
+          <w:b/>
+          <w:color w:val="102A43"/>
+          <w:sz w:val="22"/>
+        </w:rPr>
+        <w:t>Source metadata sanity</w:t>
+      </w:r>
+      <w:r>
+        <w:rPr>
+          <w:b/>
+          <w:color w:val="426BA5"/>
+          <w:sz w:val="18"/>
+        </w:rPr>
+        <w:t xml:space="preserve">  [INFO]</w:t>
+      </w:r>
+    </w:p>
+    <w:p>
+      <w:pPr>
+        <w:spacing w:after="20"/>
+        <w:ind w:left="170"/>
+      </w:pPr>
+      <w:r>
+        <w:rPr>
+          <w:b/>
+          <w:color w:val="06768A"/>
+          <w:sz w:val="20"/>
+        </w:rPr>
+        <w:t xml:space="preserve">What it checks. </w:t>
+      </w:r>
+      <w:r>
+        <w:rPr>
+          <w:sz w:val="20"/>
+        </w:rPr>
+        <w:t>Every row must have SiteId="LLPL", IotDeviceId="uaq-lakme-hul-iotedge-01", SensorId="opcua".</w:t>
+      </w:r>
+    </w:p>
+    <w:p>
+      <w:pPr>
+        <w:spacing w:after="20"/>
+        <w:ind w:left="170"/>
+      </w:pPr>
+      <w:r>
+        <w:rPr>
+          <w:b/>
+          <w:color w:val="06768A"/>
+          <w:sz w:val="20"/>
+        </w:rPr>
+        <w:t xml:space="preserve">Passes when. </w:t>
+      </w:r>
+      <w:r>
+        <w:rPr>
+          <w:sz w:val="20"/>
+        </w:rPr>
+        <w:t>All three match — OK.</w:t>
+      </w:r>
+    </w:p>
+    <w:p>
+      <w:pPr>
+        <w:spacing w:after="20"/>
+        <w:ind w:left="170"/>
+      </w:pPr>
+      <w:r>
+        <w:rPr>
+          <w:b/>
+          <w:color w:val="06768A"/>
+          <w:sz w:val="20"/>
+        </w:rPr>
+        <w:t xml:space="preserve">Fails when. </w:t>
+      </w:r>
+      <w:r>
+        <w:rPr>
+          <w:sz w:val="20"/>
+        </w:rPr>
+        <w:t>SiteId = "HUL" — emits "Unexpected source metadata: SiteId=HUL".</w:t>
+      </w:r>
+    </w:p>
+    <w:p>
+      <w:pPr>
+        <w:spacing w:after="20"/>
+        <w:ind w:left="170"/>
+      </w:pPr>
+      <w:r>
+        <w:rPr>
+          <w:b/>
+          <w:color w:val="06768A"/>
+          <w:sz w:val="20"/>
+        </w:rPr>
+        <w:t xml:space="preserve">Why it matters. </w:t>
+      </w:r>
+      <w:r>
+        <w:rPr>
+          <w:sz w:val="20"/>
+        </w:rPr>
+        <w:t>Catches mis-routed telemetry from another plant or a swapped gateway before it contaminates the dashboard.</w:t>
+      </w:r>
+    </w:p>
+    <w:p>
+      <w:pPr>
         <w:spacing w:before="280" w:after="80"/>
       </w:pPr>
       <w:r>
@@ -2633,6 +3082,1327 @@
     </w:tbl>
     <w:p>
       <w:pPr>
+        <w:spacing w:before="200" w:after="40"/>
+      </w:pPr>
+      <w:r>
+        <w:rPr>
+          <w:b/>
+          <w:color w:val="334155"/>
+          <w:sz w:val="24"/>
+        </w:rPr>
+        <w:t>Walkthrough — PSM Rules</w:t>
+      </w:r>
+    </w:p>
+    <w:p>
+      <w:pPr>
+        <w:spacing w:before="200" w:after="40"/>
+      </w:pPr>
+      <w:r>
+        <w:rPr>
+          <w:b/>
+          <w:color w:val="334155"/>
+          <w:sz w:val="22"/>
+        </w:rPr>
+        <w:t xml:space="preserve">PSM-01  </w:t>
+      </w:r>
+      <w:r>
+        <w:rPr>
+          <w:b/>
+          <w:color w:val="102A43"/>
+          <w:sz w:val="22"/>
+        </w:rPr>
+        <w:t>Schema must contain all of D, S, B, R, RM, SP, PV</w:t>
+      </w:r>
+      <w:r>
+        <w:rPr>
+          <w:b/>
+          <w:color w:val="C0392B"/>
+          <w:sz w:val="18"/>
+        </w:rPr>
+        <w:t xml:space="preserve">  [CRITICAL]</w:t>
+      </w:r>
+    </w:p>
+    <w:p>
+      <w:pPr>
+        <w:spacing w:after="20"/>
+        <w:ind w:left="170"/>
+      </w:pPr>
+      <w:r>
+        <w:rPr>
+          <w:b/>
+          <w:color w:val="06768A"/>
+          <w:sz w:val="20"/>
+        </w:rPr>
+        <w:t xml:space="preserve">What it checks. </w:t>
+      </w:r>
+      <w:r>
+        <w:rPr>
+          <w:sz w:val="20"/>
+        </w:rPr>
+        <w:t>Every PSM batch string must carry the full seven-field schema.</w:t>
+      </w:r>
+    </w:p>
+    <w:p>
+      <w:pPr>
+        <w:spacing w:after="20"/>
+        <w:ind w:left="170"/>
+      </w:pPr>
+      <w:r>
+        <w:rPr>
+          <w:b/>
+          <w:color w:val="06768A"/>
+          <w:sz w:val="20"/>
+        </w:rPr>
+        <w:t xml:space="preserve">Passes when. </w:t>
+      </w:r>
+      <w:r>
+        <w:rPr>
+          <w:sz w:val="20"/>
+        </w:rPr>
+        <w:t>"D:202641,S:3,B:38,R:PLUMERIA NOODLES,RM:EDTA,SP:2.0499,PV:2.0850" — OK.</w:t>
+      </w:r>
+    </w:p>
+    <w:p>
+      <w:pPr>
+        <w:spacing w:after="20"/>
+        <w:ind w:left="170"/>
+      </w:pPr>
+      <w:r>
+        <w:rPr>
+          <w:b/>
+          <w:color w:val="06768A"/>
+          <w:sz w:val="20"/>
+        </w:rPr>
+        <w:t xml:space="preserve">Fails when. </w:t>
+      </w:r>
+      <w:r>
+        <w:rPr>
+          <w:sz w:val="20"/>
+        </w:rPr>
+        <w:t>"D:202641,S:3,B:38,R:PLUMERIA,RM:EDTA,SP:2.0499" — emits "Schema incomplete: PV".</w:t>
+      </w:r>
+    </w:p>
+    <w:p>
+      <w:pPr>
+        <w:spacing w:after="20"/>
+        <w:ind w:left="170"/>
+      </w:pPr>
+      <w:r>
+        <w:rPr>
+          <w:b/>
+          <w:color w:val="06768A"/>
+          <w:sz w:val="20"/>
+        </w:rPr>
+        <w:t xml:space="preserve">Why it matters. </w:t>
+      </w:r>
+      <w:r>
+        <w:rPr>
+          <w:sz w:val="20"/>
+        </w:rPr>
+        <w:t>All downstream PSM rules depend on these fields; a missing field invalidates every analysis run against the row.</w:t>
+      </w:r>
+    </w:p>
+    <w:p>
+      <w:pPr>
+        <w:spacing w:before="200" w:after="40"/>
+      </w:pPr>
+      <w:r>
+        <w:rPr>
+          <w:b/>
+          <w:color w:val="334155"/>
+          <w:sz w:val="22"/>
+        </w:rPr>
+        <w:t xml:space="preserve">PSM-02  </w:t>
+      </w:r>
+      <w:r>
+        <w:rPr>
+          <w:b/>
+          <w:color w:val="102A43"/>
+          <w:sz w:val="22"/>
+        </w:rPr>
+        <w:t>PV must not be 0 while status = dosing (S=2)</w:t>
+      </w:r>
+      <w:r>
+        <w:rPr>
+          <w:b/>
+          <w:color w:val="C0392B"/>
+          <w:sz w:val="18"/>
+        </w:rPr>
+        <w:t xml:space="preserve">  [CRITICAL]</w:t>
+      </w:r>
+    </w:p>
+    <w:p>
+      <w:pPr>
+        <w:spacing w:after="20"/>
+        <w:ind w:left="170"/>
+      </w:pPr>
+      <w:r>
+        <w:rPr>
+          <w:b/>
+          <w:color w:val="06768A"/>
+          <w:sz w:val="20"/>
+        </w:rPr>
+        <w:t xml:space="preserve">What it checks. </w:t>
+      </w:r>
+      <w:r>
+        <w:rPr>
+          <w:sz w:val="20"/>
+        </w:rPr>
+        <w:t>When status code S = 2 (actively dosing), the process value must register some weight (≥ 0.001 kg).</w:t>
+      </w:r>
+    </w:p>
+    <w:p>
+      <w:pPr>
+        <w:spacing w:after="20"/>
+        <w:ind w:left="170"/>
+      </w:pPr>
+      <w:r>
+        <w:rPr>
+          <w:b/>
+          <w:color w:val="06768A"/>
+          <w:sz w:val="20"/>
+        </w:rPr>
+        <w:t xml:space="preserve">Passes when. </w:t>
+      </w:r>
+      <w:r>
+        <w:rPr>
+          <w:sz w:val="20"/>
+        </w:rPr>
+        <w:t>S=2, PV=1.45 kg — dosing is visible, OK.</w:t>
+      </w:r>
+    </w:p>
+    <w:p>
+      <w:pPr>
+        <w:spacing w:after="20"/>
+        <w:ind w:left="170"/>
+      </w:pPr>
+      <w:r>
+        <w:rPr>
+          <w:b/>
+          <w:color w:val="06768A"/>
+          <w:sz w:val="20"/>
+        </w:rPr>
+        <w:t xml:space="preserve">Fails when. </w:t>
+      </w:r>
+      <w:r>
+        <w:rPr>
+          <w:sz w:val="20"/>
+        </w:rPr>
+        <w:t>S=2, PV=0.0 — emits "PV0 while dosing. PV=0".</w:t>
+      </w:r>
+    </w:p>
+    <w:p>
+      <w:pPr>
+        <w:spacing w:after="20"/>
+        <w:ind w:left="170"/>
+      </w:pPr>
+      <w:r>
+        <w:rPr>
+          <w:b/>
+          <w:color w:val="06768A"/>
+          <w:sz w:val="20"/>
+        </w:rPr>
+        <w:t xml:space="preserve">Why it matters. </w:t>
+      </w:r>
+      <w:r>
+        <w:rPr>
+          <w:sz w:val="20"/>
+        </w:rPr>
+        <w:t>A scale reading zero while the dosing valve is open means the flow sensor is stuck or the material is blocked — both stop production.</w:t>
+      </w:r>
+    </w:p>
+    <w:p>
+      <w:pPr>
+        <w:spacing w:before="200" w:after="40"/>
+      </w:pPr>
+      <w:r>
+        <w:rPr>
+          <w:b/>
+          <w:color w:val="334155"/>
+          <w:sz w:val="22"/>
+        </w:rPr>
+        <w:t xml:space="preserve">PSM-03  </w:t>
+      </w:r>
+      <w:r>
+        <w:rPr>
+          <w:b/>
+          <w:color w:val="102A43"/>
+          <w:sz w:val="22"/>
+        </w:rPr>
+        <w:t>PV must not be negative</w:t>
+      </w:r>
+      <w:r>
+        <w:rPr>
+          <w:b/>
+          <w:color w:val="C0392B"/>
+          <w:sz w:val="18"/>
+        </w:rPr>
+        <w:t xml:space="preserve">  [CRITICAL]</w:t>
+      </w:r>
+    </w:p>
+    <w:p>
+      <w:pPr>
+        <w:spacing w:after="20"/>
+        <w:ind w:left="170"/>
+      </w:pPr>
+      <w:r>
+        <w:rPr>
+          <w:b/>
+          <w:color w:val="06768A"/>
+          <w:sz w:val="20"/>
+        </w:rPr>
+        <w:t xml:space="preserve">What it checks. </w:t>
+      </w:r>
+      <w:r>
+        <w:rPr>
+          <w:sz w:val="20"/>
+        </w:rPr>
+        <w:t>PV must be ≥ 0. Weight is a physical quantity; negative values are impossible.</w:t>
+      </w:r>
+    </w:p>
+    <w:p>
+      <w:pPr>
+        <w:spacing w:after="20"/>
+        <w:ind w:left="170"/>
+      </w:pPr>
+      <w:r>
+        <w:rPr>
+          <w:b/>
+          <w:color w:val="06768A"/>
+          <w:sz w:val="20"/>
+        </w:rPr>
+        <w:t xml:space="preserve">Passes when. </w:t>
+      </w:r>
+      <w:r>
+        <w:rPr>
+          <w:sz w:val="20"/>
+        </w:rPr>
+        <w:t>PV = 2.085 kg — OK.</w:t>
+      </w:r>
+    </w:p>
+    <w:p>
+      <w:pPr>
+        <w:spacing w:after="20"/>
+        <w:ind w:left="170"/>
+      </w:pPr>
+      <w:r>
+        <w:rPr>
+          <w:b/>
+          <w:color w:val="06768A"/>
+          <w:sz w:val="20"/>
+        </w:rPr>
+        <w:t xml:space="preserve">Fails when. </w:t>
+      </w:r>
+      <w:r>
+        <w:rPr>
+          <w:sz w:val="20"/>
+        </w:rPr>
+        <w:t>PV = −0.123 — emits "PV is negative (-0.123)".</w:t>
+      </w:r>
+    </w:p>
+    <w:p>
+      <w:pPr>
+        <w:spacing w:after="20"/>
+        <w:ind w:left="170"/>
+      </w:pPr>
+      <w:r>
+        <w:rPr>
+          <w:b/>
+          <w:color w:val="06768A"/>
+          <w:sz w:val="20"/>
+        </w:rPr>
+        <w:t xml:space="preserve">Why it matters. </w:t>
+      </w:r>
+      <w:r>
+        <w:rPr>
+          <w:sz w:val="20"/>
+        </w:rPr>
+        <w:t>Negative weight indicates a tare error or calibration drift; the affected scale is unreliable until recalibrated.</w:t>
+      </w:r>
+    </w:p>
+    <w:p>
+      <w:pPr>
+        <w:spacing w:before="200" w:after="40"/>
+      </w:pPr>
+      <w:r>
+        <w:rPr>
+          <w:b/>
+          <w:color w:val="334155"/>
+          <w:sz w:val="22"/>
+        </w:rPr>
+        <w:t xml:space="preserve">PSM-04  </w:t>
+      </w:r>
+      <w:r>
+        <w:rPr>
+          <w:b/>
+          <w:color w:val="102A43"/>
+          <w:sz w:val="22"/>
+        </w:rPr>
+        <w:t>PV must not drop &gt; 0.5 kg within the same batch counter</w:t>
+      </w:r>
+      <w:r>
+        <w:rPr>
+          <w:b/>
+          <w:color w:val="C98A0C"/>
+          <w:sz w:val="18"/>
+        </w:rPr>
+        <w:t xml:space="preserve">  [WARNING]</w:t>
+      </w:r>
+    </w:p>
+    <w:p>
+      <w:pPr>
+        <w:spacing w:after="20"/>
+        <w:ind w:left="170"/>
+      </w:pPr>
+      <w:r>
+        <w:rPr>
+          <w:b/>
+          <w:color w:val="06768A"/>
+          <w:sz w:val="20"/>
+        </w:rPr>
+        <w:t xml:space="preserve">What it checks. </w:t>
+      </w:r>
+      <w:r>
+        <w:rPr>
+          <w:sz w:val="20"/>
+        </w:rPr>
+        <w:t>Within the same batch counter B, PV must not drop by more than 0.5 kg between consecutive polls. Dosing is monotonic by design.</w:t>
+      </w:r>
+    </w:p>
+    <w:p>
+      <w:pPr>
+        <w:spacing w:after="20"/>
+        <w:ind w:left="170"/>
+      </w:pPr>
+      <w:r>
+        <w:rPr>
+          <w:b/>
+          <w:color w:val="06768A"/>
+          <w:sz w:val="20"/>
+        </w:rPr>
+        <w:t xml:space="preserve">Passes when. </w:t>
+      </w:r>
+      <w:r>
+        <w:rPr>
+          <w:sz w:val="20"/>
+        </w:rPr>
+        <w:t>B=38, PV history 1.2 → 1.5 → 1.8 kg — monotonic, OK.</w:t>
+      </w:r>
+    </w:p>
+    <w:p>
+      <w:pPr>
+        <w:spacing w:after="20"/>
+        <w:ind w:left="170"/>
+      </w:pPr>
+      <w:r>
+        <w:rPr>
+          <w:b/>
+          <w:color w:val="06768A"/>
+          <w:sz w:val="20"/>
+        </w:rPr>
+        <w:t xml:space="preserve">Fails when. </w:t>
+      </w:r>
+      <w:r>
+        <w:rPr>
+          <w:sz w:val="20"/>
+        </w:rPr>
+        <w:t>B=38, PV history 2.0 → 1.4 kg — emits "PV dropped within batch 38 (2-&gt;1.4)".</w:t>
+      </w:r>
+    </w:p>
+    <w:p>
+      <w:pPr>
+        <w:spacing w:after="20"/>
+        <w:ind w:left="170"/>
+      </w:pPr>
+      <w:r>
+        <w:rPr>
+          <w:b/>
+          <w:color w:val="06768A"/>
+          <w:sz w:val="20"/>
+        </w:rPr>
+        <w:t xml:space="preserve">Why it matters. </w:t>
+      </w:r>
+      <w:r>
+        <w:rPr>
+          <w:sz w:val="20"/>
+        </w:rPr>
+        <w:t>A drop mid-batch means the valve flapped, the tank leaked, or the sensor glitched — all need immediate investigation.</w:t>
+      </w:r>
+    </w:p>
+    <w:p>
+      <w:pPr>
+        <w:spacing w:before="200" w:after="40"/>
+      </w:pPr>
+      <w:r>
+        <w:rPr>
+          <w:b/>
+          <w:color w:val="334155"/>
+          <w:sz w:val="22"/>
+        </w:rPr>
+        <w:t xml:space="preserve">PSM-05  </w:t>
+      </w:r>
+      <w:r>
+        <w:rPr>
+          <w:b/>
+          <w:color w:val="102A43"/>
+          <w:sz w:val="22"/>
+        </w:rPr>
+        <w:t>Completion deviation |PV−SP|/SP ≤ 5 % when batch is completed</w:t>
+      </w:r>
+      <w:r>
+        <w:rPr>
+          <w:b/>
+          <w:color w:val="C98A0C"/>
+          <w:sz w:val="18"/>
+        </w:rPr>
+        <w:t xml:space="preserve">  [WARNING]</w:t>
+      </w:r>
+    </w:p>
+    <w:p>
+      <w:pPr>
+        <w:spacing w:after="20"/>
+        <w:ind w:left="170"/>
+      </w:pPr>
+      <w:r>
+        <w:rPr>
+          <w:b/>
+          <w:color w:val="06768A"/>
+          <w:sz w:val="20"/>
+        </w:rPr>
+        <w:t xml:space="preserve">What it checks. </w:t>
+      </w:r>
+      <w:r>
+        <w:rPr>
+          <w:sz w:val="20"/>
+        </w:rPr>
+        <w:t>At completion (S=3), the dosing error |PV − SP| / SP must be ≤ 5 %.</w:t>
+      </w:r>
+    </w:p>
+    <w:p>
+      <w:pPr>
+        <w:spacing w:after="20"/>
+        <w:ind w:left="170"/>
+      </w:pPr>
+      <w:r>
+        <w:rPr>
+          <w:b/>
+          <w:color w:val="06768A"/>
+          <w:sz w:val="20"/>
+        </w:rPr>
+        <w:t xml:space="preserve">Passes when. </w:t>
+      </w:r>
+      <w:r>
+        <w:rPr>
+          <w:sz w:val="20"/>
+        </w:rPr>
+        <w:t>S=3, SP=2.05 kg, PV=2.08 kg — 1.7 % deviation, OK.</w:t>
+      </w:r>
+    </w:p>
+    <w:p>
+      <w:pPr>
+        <w:spacing w:after="20"/>
+        <w:ind w:left="170"/>
+      </w:pPr>
+      <w:r>
+        <w:rPr>
+          <w:b/>
+          <w:color w:val="06768A"/>
+          <w:sz w:val="20"/>
+        </w:rPr>
+        <w:t xml:space="preserve">Fails when. </w:t>
+      </w:r>
+      <w:r>
+        <w:rPr>
+          <w:sz w:val="20"/>
+        </w:rPr>
+        <w:t>S=3, SP=35.74 kg, PV=38.25 kg — 7.0 % — emits "Completion deviation 7.0% &gt; 5%".</w:t>
+      </w:r>
+    </w:p>
+    <w:p>
+      <w:pPr>
+        <w:spacing w:after="20"/>
+        <w:ind w:left="170"/>
+      </w:pPr>
+      <w:r>
+        <w:rPr>
+          <w:b/>
+          <w:color w:val="06768A"/>
+          <w:sz w:val="20"/>
+        </w:rPr>
+        <w:t xml:space="preserve">Why it matters. </w:t>
+      </w:r>
+      <w:r>
+        <w:rPr>
+          <w:sz w:val="20"/>
+        </w:rPr>
+        <w:t>5 % is the per-RM yield tolerance. Anything beyond means the batch is off-spec and may need to be scrapped or reworked.</w:t>
+      </w:r>
+    </w:p>
+    <w:p>
+      <w:pPr>
+        <w:spacing w:before="200" w:after="40"/>
+      </w:pPr>
+      <w:r>
+        <w:rPr>
+          <w:b/>
+          <w:color w:val="334155"/>
+          <w:sz w:val="22"/>
+        </w:rPr>
+        <w:t xml:space="preserve">PSM-06  </w:t>
+      </w:r>
+      <w:r>
+        <w:rPr>
+          <w:b/>
+          <w:color w:val="102A43"/>
+          <w:sz w:val="22"/>
+        </w:rPr>
+        <w:t>Status code must be 1, 2, or 3</w:t>
+      </w:r>
+      <w:r>
+        <w:rPr>
+          <w:b/>
+          <w:color w:val="C98A0C"/>
+          <w:sz w:val="18"/>
+        </w:rPr>
+        <w:t xml:space="preserve">  [WARNING]</w:t>
+      </w:r>
+    </w:p>
+    <w:p>
+      <w:pPr>
+        <w:spacing w:after="20"/>
+        <w:ind w:left="170"/>
+      </w:pPr>
+      <w:r>
+        <w:rPr>
+          <w:b/>
+          <w:color w:val="06768A"/>
+          <w:sz w:val="20"/>
+        </w:rPr>
+        <w:t xml:space="preserve">What it checks. </w:t>
+      </w:r>
+      <w:r>
+        <w:rPr>
+          <w:sz w:val="20"/>
+        </w:rPr>
+        <w:t>Status code S must be exactly 1 (idle), 2 (dosing), or 3 (complete).</w:t>
+      </w:r>
+    </w:p>
+    <w:p>
+      <w:pPr>
+        <w:spacing w:after="20"/>
+        <w:ind w:left="170"/>
+      </w:pPr>
+      <w:r>
+        <w:rPr>
+          <w:b/>
+          <w:color w:val="06768A"/>
+          <w:sz w:val="20"/>
+        </w:rPr>
+        <w:t xml:space="preserve">Passes when. </w:t>
+      </w:r>
+      <w:r>
+        <w:rPr>
+          <w:sz w:val="20"/>
+        </w:rPr>
+        <w:t>S=2 — OK.</w:t>
+      </w:r>
+    </w:p>
+    <w:p>
+      <w:pPr>
+        <w:spacing w:after="20"/>
+        <w:ind w:left="170"/>
+      </w:pPr>
+      <w:r>
+        <w:rPr>
+          <w:b/>
+          <w:color w:val="06768A"/>
+          <w:sz w:val="20"/>
+        </w:rPr>
+        <w:t xml:space="preserve">Fails when. </w:t>
+      </w:r>
+      <w:r>
+        <w:rPr>
+          <w:sz w:val="20"/>
+        </w:rPr>
+        <w:t>S=5 — emits "Invalid status code S=5".</w:t>
+      </w:r>
+    </w:p>
+    <w:p>
+      <w:pPr>
+        <w:spacing w:after="20"/>
+        <w:ind w:left="170"/>
+      </w:pPr>
+      <w:r>
+        <w:rPr>
+          <w:b/>
+          <w:color w:val="06768A"/>
+          <w:sz w:val="20"/>
+        </w:rPr>
+        <w:t xml:space="preserve">Why it matters. </w:t>
+      </w:r>
+      <w:r>
+        <w:rPr>
+          <w:sz w:val="20"/>
+        </w:rPr>
+        <w:t>Garbage status codes signal corrupted polls or firmware regressions; the row's status cannot be trusted by any subsequent rule.</w:t>
+      </w:r>
+    </w:p>
+    <w:p>
+      <w:pPr>
+        <w:spacing w:before="200" w:after="40"/>
+      </w:pPr>
+      <w:r>
+        <w:rPr>
+          <w:b/>
+          <w:color w:val="334155"/>
+          <w:sz w:val="22"/>
+        </w:rPr>
+        <w:t xml:space="preserve">PSM-07  </w:t>
+      </w:r>
+      <w:r>
+        <w:rPr>
+          <w:b/>
+          <w:color w:val="102A43"/>
+          <w:sz w:val="22"/>
+        </w:rPr>
+        <w:t>Batch counter sequential or 39→0 wrap</w:t>
+      </w:r>
+      <w:r>
+        <w:rPr>
+          <w:b/>
+          <w:color w:val="C98A0C"/>
+          <w:sz w:val="18"/>
+        </w:rPr>
+        <w:t xml:space="preserve">  [WARNING]</w:t>
+      </w:r>
+    </w:p>
+    <w:p>
+      <w:pPr>
+        <w:spacing w:after="20"/>
+        <w:ind w:left="170"/>
+      </w:pPr>
+      <w:r>
+        <w:rPr>
+          <w:b/>
+          <w:color w:val="06768A"/>
+          <w:sz w:val="20"/>
+        </w:rPr>
+        <w:t xml:space="preserve">What it checks. </w:t>
+      </w:r>
+      <w:r>
+        <w:rPr>
+          <w:sz w:val="20"/>
+        </w:rPr>
+        <w:t>Batch counter B should equal previous (same batch), previous + 1 (advance), or wrap from 39 back to 0.</w:t>
+      </w:r>
+    </w:p>
+    <w:p>
+      <w:pPr>
+        <w:spacing w:after="20"/>
+        <w:ind w:left="170"/>
+      </w:pPr>
+      <w:r>
+        <w:rPr>
+          <w:b/>
+          <w:color w:val="06768A"/>
+          <w:sz w:val="20"/>
+        </w:rPr>
+        <w:t xml:space="preserve">Passes when. </w:t>
+      </w:r>
+      <w:r>
+        <w:rPr>
+          <w:sz w:val="20"/>
+        </w:rPr>
+        <w:t>previousB=38, B=39 — advance, OK. previousB=39, B=0 — wrap, OK.</w:t>
+      </w:r>
+    </w:p>
+    <w:p>
+      <w:pPr>
+        <w:spacing w:after="20"/>
+        <w:ind w:left="170"/>
+      </w:pPr>
+      <w:r>
+        <w:rPr>
+          <w:b/>
+          <w:color w:val="06768A"/>
+          <w:sz w:val="20"/>
+        </w:rPr>
+        <w:t xml:space="preserve">Fails when. </w:t>
+      </w:r>
+      <w:r>
+        <w:rPr>
+          <w:sz w:val="20"/>
+        </w:rPr>
+        <w:t>previousB=38, B=42 — emits "Non-sequential batch jump 38-&gt;42".</w:t>
+      </w:r>
+    </w:p>
+    <w:p>
+      <w:pPr>
+        <w:spacing w:after="20"/>
+        <w:ind w:left="170"/>
+      </w:pPr>
+      <w:r>
+        <w:rPr>
+          <w:b/>
+          <w:color w:val="06768A"/>
+          <w:sz w:val="20"/>
+        </w:rPr>
+        <w:t xml:space="preserve">Why it matters. </w:t>
+      </w:r>
+      <w:r>
+        <w:rPr>
+          <w:sz w:val="20"/>
+        </w:rPr>
+        <w:t>A jump means some polls were lost; the data for the missed batches is permanently unrecoverable.</w:t>
+      </w:r>
+    </w:p>
+    <w:p>
+      <w:pPr>
+        <w:spacing w:before="200" w:after="40"/>
+      </w:pPr>
+      <w:r>
+        <w:rPr>
+          <w:b/>
+          <w:color w:val="334155"/>
+          <w:sz w:val="22"/>
+        </w:rPr>
+        <w:t xml:space="preserve">PSM-08  </w:t>
+      </w:r>
+      <w:r>
+        <w:rPr>
+          <w:b/>
+          <w:color w:val="102A43"/>
+          <w:sz w:val="22"/>
+        </w:rPr>
+        <w:t>All RMs in current cycle agree on D and R</w:t>
+      </w:r>
+      <w:r>
+        <w:rPr>
+          <w:b/>
+          <w:color w:val="C98A0C"/>
+          <w:sz w:val="18"/>
+        </w:rPr>
+        <w:t xml:space="preserve">  [WARNING]</w:t>
+      </w:r>
+    </w:p>
+    <w:p>
+      <w:pPr>
+        <w:spacing w:after="20"/>
+        <w:ind w:left="170"/>
+      </w:pPr>
+      <w:r>
+        <w:rPr>
+          <w:b/>
+          <w:color w:val="06768A"/>
+          <w:sz w:val="20"/>
+        </w:rPr>
+        <w:t xml:space="preserve">What it checks. </w:t>
+      </w:r>
+      <w:r>
+        <w:rPr>
+          <w:sz w:val="20"/>
+        </w:rPr>
+        <w:t>All raw materials being dosed simultaneously must agree on D (date) and R (recipe).</w:t>
+      </w:r>
+    </w:p>
+    <w:p>
+      <w:pPr>
+        <w:spacing w:after="20"/>
+        <w:ind w:left="170"/>
+      </w:pPr>
+      <w:r>
+        <w:rPr>
+          <w:b/>
+          <w:color w:val="06768A"/>
+          <w:sz w:val="20"/>
+        </w:rPr>
+        <w:t xml:space="preserve">Passes when. </w:t>
+      </w:r>
+      <w:r>
+        <w:rPr>
+          <w:sz w:val="20"/>
+        </w:rPr>
+        <w:t>AOS row D=202641,R=PLUMERIA; Caustic row D=202641,R=PLUMERIA — OK.</w:t>
+      </w:r>
+    </w:p>
+    <w:p>
+      <w:pPr>
+        <w:spacing w:after="20"/>
+        <w:ind w:left="170"/>
+      </w:pPr>
+      <w:r>
+        <w:rPr>
+          <w:b/>
+          <w:color w:val="06768A"/>
+          <w:sz w:val="20"/>
+        </w:rPr>
+        <w:t xml:space="preserve">Fails when. </w:t>
+      </w:r>
+      <w:r>
+        <w:rPr>
+          <w:sz w:val="20"/>
+        </w:rPr>
+        <w:t>AOS R=PLUMERIA; Caustic R=JASMINE — emits "Recipe/date mismatch across RMs".</w:t>
+      </w:r>
+    </w:p>
+    <w:p>
+      <w:pPr>
+        <w:spacing w:after="20"/>
+        <w:ind w:left="170"/>
+      </w:pPr>
+      <w:r>
+        <w:rPr>
+          <w:b/>
+          <w:color w:val="06768A"/>
+          <w:sz w:val="20"/>
+        </w:rPr>
+        <w:t xml:space="preserve">Why it matters. </w:t>
+      </w:r>
+      <w:r>
+        <w:rPr>
+          <w:sz w:val="20"/>
+        </w:rPr>
+        <w:t>Two RMs reporting different recipes in the same cycle is an orchestration bug; the resulting batch is unusable.</w:t>
+      </w:r>
+    </w:p>
+    <w:p>
+      <w:pPr>
+        <w:spacing w:before="200" w:after="40"/>
+      </w:pPr>
+      <w:r>
+        <w:rPr>
+          <w:b/>
+          <w:color w:val="334155"/>
+          <w:sz w:val="22"/>
+        </w:rPr>
+        <w:t xml:space="preserve">PSM-09  </w:t>
+      </w:r>
+      <w:r>
+        <w:rPr>
+          <w:b/>
+          <w:color w:val="102A43"/>
+          <w:sz w:val="22"/>
+        </w:rPr>
+        <w:t>Streaming gap inside production hours (PSM-scoped)</w:t>
+      </w:r>
+      <w:r>
+        <w:rPr>
+          <w:b/>
+          <w:color w:val="426BA5"/>
+          <w:sz w:val="18"/>
+        </w:rPr>
+        <w:t xml:space="preserve">  [INFO]</w:t>
+      </w:r>
+    </w:p>
+    <w:p>
+      <w:pPr>
+        <w:spacing w:after="20"/>
+        <w:ind w:left="170"/>
+      </w:pPr>
+      <w:r>
+        <w:rPr>
+          <w:b/>
+          <w:color w:val="06768A"/>
+          <w:sz w:val="20"/>
+        </w:rPr>
+        <w:t xml:space="preserve">What it checks. </w:t>
+      </w:r>
+      <w:r>
+        <w:rPr>
+          <w:sz w:val="20"/>
+        </w:rPr>
+        <w:t>PSM-tag-scoped streaming gap. Same logic as GEN-01 but tagged PSM-09 so it surfaces under the PSM filter.</w:t>
+      </w:r>
+    </w:p>
+    <w:p>
+      <w:pPr>
+        <w:spacing w:after="20"/>
+        <w:ind w:left="170"/>
+      </w:pPr>
+      <w:r>
+        <w:rPr>
+          <w:b/>
+          <w:color w:val="06768A"/>
+          <w:sz w:val="20"/>
+        </w:rPr>
+        <w:t xml:space="preserve">Passes when. </w:t>
+      </w:r>
+      <w:r>
+        <w:rPr>
+          <w:sz w:val="20"/>
+        </w:rPr>
+        <w:t>60 s gap on a PSM tag — OK.</w:t>
+      </w:r>
+    </w:p>
+    <w:p>
+      <w:pPr>
+        <w:spacing w:after="20"/>
+        <w:ind w:left="170"/>
+      </w:pPr>
+      <w:r>
+        <w:rPr>
+          <w:b/>
+          <w:color w:val="06768A"/>
+          <w:sz w:val="20"/>
+        </w:rPr>
+        <w:t xml:space="preserve">Fails when. </w:t>
+      </w:r>
+      <w:r>
+        <w:rPr>
+          <w:sz w:val="20"/>
+        </w:rPr>
+        <w:t>10 min gap at 14:00 — emits "Comms gap 10m3s".</w:t>
+      </w:r>
+    </w:p>
+    <w:p>
+      <w:pPr>
+        <w:spacing w:after="20"/>
+        <w:ind w:left="170"/>
+      </w:pPr>
+      <w:r>
+        <w:rPr>
+          <w:b/>
+          <w:color w:val="06768A"/>
+          <w:sz w:val="20"/>
+        </w:rPr>
+        <w:t xml:space="preserve">Why it matters. </w:t>
+      </w:r>
+      <w:r>
+        <w:rPr>
+          <w:sz w:val="20"/>
+        </w:rPr>
+        <w:t>PSM is the most rule-heavy zone; isolating its comms drops helps the PSM engineer triage faster than scanning the global GEN-01 stream.</w:t>
+      </w:r>
+    </w:p>
+    <w:p>
+      <w:pPr>
+        <w:spacing w:before="200" w:after="40"/>
+      </w:pPr>
+      <w:r>
+        <w:rPr>
+          <w:b/>
+          <w:color w:val="334155"/>
+          <w:sz w:val="22"/>
+        </w:rPr>
+        <w:t xml:space="preserve">PSM-10  </w:t>
+      </w:r>
+      <w:r>
+        <w:rPr>
+          <w:b/>
+          <w:color w:val="102A43"/>
+          <w:sz w:val="22"/>
+        </w:rPr>
+        <w:t>SP-change detection (event log only)</w:t>
+      </w:r>
+      <w:r>
+        <w:rPr>
+          <w:b/>
+          <w:color w:val="426BA5"/>
+          <w:sz w:val="18"/>
+        </w:rPr>
+        <w:t xml:space="preserve">  [INFO]</w:t>
+      </w:r>
+    </w:p>
+    <w:p>
+      <w:pPr>
+        <w:spacing w:after="20"/>
+        <w:ind w:left="170"/>
+      </w:pPr>
+      <w:r>
+        <w:rPr>
+          <w:b/>
+          <w:color w:val="06768A"/>
+          <w:sz w:val="20"/>
+        </w:rPr>
+        <w:t xml:space="preserve">What it checks. </w:t>
+      </w:r>
+      <w:r>
+        <w:rPr>
+          <w:sz w:val="20"/>
+        </w:rPr>
+        <w:t>Logs every change of SP between polls. Always passes — this is an event log, not a failure.</w:t>
+      </w:r>
+    </w:p>
+    <w:p>
+      <w:pPr>
+        <w:spacing w:after="20"/>
+        <w:ind w:left="170"/>
+      </w:pPr>
+      <w:r>
+        <w:rPr>
+          <w:b/>
+          <w:color w:val="06768A"/>
+          <w:sz w:val="20"/>
+        </w:rPr>
+        <w:t xml:space="preserve">Passes when. </w:t>
+      </w:r>
+      <w:r>
+        <w:rPr>
+          <w:sz w:val="20"/>
+        </w:rPr>
+        <w:t>SP=10.50 → SP=10.50 — silent OK.</w:t>
+      </w:r>
+    </w:p>
+    <w:p>
+      <w:pPr>
+        <w:spacing w:after="20"/>
+        <w:ind w:left="170"/>
+      </w:pPr>
+      <w:r>
+        <w:rPr>
+          <w:b/>
+          <w:color w:val="06768A"/>
+          <w:sz w:val="20"/>
+        </w:rPr>
+        <w:t xml:space="preserve">Fails when. </w:t>
+      </w:r>
+      <w:r>
+        <w:rPr>
+          <w:sz w:val="20"/>
+        </w:rPr>
+        <w:t>SP=10.50 → SP=10.55 — passes but emits "SP adjusted 10.5-&gt;10.55".</w:t>
+      </w:r>
+    </w:p>
+    <w:p>
+      <w:pPr>
+        <w:spacing w:after="20"/>
+        <w:ind w:left="170"/>
+      </w:pPr>
+      <w:r>
+        <w:rPr>
+          <w:b/>
+          <w:color w:val="06768A"/>
+          <w:sz w:val="20"/>
+        </w:rPr>
+        <w:t xml:space="preserve">Why it matters. </w:t>
+      </w:r>
+      <w:r>
+        <w:rPr>
+          <w:sz w:val="20"/>
+        </w:rPr>
+        <w:t>Provides the audit trail for SP changes. This event log is the data source for Insight #9 (Recipe-drift detection in §11).</w:t>
+      </w:r>
+    </w:p>
+    <w:p>
+      <w:pPr>
+        <w:spacing w:before="200" w:after="40"/>
+      </w:pPr>
+      <w:r>
+        <w:rPr>
+          <w:b/>
+          <w:color w:val="334155"/>
+          <w:sz w:val="22"/>
+        </w:rPr>
+        <w:t xml:space="preserve">PSM-11  </w:t>
+      </w:r>
+      <w:r>
+        <w:rPr>
+          <w:b/>
+          <w:color w:val="102A43"/>
+          <w:sz w:val="22"/>
+        </w:rPr>
+        <w:t>Julian date D within 2 days of system time</w:t>
+      </w:r>
+      <w:r>
+        <w:rPr>
+          <w:b/>
+          <w:color w:val="426BA5"/>
+          <w:sz w:val="18"/>
+        </w:rPr>
+        <w:t xml:space="preserve">  [INFO]</w:t>
+      </w:r>
+    </w:p>
+    <w:p>
+      <w:pPr>
+        <w:spacing w:after="20"/>
+        <w:ind w:left="170"/>
+      </w:pPr>
+      <w:r>
+        <w:rPr>
+          <w:b/>
+          <w:color w:val="06768A"/>
+          <w:sz w:val="20"/>
+        </w:rPr>
+        <w:t xml:space="preserve">What it checks. </w:t>
+      </w:r>
+      <w:r>
+        <w:rPr>
+          <w:sz w:val="20"/>
+        </w:rPr>
+        <w:t>The Julian date D field (YYYYDDD format) must be within 2 days of the system clock.</w:t>
+      </w:r>
+    </w:p>
+    <w:p>
+      <w:pPr>
+        <w:spacing w:after="20"/>
+        <w:ind w:left="170"/>
+      </w:pPr>
+      <w:r>
+        <w:rPr>
+          <w:b/>
+          <w:color w:val="06768A"/>
+          <w:sz w:val="20"/>
+        </w:rPr>
+        <w:t xml:space="preserve">Passes when. </w:t>
+      </w:r>
+      <w:r>
+        <w:rPr>
+          <w:sz w:val="20"/>
+        </w:rPr>
+        <w:t>System day 41 of 2026; D = "202641" — OK.</w:t>
+      </w:r>
+    </w:p>
+    <w:p>
+      <w:pPr>
+        <w:spacing w:after="20"/>
+        <w:ind w:left="170"/>
+      </w:pPr>
+      <w:r>
+        <w:rPr>
+          <w:b/>
+          <w:color w:val="06768A"/>
+          <w:sz w:val="20"/>
+        </w:rPr>
+        <w:t xml:space="preserve">Fails when. </w:t>
+      </w:r>
+      <w:r>
+        <w:rPr>
+          <w:sz w:val="20"/>
+        </w:rPr>
+        <w:t>D = "202635" (6 days stale) — emits "D field stale by 6.0d".</w:t>
+      </w:r>
+    </w:p>
+    <w:p>
+      <w:pPr>
+        <w:spacing w:after="20"/>
+        <w:ind w:left="170"/>
+      </w:pPr>
+      <w:r>
+        <w:rPr>
+          <w:b/>
+          <w:color w:val="06768A"/>
+          <w:sz w:val="20"/>
+        </w:rPr>
+        <w:t xml:space="preserve">Why it matters. </w:t>
+      </w:r>
+      <w:r>
+        <w:rPr>
+          <w:sz w:val="20"/>
+        </w:rPr>
+        <w:t>Stale D = PLC clock drift or message replay; alerts the team to a gateway-side problem before stale timestamps corrupt batch trace.</w:t>
+      </w:r>
+    </w:p>
+    <w:p>
+      <w:pPr>
+        <w:spacing w:before="200" w:after="40"/>
+      </w:pPr>
+      <w:r>
+        <w:rPr>
+          <w:b/>
+          <w:color w:val="334155"/>
+          <w:sz w:val="22"/>
+        </w:rPr>
+        <w:t xml:space="preserve">PSM-12  </w:t>
+      </w:r>
+      <w:r>
+        <w:rPr>
+          <w:b/>
+          <w:color w:val="102A43"/>
+          <w:sz w:val="22"/>
+        </w:rPr>
+        <w:t>Batch_PV_Weight ≈ Σ RM PVs (≤ 2 % deviation)</w:t>
+      </w:r>
+      <w:r>
+        <w:rPr>
+          <w:b/>
+          <w:color w:val="426BA5"/>
+          <w:sz w:val="18"/>
+        </w:rPr>
+        <w:t xml:space="preserve">  [INFO]</w:t>
+      </w:r>
+    </w:p>
+    <w:p>
+      <w:pPr>
+        <w:spacing w:after="20"/>
+        <w:ind w:left="170"/>
+      </w:pPr>
+      <w:r>
+        <w:rPr>
+          <w:b/>
+          <w:color w:val="06768A"/>
+          <w:sz w:val="20"/>
+        </w:rPr>
+        <w:t xml:space="preserve">What it checks. </w:t>
+      </w:r>
+      <w:r>
+        <w:rPr>
+          <w:sz w:val="20"/>
+        </w:rPr>
+        <w:t>The aggregate Batch_PV_Weight should match the sum of the individual RM PVs within 2 % — mass conservation across the dosing skid.</w:t>
+      </w:r>
+    </w:p>
+    <w:p>
+      <w:pPr>
+        <w:spacing w:after="20"/>
+        <w:ind w:left="170"/>
+      </w:pPr>
+      <w:r>
+        <w:rPr>
+          <w:b/>
+          <w:color w:val="06768A"/>
+          <w:sz w:val="20"/>
+        </w:rPr>
+        <w:t xml:space="preserve">Passes when. </w:t>
+      </w:r>
+      <w:r>
+        <w:rPr>
+          <w:sz w:val="20"/>
+        </w:rPr>
+        <w:t>Batch_PV_Weight=100 kg, Σ RM PV=99.5 kg — 0.5 % off, OK.</w:t>
+      </w:r>
+    </w:p>
+    <w:p>
+      <w:pPr>
+        <w:spacing w:after="20"/>
+        <w:ind w:left="170"/>
+      </w:pPr>
+      <w:r>
+        <w:rPr>
+          <w:b/>
+          <w:color w:val="06768A"/>
+          <w:sz w:val="20"/>
+        </w:rPr>
+        <w:t xml:space="preserve">Fails when. </w:t>
+      </w:r>
+      <w:r>
+        <w:rPr>
+          <w:sz w:val="20"/>
+        </w:rPr>
+        <w:t>Batch_PV_Weight=100 kg, Σ RM PV=92 kg — 8 % — emits "Batch weight vs RM-sum deviation 8.0%".</w:t>
+      </w:r>
+    </w:p>
+    <w:p>
+      <w:pPr>
+        <w:spacing w:after="20"/>
+        <w:ind w:left="170"/>
+      </w:pPr>
+      <w:r>
+        <w:rPr>
+          <w:b/>
+          <w:color w:val="06768A"/>
+          <w:sz w:val="20"/>
+        </w:rPr>
+        <w:t xml:space="preserve">Why it matters. </w:t>
+      </w:r>
+      <w:r>
+        <w:rPr>
+          <w:sz w:val="20"/>
+        </w:rPr>
+        <w:t>A mass imbalance points to an unaccounted leak, a tare bug, or a missing RM row that the orchestrator forgot to record.</w:t>
+      </w:r>
+    </w:p>
+    <w:p>
+      <w:pPr>
         <w:spacing w:before="280" w:after="80"/>
       </w:pPr>
       <w:r>
@@ -2895,6 +4665,455 @@
     </w:tbl>
     <w:p>
       <w:pPr>
+        <w:spacing w:before="200" w:after="40"/>
+      </w:pPr>
+      <w:r>
+        <w:rPr>
+          <w:b/>
+          <w:color w:val="334155"/>
+          <w:sz w:val="24"/>
+        </w:rPr>
+        <w:t>Walkthrough — Sigma Rules</w:t>
+      </w:r>
+    </w:p>
+    <w:p>
+      <w:pPr>
+        <w:spacing w:before="200" w:after="40"/>
+      </w:pPr>
+      <w:r>
+        <w:rPr>
+          <w:b/>
+          <w:color w:val="334155"/>
+          <w:sz w:val="22"/>
+        </w:rPr>
+        <w:t xml:space="preserve">SMX-02  </w:t>
+      </w:r>
+      <w:r>
+        <w:rPr>
+          <w:b/>
+          <w:color w:val="102A43"/>
+          <w:sz w:val="22"/>
+        </w:rPr>
+        <w:t>Barcode must be empty/idle marker or pure numeric</w:t>
+      </w:r>
+      <w:r>
+        <w:rPr>
+          <w:b/>
+          <w:color w:val="C0392B"/>
+          <w:sz w:val="18"/>
+        </w:rPr>
+        <w:t xml:space="preserve">  [CRITICAL]</w:t>
+      </w:r>
+    </w:p>
+    <w:p>
+      <w:pPr>
+        <w:spacing w:after="20"/>
+        <w:ind w:left="170"/>
+      </w:pPr>
+      <w:r>
+        <w:rPr>
+          <w:b/>
+          <w:color w:val="06768A"/>
+          <w:sz w:val="20"/>
+        </w:rPr>
+        <w:t xml:space="preserve">What it checks. </w:t>
+      </w:r>
+      <w:r>
+        <w:rPr>
+          <w:sz w:val="20"/>
+        </w:rPr>
+        <w:t>A Sigma barcode value must be empty, the literal "Scan Barcode" (idle marker), or pure numeric digits.</w:t>
+      </w:r>
+    </w:p>
+    <w:p>
+      <w:pPr>
+        <w:spacing w:after="20"/>
+        <w:ind w:left="170"/>
+      </w:pPr>
+      <w:r>
+        <w:rPr>
+          <w:b/>
+          <w:color w:val="06768A"/>
+          <w:sz w:val="20"/>
+        </w:rPr>
+        <w:t xml:space="preserve">Passes when. </w:t>
+      </w:r>
+      <w:r>
+        <w:rPr>
+          <w:sz w:val="20"/>
+        </w:rPr>
+        <w:t>"Scan Barcode" — OK (idle). "1300326026" — OK (valid scan).</w:t>
+      </w:r>
+    </w:p>
+    <w:p>
+      <w:pPr>
+        <w:spacing w:after="20"/>
+        <w:ind w:left="170"/>
+      </w:pPr>
+      <w:r>
+        <w:rPr>
+          <w:b/>
+          <w:color w:val="06768A"/>
+          <w:sz w:val="20"/>
+        </w:rPr>
+        <w:t xml:space="preserve">Fails when. </w:t>
+      </w:r>
+      <w:r>
+        <w:rPr>
+          <w:sz w:val="20"/>
+        </w:rPr>
+        <w:t>"ABC123XYZ" — emits "Malformed barcode scan 'ABC123XYZ'".</w:t>
+      </w:r>
+    </w:p>
+    <w:p>
+      <w:pPr>
+        <w:spacing w:after="20"/>
+        <w:ind w:left="170"/>
+      </w:pPr>
+      <w:r>
+        <w:rPr>
+          <w:b/>
+          <w:color w:val="06768A"/>
+          <w:sz w:val="20"/>
+        </w:rPr>
+        <w:t xml:space="preserve">Why it matters. </w:t>
+      </w:r>
+      <w:r>
+        <w:rPr>
+          <w:sz w:val="20"/>
+        </w:rPr>
+        <w:t>A malformed scan means the operator scanned the wrong label or the scanner misaligned — the batch traceability chain is broken until rescanned.</w:t>
+      </w:r>
+    </w:p>
+    <w:p>
+      <w:pPr>
+        <w:spacing w:before="200" w:after="40"/>
+      </w:pPr>
+      <w:r>
+        <w:rPr>
+          <w:b/>
+          <w:color w:val="334155"/>
+          <w:sz w:val="22"/>
+        </w:rPr>
+        <w:t xml:space="preserve">SMX-03  </w:t>
+      </w:r>
+      <w:r>
+        <w:rPr>
+          <w:b/>
+          <w:color w:val="102A43"/>
+          <w:sz w:val="22"/>
+        </w:rPr>
+        <w:t>Rework stuck &gt; 0 for &gt; 3 consecutive polls</w:t>
+      </w:r>
+      <w:r>
+        <w:rPr>
+          <w:b/>
+          <w:color w:val="C98A0C"/>
+          <w:sz w:val="18"/>
+        </w:rPr>
+        <w:t xml:space="preserve">  [WARNING]</w:t>
+      </w:r>
+    </w:p>
+    <w:p>
+      <w:pPr>
+        <w:spacing w:after="20"/>
+        <w:ind w:left="170"/>
+      </w:pPr>
+      <w:r>
+        <w:rPr>
+          <w:b/>
+          <w:color w:val="06768A"/>
+          <w:sz w:val="20"/>
+        </w:rPr>
+        <w:t xml:space="preserve">What it checks. </w:t>
+      </w:r>
+      <w:r>
+        <w:rPr>
+          <w:sz w:val="20"/>
+        </w:rPr>
+        <w:t>The REWORK tag should sit at 0 in normal flow. A value &gt; 0 for more than 3 consecutive polls indicates the mixer is stuck reworking material.</w:t>
+      </w:r>
+    </w:p>
+    <w:p>
+      <w:pPr>
+        <w:spacing w:after="20"/>
+        <w:ind w:left="170"/>
+      </w:pPr>
+      <w:r>
+        <w:rPr>
+          <w:b/>
+          <w:color w:val="06768A"/>
+          <w:sz w:val="20"/>
+        </w:rPr>
+        <w:t xml:space="preserve">Passes when. </w:t>
+      </w:r>
+      <w:r>
+        <w:rPr>
+          <w:sz w:val="20"/>
+        </w:rPr>
+        <w:t>0, 0, 5, 0 — one isolated rework event, OK.</w:t>
+      </w:r>
+    </w:p>
+    <w:p>
+      <w:pPr>
+        <w:spacing w:after="20"/>
+        <w:ind w:left="170"/>
+      </w:pPr>
+      <w:r>
+        <w:rPr>
+          <w:b/>
+          <w:color w:val="06768A"/>
+          <w:sz w:val="20"/>
+        </w:rPr>
+        <w:t xml:space="preserve">Fails when. </w:t>
+      </w:r>
+      <w:r>
+        <w:rPr>
+          <w:sz w:val="20"/>
+        </w:rPr>
+        <w:t>5, 5, 5, 5 (four consecutive non-zero polls) — emits "Rework stuck active for 4 polls (value=5)".</w:t>
+      </w:r>
+    </w:p>
+    <w:p>
+      <w:pPr>
+        <w:spacing w:after="20"/>
+        <w:ind w:left="170"/>
+      </w:pPr>
+      <w:r>
+        <w:rPr>
+          <w:b/>
+          <w:color w:val="06768A"/>
+          <w:sz w:val="20"/>
+        </w:rPr>
+        <w:t xml:space="preserve">Why it matters. </w:t>
+      </w:r>
+      <w:r>
+        <w:rPr>
+          <w:sz w:val="20"/>
+        </w:rPr>
+        <w:t>Persistent rework points to a chronic mixing problem (e.g. lump formation). Material and downtime costs escalate quickly if not caught early.</w:t>
+      </w:r>
+    </w:p>
+    <w:p>
+      <w:pPr>
+        <w:spacing w:before="200" w:after="40"/>
+      </w:pPr>
+      <w:r>
+        <w:rPr>
+          <w:b/>
+          <w:color w:val="334155"/>
+          <w:sz w:val="22"/>
+        </w:rPr>
+        <w:t xml:space="preserve">SMX-04  </w:t>
+      </w:r>
+      <w:r>
+        <w:rPr>
+          <w:b/>
+          <w:color w:val="102A43"/>
+          <w:sz w:val="22"/>
+        </w:rPr>
+        <w:t>MX1 and MX2 must not dose the same batch counter simultaneously</w:t>
+      </w:r>
+      <w:r>
+        <w:rPr>
+          <w:b/>
+          <w:color w:val="C98A0C"/>
+          <w:sz w:val="18"/>
+        </w:rPr>
+        <w:t xml:space="preserve">  [WARNING]</w:t>
+      </w:r>
+    </w:p>
+    <w:p>
+      <w:pPr>
+        <w:spacing w:after="20"/>
+        <w:ind w:left="170"/>
+      </w:pPr>
+      <w:r>
+        <w:rPr>
+          <w:b/>
+          <w:color w:val="06768A"/>
+          <w:sz w:val="20"/>
+        </w:rPr>
+        <w:t xml:space="preserve">What it checks. </w:t>
+      </w:r>
+      <w:r>
+        <w:rPr>
+          <w:sz w:val="20"/>
+        </w:rPr>
+        <w:t>Mixer 1 and Mixer 2 must not both be in status 2 (dosing) with the same batch counter B at the same time.</w:t>
+      </w:r>
+    </w:p>
+    <w:p>
+      <w:pPr>
+        <w:spacing w:after="20"/>
+        <w:ind w:left="170"/>
+      </w:pPr>
+      <w:r>
+        <w:rPr>
+          <w:b/>
+          <w:color w:val="06768A"/>
+          <w:sz w:val="20"/>
+        </w:rPr>
+        <w:t xml:space="preserve">Passes when. </w:t>
+      </w:r>
+      <w:r>
+        <w:rPr>
+          <w:sz w:val="20"/>
+        </w:rPr>
+        <w:t>MX1: S=2,B=38; MX2: S=2,B=39 — different batches, OK.</w:t>
+      </w:r>
+    </w:p>
+    <w:p>
+      <w:pPr>
+        <w:spacing w:after="20"/>
+        <w:ind w:left="170"/>
+      </w:pPr>
+      <w:r>
+        <w:rPr>
+          <w:b/>
+          <w:color w:val="06768A"/>
+          <w:sz w:val="20"/>
+        </w:rPr>
+        <w:t xml:space="preserve">Fails when. </w:t>
+      </w:r>
+      <w:r>
+        <w:rPr>
+          <w:sz w:val="20"/>
+        </w:rPr>
+        <w:t>MX1: S=2,B=38; MX2: S=2,B=38 — emits "MX1 &amp; MX2 both dosing same batch 38".</w:t>
+      </w:r>
+    </w:p>
+    <w:p>
+      <w:pPr>
+        <w:spacing w:after="20"/>
+        <w:ind w:left="170"/>
+      </w:pPr>
+      <w:r>
+        <w:rPr>
+          <w:b/>
+          <w:color w:val="06768A"/>
+          <w:sz w:val="20"/>
+        </w:rPr>
+        <w:t xml:space="preserve">Why it matters. </w:t>
+      </w:r>
+      <w:r>
+        <w:rPr>
+          <w:sz w:val="20"/>
+        </w:rPr>
+        <w:t>Two physical mixers feeding into one batch ID is an orchestration bug; material destined for different batches gets cross-contaminated.</w:t>
+      </w:r>
+    </w:p>
+    <w:p>
+      <w:pPr>
+        <w:spacing w:before="200" w:after="40"/>
+      </w:pPr>
+      <w:r>
+        <w:rPr>
+          <w:b/>
+          <w:color w:val="334155"/>
+          <w:sz w:val="22"/>
+        </w:rPr>
+        <w:t xml:space="preserve">SMX-05  </w:t>
+      </w:r>
+      <w:r>
+        <w:rPr>
+          <w:b/>
+          <w:color w:val="102A43"/>
+          <w:sz w:val="22"/>
+        </w:rPr>
+        <w:t>Recipe must not change mid-batch</w:t>
+      </w:r>
+      <w:r>
+        <w:rPr>
+          <w:b/>
+          <w:color w:val="426BA5"/>
+          <w:sz w:val="18"/>
+        </w:rPr>
+        <w:t xml:space="preserve">  [INFO]</w:t>
+      </w:r>
+    </w:p>
+    <w:p>
+      <w:pPr>
+        <w:spacing w:after="20"/>
+        <w:ind w:left="170"/>
+      </w:pPr>
+      <w:r>
+        <w:rPr>
+          <w:b/>
+          <w:color w:val="06768A"/>
+          <w:sz w:val="20"/>
+        </w:rPr>
+        <w:t xml:space="preserve">What it checks. </w:t>
+      </w:r>
+      <w:r>
+        <w:rPr>
+          <w:sz w:val="20"/>
+        </w:rPr>
+        <w:t>While the batch counter B is unchanged, the recipe R must not change.</w:t>
+      </w:r>
+    </w:p>
+    <w:p>
+      <w:pPr>
+        <w:spacing w:after="20"/>
+        <w:ind w:left="170"/>
+      </w:pPr>
+      <w:r>
+        <w:rPr>
+          <w:b/>
+          <w:color w:val="06768A"/>
+          <w:sz w:val="20"/>
+        </w:rPr>
+        <w:t xml:space="preserve">Passes when. </w:t>
+      </w:r>
+      <w:r>
+        <w:rPr>
+          <w:sz w:val="20"/>
+        </w:rPr>
+        <w:t>B=38, R=PLUMERIA throughout — OK.</w:t>
+      </w:r>
+    </w:p>
+    <w:p>
+      <w:pPr>
+        <w:spacing w:after="20"/>
+        <w:ind w:left="170"/>
+      </w:pPr>
+      <w:r>
+        <w:rPr>
+          <w:b/>
+          <w:color w:val="06768A"/>
+          <w:sz w:val="20"/>
+        </w:rPr>
+        <w:t xml:space="preserve">Fails when. </w:t>
+      </w:r>
+      <w:r>
+        <w:rPr>
+          <w:sz w:val="20"/>
+        </w:rPr>
+        <w:t>B=38, R=PLUMERIA, then B=38, R=JASMINE — emits "Recipe changed mid-batch 38".</w:t>
+      </w:r>
+    </w:p>
+    <w:p>
+      <w:pPr>
+        <w:spacing w:after="20"/>
+        <w:ind w:left="170"/>
+      </w:pPr>
+      <w:r>
+        <w:rPr>
+          <w:b/>
+          <w:color w:val="06768A"/>
+          <w:sz w:val="20"/>
+        </w:rPr>
+        <w:t xml:space="preserve">Why it matters. </w:t>
+      </w:r>
+      <w:r>
+        <w:rPr>
+          <w:sz w:val="20"/>
+        </w:rPr>
+        <w:t>Recipe should be locked when the batch starts. A mid-batch change means the orchestrator overwrote R without resetting B — guaranteed bad batch.</w:t>
+      </w:r>
+    </w:p>
+    <w:p>
+      <w:pPr>
         <w:spacing w:before="280" w:after="80"/>
       </w:pPr>
       <w:r>
@@ -3386,6 +5605,1000 @@
     </w:tbl>
     <w:p>
       <w:pPr>
+        <w:spacing w:before="200" w:after="40"/>
+      </w:pPr>
+      <w:r>
+        <w:rPr>
+          <w:b/>
+          <w:color w:val="334155"/>
+          <w:sz w:val="24"/>
+        </w:rPr>
+        <w:t>Walkthrough — Silo Rules</w:t>
+      </w:r>
+    </w:p>
+    <w:p>
+      <w:pPr>
+        <w:spacing w:before="200" w:after="40"/>
+      </w:pPr>
+      <w:r>
+        <w:rPr>
+          <w:b/>
+          <w:color w:val="334155"/>
+          <w:sz w:val="22"/>
+        </w:rPr>
+        <w:t xml:space="preserve">SLO-01  </w:t>
+      </w:r>
+      <w:r>
+        <w:rPr>
+          <w:b/>
+          <w:color w:val="102A43"/>
+          <w:sz w:val="22"/>
+        </w:rPr>
+        <w:t>Noodle type must be in the valid set</w:t>
+      </w:r>
+      <w:r>
+        <w:rPr>
+          <w:b/>
+          <w:color w:val="C0392B"/>
+          <w:sz w:val="18"/>
+        </w:rPr>
+        <w:t xml:space="preserve">  [CRITICAL]</w:t>
+      </w:r>
+    </w:p>
+    <w:p>
+      <w:pPr>
+        <w:spacing w:after="20"/>
+        <w:ind w:left="170"/>
+      </w:pPr>
+      <w:r>
+        <w:rPr>
+          <w:b/>
+          <w:color w:val="06768A"/>
+          <w:sz w:val="20"/>
+        </w:rPr>
+        <w:t xml:space="preserve">What it checks. </w:t>
+      </w:r>
+      <w:r>
+        <w:rPr>
+          <w:sz w:val="20"/>
+        </w:rPr>
+        <w:t>The noodle type string must be one of: JASMINE, PLUMERIA, SERGIO 56, TEXAS MOD, GALAXY, 20 PKO TULIP, LILAC NOODLES.</w:t>
+      </w:r>
+    </w:p>
+    <w:p>
+      <w:pPr>
+        <w:spacing w:after="20"/>
+        <w:ind w:left="170"/>
+      </w:pPr>
+      <w:r>
+        <w:rPr>
+          <w:b/>
+          <w:color w:val="06768A"/>
+          <w:sz w:val="20"/>
+        </w:rPr>
+        <w:t xml:space="preserve">Passes when. </w:t>
+      </w:r>
+      <w:r>
+        <w:rPr>
+          <w:sz w:val="20"/>
+        </w:rPr>
+        <w:t>"JASMINE NOODLES" — OK.</w:t>
+      </w:r>
+    </w:p>
+    <w:p>
+      <w:pPr>
+        <w:spacing w:after="20"/>
+        <w:ind w:left="170"/>
+      </w:pPr>
+      <w:r>
+        <w:rPr>
+          <w:b/>
+          <w:color w:val="06768A"/>
+          <w:sz w:val="20"/>
+        </w:rPr>
+        <w:t xml:space="preserve">Fails when. </w:t>
+      </w:r>
+      <w:r>
+        <w:rPr>
+          <w:sz w:val="20"/>
+        </w:rPr>
+        <w:t>"PLUMARIA NOODLES" (typo) — emits "Unknown noodle type 'PLUMARIA NOODLES'".</w:t>
+      </w:r>
+    </w:p>
+    <w:p>
+      <w:pPr>
+        <w:spacing w:after="20"/>
+        <w:ind w:left="170"/>
+      </w:pPr>
+      <w:r>
+        <w:rPr>
+          <w:b/>
+          <w:color w:val="06768A"/>
+          <w:sz w:val="20"/>
+        </w:rPr>
+        <w:t xml:space="preserve">Why it matters. </w:t>
+      </w:r>
+      <w:r>
+        <w:rPr>
+          <w:sz w:val="20"/>
+        </w:rPr>
+        <w:t>Catches PLC label corruption or new noodle types that have not been onboarded into the validation set yet — easy to miss otherwise.</w:t>
+      </w:r>
+    </w:p>
+    <w:p>
+      <w:pPr>
+        <w:spacing w:before="200" w:after="40"/>
+      </w:pPr>
+      <w:r>
+        <w:rPr>
+          <w:b/>
+          <w:color w:val="334155"/>
+          <w:sz w:val="22"/>
+        </w:rPr>
+        <w:t xml:space="preserve">SLO-02  </w:t>
+      </w:r>
+      <w:r>
+        <w:rPr>
+          <w:b/>
+          <w:color w:val="102A43"/>
+          <w:sz w:val="22"/>
+        </w:rPr>
+        <w:t>Bag-out detail must be CSV of 4 fields, or single ',' for idle</w:t>
+      </w:r>
+      <w:r>
+        <w:rPr>
+          <w:b/>
+          <w:color w:val="C0392B"/>
+          <w:sz w:val="18"/>
+        </w:rPr>
+        <w:t xml:space="preserve">  [CRITICAL]</w:t>
+      </w:r>
+    </w:p>
+    <w:p>
+      <w:pPr>
+        <w:spacing w:after="20"/>
+        <w:ind w:left="170"/>
+      </w:pPr>
+      <w:r>
+        <w:rPr>
+          <w:b/>
+          <w:color w:val="06768A"/>
+          <w:sz w:val="20"/>
+        </w:rPr>
+        <w:t xml:space="preserve">What it checks. </w:t>
+      </w:r>
+      <w:r>
+        <w:rPr>
+          <w:sz w:val="20"/>
+        </w:rPr>
+        <w:t>Bag-out value must be a 4-field CSV (batchId, SP, PV, noodleType), or a single "," meaning "no bag in dispenser".</w:t>
+      </w:r>
+    </w:p>
+    <w:p>
+      <w:pPr>
+        <w:spacing w:after="20"/>
+        <w:ind w:left="170"/>
+      </w:pPr>
+      <w:r>
+        <w:rPr>
+          <w:b/>
+          <w:color w:val="06768A"/>
+          <w:sz w:val="20"/>
+        </w:rPr>
+        <w:t xml:space="preserve">Passes when. </w:t>
+      </w:r>
+      <w:r>
+        <w:rPr>
+          <w:sz w:val="20"/>
+        </w:rPr>
+        <w:t>"B12345,850,847.2,JASMINE NOODLES" — OK. "," — idle, OK.</w:t>
+      </w:r>
+    </w:p>
+    <w:p>
+      <w:pPr>
+        <w:spacing w:after="20"/>
+        <w:ind w:left="170"/>
+      </w:pPr>
+      <w:r>
+        <w:rPr>
+          <w:b/>
+          <w:color w:val="06768A"/>
+          <w:sz w:val="20"/>
+        </w:rPr>
+        <w:t xml:space="preserve">Fails when. </w:t>
+      </w:r>
+      <w:r>
+        <w:rPr>
+          <w:sz w:val="20"/>
+        </w:rPr>
+        <w:t>"B12345,850" — only 2 fields — emits "Expected 4 CSV fields, got 2".</w:t>
+      </w:r>
+    </w:p>
+    <w:p>
+      <w:pPr>
+        <w:spacing w:after="20"/>
+        <w:ind w:left="170"/>
+      </w:pPr>
+      <w:r>
+        <w:rPr>
+          <w:b/>
+          <w:color w:val="06768A"/>
+          <w:sz w:val="20"/>
+        </w:rPr>
+        <w:t xml:space="preserve">Why it matters. </w:t>
+      </w:r>
+      <w:r>
+        <w:rPr>
+          <w:sz w:val="20"/>
+        </w:rPr>
+        <w:t>Malformed bag-out CSV breaks every downstream consumer, including the bagging-station HMI that operators read.</w:t>
+      </w:r>
+    </w:p>
+    <w:p>
+      <w:pPr>
+        <w:spacing w:before="200" w:after="40"/>
+      </w:pPr>
+      <w:r>
+        <w:rPr>
+          <w:b/>
+          <w:color w:val="334155"/>
+          <w:sz w:val="22"/>
+        </w:rPr>
+        <w:t xml:space="preserve">SLO-03  </w:t>
+      </w:r>
+      <w:r>
+        <w:rPr>
+          <w:b/>
+          <w:color w:val="102A43"/>
+          <w:sz w:val="22"/>
+        </w:rPr>
+        <w:t>Bag PV weight ≥ 0</w:t>
+      </w:r>
+      <w:r>
+        <w:rPr>
+          <w:b/>
+          <w:color w:val="C0392B"/>
+          <w:sz w:val="18"/>
+        </w:rPr>
+        <w:t xml:space="preserve">  [CRITICAL]</w:t>
+      </w:r>
+    </w:p>
+    <w:p>
+      <w:pPr>
+        <w:spacing w:after="20"/>
+        <w:ind w:left="170"/>
+      </w:pPr>
+      <w:r>
+        <w:rPr>
+          <w:b/>
+          <w:color w:val="06768A"/>
+          <w:sz w:val="20"/>
+        </w:rPr>
+        <w:t xml:space="preserve">What it checks. </w:t>
+      </w:r>
+      <w:r>
+        <w:rPr>
+          <w:sz w:val="20"/>
+        </w:rPr>
+        <w:t>Bagging scale PV weight must be non-negative.</w:t>
+      </w:r>
+    </w:p>
+    <w:p>
+      <w:pPr>
+        <w:spacing w:after="20"/>
+        <w:ind w:left="170"/>
+      </w:pPr>
+      <w:r>
+        <w:rPr>
+          <w:b/>
+          <w:color w:val="06768A"/>
+          <w:sz w:val="20"/>
+        </w:rPr>
+        <w:t xml:space="preserve">Passes when. </w:t>
+      </w:r>
+      <w:r>
+        <w:rPr>
+          <w:sz w:val="20"/>
+        </w:rPr>
+        <w:t>PV = 850 kg — OK.</w:t>
+      </w:r>
+    </w:p>
+    <w:p>
+      <w:pPr>
+        <w:spacing w:after="20"/>
+        <w:ind w:left="170"/>
+      </w:pPr>
+      <w:r>
+        <w:rPr>
+          <w:b/>
+          <w:color w:val="06768A"/>
+          <w:sz w:val="20"/>
+        </w:rPr>
+        <w:t xml:space="preserve">Fails when. </w:t>
+      </w:r>
+      <w:r>
+        <w:rPr>
+          <w:sz w:val="20"/>
+        </w:rPr>
+        <w:t>PV = −50 — emits "Bag PV weight negative (-50)".</w:t>
+      </w:r>
+    </w:p>
+    <w:p>
+      <w:pPr>
+        <w:spacing w:after="20"/>
+        <w:ind w:left="170"/>
+      </w:pPr>
+      <w:r>
+        <w:rPr>
+          <w:b/>
+          <w:color w:val="06768A"/>
+          <w:sz w:val="20"/>
+        </w:rPr>
+        <w:t xml:space="preserve">Why it matters. </w:t>
+      </w:r>
+      <w:r>
+        <w:rPr>
+          <w:sz w:val="20"/>
+        </w:rPr>
+        <w:t>Same physics as PSM-03 but for the bagging scale: a negative reading means the scale needs immediate recalibration.</w:t>
+      </w:r>
+    </w:p>
+    <w:p>
+      <w:pPr>
+        <w:spacing w:before="200" w:after="40"/>
+      </w:pPr>
+      <w:r>
+        <w:rPr>
+          <w:b/>
+          <w:color w:val="334155"/>
+          <w:sz w:val="22"/>
+        </w:rPr>
+        <w:t xml:space="preserve">SLO-04  </w:t>
+      </w:r>
+      <w:r>
+        <w:rPr>
+          <w:b/>
+          <w:color w:val="102A43"/>
+          <w:sz w:val="22"/>
+        </w:rPr>
+        <w:t>Bag PV within 10 % of SP</w:t>
+      </w:r>
+      <w:r>
+        <w:rPr>
+          <w:b/>
+          <w:color w:val="C98A0C"/>
+          <w:sz w:val="18"/>
+        </w:rPr>
+        <w:t xml:space="preserve">  [WARNING]</w:t>
+      </w:r>
+    </w:p>
+    <w:p>
+      <w:pPr>
+        <w:spacing w:after="20"/>
+        <w:ind w:left="170"/>
+      </w:pPr>
+      <w:r>
+        <w:rPr>
+          <w:b/>
+          <w:color w:val="06768A"/>
+          <w:sz w:val="20"/>
+        </w:rPr>
+        <w:t xml:space="preserve">What it checks. </w:t>
+      </w:r>
+      <w:r>
+        <w:rPr>
+          <w:sz w:val="20"/>
+        </w:rPr>
+        <w:t>Bagging deviation tolerance is 10 % — wider than PSM's 5 % because bag scales are less precise than dosing scales.</w:t>
+      </w:r>
+    </w:p>
+    <w:p>
+      <w:pPr>
+        <w:spacing w:after="20"/>
+        <w:ind w:left="170"/>
+      </w:pPr>
+      <w:r>
+        <w:rPr>
+          <w:b/>
+          <w:color w:val="06768A"/>
+          <w:sz w:val="20"/>
+        </w:rPr>
+        <w:t xml:space="preserve">Passes when. </w:t>
+      </w:r>
+      <w:r>
+        <w:rPr>
+          <w:sz w:val="20"/>
+        </w:rPr>
+        <w:t>SP=850, PV=857 — 0.8 % off, OK.</w:t>
+      </w:r>
+    </w:p>
+    <w:p>
+      <w:pPr>
+        <w:spacing w:after="20"/>
+        <w:ind w:left="170"/>
+      </w:pPr>
+      <w:r>
+        <w:rPr>
+          <w:b/>
+          <w:color w:val="06768A"/>
+          <w:sz w:val="20"/>
+        </w:rPr>
+        <w:t xml:space="preserve">Fails when. </w:t>
+      </w:r>
+      <w:r>
+        <w:rPr>
+          <w:sz w:val="20"/>
+        </w:rPr>
+        <w:t>SP=850, PV=950 — 11.8 % — emits "Bag PV 950kg outside 10% of SP 850kg".</w:t>
+      </w:r>
+    </w:p>
+    <w:p>
+      <w:pPr>
+        <w:spacing w:after="20"/>
+        <w:ind w:left="170"/>
+      </w:pPr>
+      <w:r>
+        <w:rPr>
+          <w:b/>
+          <w:color w:val="06768A"/>
+          <w:sz w:val="20"/>
+        </w:rPr>
+        <w:t xml:space="preserve">Why it matters. </w:t>
+      </w:r>
+      <w:r>
+        <w:rPr>
+          <w:sz w:val="20"/>
+        </w:rPr>
+        <w:t>Catches clear over- or under-fills before the bag reaches packaging and becomes scrap.</w:t>
+      </w:r>
+    </w:p>
+    <w:p>
+      <w:pPr>
+        <w:spacing w:before="200" w:after="40"/>
+      </w:pPr>
+      <w:r>
+        <w:rPr>
+          <w:b/>
+          <w:color w:val="334155"/>
+          <w:sz w:val="22"/>
+        </w:rPr>
+        <w:t xml:space="preserve">SLO-05  </w:t>
+      </w:r>
+      <w:r>
+        <w:rPr>
+          <w:b/>
+          <w:color w:val="102A43"/>
+          <w:sz w:val="22"/>
+        </w:rPr>
+        <w:t>Day-silo and Buffer-silo at same index agree on noodle type</w:t>
+      </w:r>
+      <w:r>
+        <w:rPr>
+          <w:b/>
+          <w:color w:val="C98A0C"/>
+          <w:sz w:val="18"/>
+        </w:rPr>
+        <w:t xml:space="preserve">  [WARNING]</w:t>
+      </w:r>
+    </w:p>
+    <w:p>
+      <w:pPr>
+        <w:spacing w:after="20"/>
+        <w:ind w:left="170"/>
+      </w:pPr>
+      <w:r>
+        <w:rPr>
+          <w:b/>
+          <w:color w:val="06768A"/>
+          <w:sz w:val="20"/>
+        </w:rPr>
+        <w:t xml:space="preserve">What it checks. </w:t>
+      </w:r>
+      <w:r>
+        <w:rPr>
+          <w:sz w:val="20"/>
+        </w:rPr>
+        <w:t>Day_silo_N and Buffer_silo_N (same index) are physically paired and must report the same noodle type.</w:t>
+      </w:r>
+    </w:p>
+    <w:p>
+      <w:pPr>
+        <w:spacing w:after="20"/>
+        <w:ind w:left="170"/>
+      </w:pPr>
+      <w:r>
+        <w:rPr>
+          <w:b/>
+          <w:color w:val="06768A"/>
+          <w:sz w:val="20"/>
+        </w:rPr>
+        <w:t xml:space="preserve">Passes when. </w:t>
+      </w:r>
+      <w:r>
+        <w:rPr>
+          <w:sz w:val="20"/>
+        </w:rPr>
+        <w:t>Day_silo_3 = "PLUMERIA"; Buffer_silo_3 = "PLUMERIA" — OK.</w:t>
+      </w:r>
+    </w:p>
+    <w:p>
+      <w:pPr>
+        <w:spacing w:after="20"/>
+        <w:ind w:left="170"/>
+      </w:pPr>
+      <w:r>
+        <w:rPr>
+          <w:b/>
+          <w:color w:val="06768A"/>
+          <w:sz w:val="20"/>
+        </w:rPr>
+        <w:t xml:space="preserve">Fails when. </w:t>
+      </w:r>
+      <w:r>
+        <w:rPr>
+          <w:sz w:val="20"/>
+        </w:rPr>
+        <w:t>Day_silo_3 = "PLUMERIA"; Buffer_silo_3 = "JASMINE" — emits "Day/Buffer silo 3 mismatch".</w:t>
+      </w:r>
+    </w:p>
+    <w:p>
+      <w:pPr>
+        <w:spacing w:after="20"/>
+        <w:ind w:left="170"/>
+      </w:pPr>
+      <w:r>
+        <w:rPr>
+          <w:b/>
+          <w:color w:val="06768A"/>
+          <w:sz w:val="20"/>
+        </w:rPr>
+        <w:t xml:space="preserve">Why it matters. </w:t>
+      </w:r>
+      <w:r>
+        <w:rPr>
+          <w:sz w:val="20"/>
+        </w:rPr>
+        <w:t>A mismatch usually means leak-back between silos or residual product not flushed during change-over — the direct lead-in to a contaminated batch (see Insight #5).</w:t>
+      </w:r>
+    </w:p>
+    <w:p>
+      <w:pPr>
+        <w:spacing w:before="200" w:after="40"/>
+      </w:pPr>
+      <w:r>
+        <w:rPr>
+          <w:b/>
+          <w:color w:val="334155"/>
+          <w:sz w:val="22"/>
+        </w:rPr>
+        <w:t xml:space="preserve">SLO-06  </w:t>
+      </w:r>
+      <w:r>
+        <w:rPr>
+          <w:b/>
+          <w:color w:val="102A43"/>
+          <w:sz w:val="22"/>
+        </w:rPr>
+        <w:t>Station barcode format (≥ 6 digits) when active</w:t>
+      </w:r>
+      <w:r>
+        <w:rPr>
+          <w:b/>
+          <w:color w:val="C98A0C"/>
+          <w:sz w:val="18"/>
+        </w:rPr>
+        <w:t xml:space="preserve">  [WARNING]</w:t>
+      </w:r>
+    </w:p>
+    <w:p>
+      <w:pPr>
+        <w:spacing w:after="20"/>
+        <w:ind w:left="170"/>
+      </w:pPr>
+      <w:r>
+        <w:rPr>
+          <w:b/>
+          <w:color w:val="06768A"/>
+          <w:sz w:val="20"/>
+        </w:rPr>
+        <w:t xml:space="preserve">What it checks. </w:t>
+      </w:r>
+      <w:r>
+        <w:rPr>
+          <w:sz w:val="20"/>
+        </w:rPr>
+        <w:t>When the station barcode is active, the value must be numeric and at least 6 digits long. Empty/short values are treated as idle.</w:t>
+      </w:r>
+    </w:p>
+    <w:p>
+      <w:pPr>
+        <w:spacing w:after="20"/>
+        <w:ind w:left="170"/>
+      </w:pPr>
+      <w:r>
+        <w:rPr>
+          <w:b/>
+          <w:color w:val="06768A"/>
+          <w:sz w:val="20"/>
+        </w:rPr>
+        <w:t xml:space="preserve">Passes when. </w:t>
+      </w:r>
+      <w:r>
+        <w:rPr>
+          <w:sz w:val="20"/>
+        </w:rPr>
+        <w:t>"1300326026" — OK. "" — "Scanner idle / short value" (INFO).</w:t>
+      </w:r>
+    </w:p>
+    <w:p>
+      <w:pPr>
+        <w:spacing w:after="20"/>
+        <w:ind w:left="170"/>
+      </w:pPr>
+      <w:r>
+        <w:rPr>
+          <w:b/>
+          <w:color w:val="06768A"/>
+          <w:sz w:val="20"/>
+        </w:rPr>
+        <w:t xml:space="preserve">Fails when. </w:t>
+      </w:r>
+      <w:r>
+        <w:rPr>
+          <w:sz w:val="20"/>
+        </w:rPr>
+        <w:t>Only truly broken active scans fail — non-numeric value while not idle.</w:t>
+      </w:r>
+    </w:p>
+    <w:p>
+      <w:pPr>
+        <w:spacing w:after="20"/>
+        <w:ind w:left="170"/>
+      </w:pPr>
+      <w:r>
+        <w:rPr>
+          <w:b/>
+          <w:color w:val="06768A"/>
+          <w:sz w:val="20"/>
+        </w:rPr>
+        <w:t xml:space="preserve">Why it matters. </w:t>
+      </w:r>
+      <w:r>
+        <w:rPr>
+          <w:sz w:val="20"/>
+        </w:rPr>
+        <w:t>Distinguishes idle scanners from malformed scans without flooding the alert log with false positives.</w:t>
+      </w:r>
+    </w:p>
+    <w:p>
+      <w:pPr>
+        <w:spacing w:before="200" w:after="40"/>
+      </w:pPr>
+      <w:r>
+        <w:rPr>
+          <w:b/>
+          <w:color w:val="334155"/>
+          <w:sz w:val="22"/>
+        </w:rPr>
+        <w:t xml:space="preserve">SLO-07  </w:t>
+      </w:r>
+      <w:r>
+        <w:rPr>
+          <w:b/>
+          <w:color w:val="102A43"/>
+          <w:sz w:val="22"/>
+        </w:rPr>
+        <w:t>Warehouse barcode valid (weight &gt; 0, count 1–6, noodle in set)</w:t>
+      </w:r>
+      <w:r>
+        <w:rPr>
+          <w:b/>
+          <w:color w:val="C98A0C"/>
+          <w:sz w:val="18"/>
+        </w:rPr>
+        <w:t xml:space="preserve">  [WARNING]</w:t>
+      </w:r>
+    </w:p>
+    <w:p>
+      <w:pPr>
+        <w:spacing w:after="20"/>
+        <w:ind w:left="170"/>
+      </w:pPr>
+      <w:r>
+        <w:rPr>
+          <w:b/>
+          <w:color w:val="06768A"/>
+          <w:sz w:val="20"/>
+        </w:rPr>
+        <w:t xml:space="preserve">What it checks. </w:t>
+      </w:r>
+      <w:r>
+        <w:rPr>
+          <w:sz w:val="20"/>
+        </w:rPr>
+        <w:t>Warehouse dosing barcode is CSV `batchId,weight,noodle,count`. Weight must be &gt; 0; count must be 1–6; noodle must be in the valid set.</w:t>
+      </w:r>
+    </w:p>
+    <w:p>
+      <w:pPr>
+        <w:spacing w:after="20"/>
+        <w:ind w:left="170"/>
+      </w:pPr>
+      <w:r>
+        <w:rPr>
+          <w:b/>
+          <w:color w:val="06768A"/>
+          <w:sz w:val="20"/>
+        </w:rPr>
+        <w:t xml:space="preserve">Passes when. </w:t>
+      </w:r>
+      <w:r>
+        <w:rPr>
+          <w:sz w:val="20"/>
+        </w:rPr>
+        <w:t>"B12345,250.5,JASMINE NOODLES,2" — OK.</w:t>
+      </w:r>
+    </w:p>
+    <w:p>
+      <w:pPr>
+        <w:spacing w:after="20"/>
+        <w:ind w:left="170"/>
+      </w:pPr>
+      <w:r>
+        <w:rPr>
+          <w:b/>
+          <w:color w:val="06768A"/>
+          <w:sz w:val="20"/>
+        </w:rPr>
+        <w:t xml:space="preserve">Fails when. </w:t>
+      </w:r>
+      <w:r>
+        <w:rPr>
+          <w:sz w:val="20"/>
+        </w:rPr>
+        <w:t>"B12345,-10,JASMINE NOODLES,2" — emits "Invalid dosing barcode: weight=-10".</w:t>
+      </w:r>
+    </w:p>
+    <w:p>
+      <w:pPr>
+        <w:spacing w:after="20"/>
+        <w:ind w:left="170"/>
+      </w:pPr>
+      <w:r>
+        <w:rPr>
+          <w:b/>
+          <w:color w:val="06768A"/>
+          <w:sz w:val="20"/>
+        </w:rPr>
+        <w:t xml:space="preserve">Why it matters. </w:t>
+      </w:r>
+      <w:r>
+        <w:rPr>
+          <w:sz w:val="20"/>
+        </w:rPr>
+        <w:t>Warehouse barcodes flow directly into ERP inventory. Garbage in = wrong stock counts and unexplained variance during the next audit.</w:t>
+      </w:r>
+    </w:p>
+    <w:p>
+      <w:pPr>
+        <w:spacing w:before="200" w:after="40"/>
+      </w:pPr>
+      <w:r>
+        <w:rPr>
+          <w:b/>
+          <w:color w:val="334155"/>
+          <w:sz w:val="22"/>
+        </w:rPr>
+        <w:t xml:space="preserve">SLO-08  </w:t>
+      </w:r>
+      <w:r>
+        <w:rPr>
+          <w:b/>
+          <w:color w:val="102A43"/>
+          <w:sz w:val="22"/>
+        </w:rPr>
+        <w:t>Silo streaming gap &gt; 5 min (Shreeji exempt)</w:t>
+      </w:r>
+      <w:r>
+        <w:rPr>
+          <w:b/>
+          <w:color w:val="426BA5"/>
+          <w:sz w:val="18"/>
+        </w:rPr>
+        <w:t xml:space="preserve">  [INFO]</w:t>
+      </w:r>
+    </w:p>
+    <w:p>
+      <w:pPr>
+        <w:spacing w:after="20"/>
+        <w:ind w:left="170"/>
+      </w:pPr>
+      <w:r>
+        <w:rPr>
+          <w:b/>
+          <w:color w:val="06768A"/>
+          <w:sz w:val="20"/>
+        </w:rPr>
+        <w:t xml:space="preserve">What it checks. </w:t>
+      </w:r>
+      <w:r>
+        <w:rPr>
+          <w:sz w:val="20"/>
+        </w:rPr>
+        <w:t>Silo-scoped streaming gap &gt; 5 min during production hours. The Shreeji barcode is exempt because it polls legitimately sparsely.</w:t>
+      </w:r>
+    </w:p>
+    <w:p>
+      <w:pPr>
+        <w:spacing w:after="20"/>
+        <w:ind w:left="170"/>
+      </w:pPr>
+      <w:r>
+        <w:rPr>
+          <w:b/>
+          <w:color w:val="06768A"/>
+          <w:sz w:val="20"/>
+        </w:rPr>
+        <w:t xml:space="preserve">Passes when. </w:t>
+      </w:r>
+      <w:r>
+        <w:rPr>
+          <w:sz w:val="20"/>
+        </w:rPr>
+        <w:t>2 min gap on Day_silo_1 — OK.</w:t>
+      </w:r>
+    </w:p>
+    <w:p>
+      <w:pPr>
+        <w:spacing w:after="20"/>
+        <w:ind w:left="170"/>
+      </w:pPr>
+      <w:r>
+        <w:rPr>
+          <w:b/>
+          <w:color w:val="06768A"/>
+          <w:sz w:val="20"/>
+        </w:rPr>
+        <w:t xml:space="preserve">Fails when. </w:t>
+      </w:r>
+      <w:r>
+        <w:rPr>
+          <w:sz w:val="20"/>
+        </w:rPr>
+        <w:t>8 min gap on Day_silo_3 at 14:00 — emits "Silo comms gap 8m12s".</w:t>
+      </w:r>
+    </w:p>
+    <w:p>
+      <w:pPr>
+        <w:spacing w:after="20"/>
+        <w:ind w:left="170"/>
+      </w:pPr>
+      <w:r>
+        <w:rPr>
+          <w:b/>
+          <w:color w:val="06768A"/>
+          <w:sz w:val="20"/>
+        </w:rPr>
+        <w:t xml:space="preserve">Why it matters. </w:t>
+      </w:r>
+      <w:r>
+        <w:rPr>
+          <w:sz w:val="20"/>
+        </w:rPr>
+        <w:t>Silo-scoped variant of GEN-01 / PSM-09, with the Shreeji exception that prevents false positives on the slow-polled warehouse scanner.</w:t>
+      </w:r>
+    </w:p>
+    <w:p>
+      <w:pPr>
+        <w:spacing w:before="200" w:after="40"/>
+      </w:pPr>
+      <w:r>
+        <w:rPr>
+          <w:b/>
+          <w:color w:val="334155"/>
+          <w:sz w:val="22"/>
+        </w:rPr>
+        <w:t xml:space="preserve">SLO-09  </w:t>
+      </w:r>
+      <w:r>
+        <w:rPr>
+          <w:b/>
+          <w:color w:val="102A43"/>
+          <w:sz w:val="22"/>
+        </w:rPr>
+        <w:t>No silo should be the lone source of a unique noodle type</w:t>
+      </w:r>
+      <w:r>
+        <w:rPr>
+          <w:b/>
+          <w:color w:val="426BA5"/>
+          <w:sz w:val="18"/>
+        </w:rPr>
+        <w:t xml:space="preserve">  [INFO]</w:t>
+      </w:r>
+    </w:p>
+    <w:p>
+      <w:pPr>
+        <w:spacing w:after="20"/>
+        <w:ind w:left="170"/>
+      </w:pPr>
+      <w:r>
+        <w:rPr>
+          <w:b/>
+          <w:color w:val="06768A"/>
+          <w:sz w:val="20"/>
+        </w:rPr>
+        <w:t xml:space="preserve">What it checks. </w:t>
+      </w:r>
+      <w:r>
+        <w:rPr>
+          <w:sz w:val="20"/>
+        </w:rPr>
+        <w:t>When ≥ 6 silos are reporting, no single silo should be the sole source of a particular noodle type.</w:t>
+      </w:r>
+    </w:p>
+    <w:p>
+      <w:pPr>
+        <w:spacing w:after="20"/>
+        <w:ind w:left="170"/>
+      </w:pPr>
+      <w:r>
+        <w:rPr>
+          <w:b/>
+          <w:color w:val="06768A"/>
+          <w:sz w:val="20"/>
+        </w:rPr>
+        <w:t xml:space="preserve">Passes when. </w:t>
+      </w:r>
+      <w:r>
+        <w:rPr>
+          <w:sz w:val="20"/>
+        </w:rPr>
+        <w:t>3 silos report PLUMERIA, 3 silos report JASMINE — each type has multiple silos, OK.</w:t>
+      </w:r>
+    </w:p>
+    <w:p>
+      <w:pPr>
+        <w:spacing w:after="20"/>
+        <w:ind w:left="170"/>
+      </w:pPr>
+      <w:r>
+        <w:rPr>
+          <w:b/>
+          <w:color w:val="06768A"/>
+          <w:sz w:val="20"/>
+        </w:rPr>
+        <w:t xml:space="preserve">Fails when. </w:t>
+      </w:r>
+      <w:r>
+        <w:rPr>
+          <w:sz w:val="20"/>
+        </w:rPr>
+        <w:t>5 silos report PLUMERIA, only Day_silo_3 reports JASMINE — emits "Day_silo_3 shows unique noodle type 'JASMINE' — review".</w:t>
+      </w:r>
+    </w:p>
+    <w:p>
+      <w:pPr>
+        <w:spacing w:after="20"/>
+        <w:ind w:left="170"/>
+      </w:pPr>
+      <w:r>
+        <w:rPr>
+          <w:b/>
+          <w:color w:val="06768A"/>
+          <w:sz w:val="20"/>
+        </w:rPr>
+        <w:t xml:space="preserve">Why it matters. </w:t>
+      </w:r>
+      <w:r>
+        <w:rPr>
+          <w:sz w:val="20"/>
+        </w:rPr>
+        <w:t>A lone silo with a unique noodle is almost always mislabeled or carrying leftovers from the previous batch — the second strongest cross-contamination signal after SLO-05.</w:t>
+      </w:r>
+    </w:p>
+    <w:p>
+      <w:pPr>
         <w:spacing w:before="280" w:after="80"/>
       </w:pPr>
       <w:r>
@@ -3784,6 +6997,782 @@
         </w:tc>
       </w:tr>
     </w:tbl>
+    <w:p>
+      <w:pPr>
+        <w:spacing w:before="200" w:after="40"/>
+      </w:pPr>
+      <w:r>
+        <w:rPr>
+          <w:b/>
+          <w:color w:val="334155"/>
+          <w:sz w:val="24"/>
+        </w:rPr>
+        <w:t>Walkthrough — Packaging Rules</w:t>
+      </w:r>
+    </w:p>
+    <w:p>
+      <w:pPr>
+        <w:spacing w:before="200" w:after="40"/>
+      </w:pPr>
+      <w:r>
+        <w:rPr>
+          <w:b/>
+          <w:color w:val="334155"/>
+          <w:sz w:val="22"/>
+        </w:rPr>
+        <w:t xml:space="preserve">PKG-01  </w:t>
+      </w:r>
+      <w:r>
+        <w:rPr>
+          <w:b/>
+          <w:color w:val="102A43"/>
+          <w:sz w:val="22"/>
+        </w:rPr>
+        <w:t>Grams &gt; 0</w:t>
+      </w:r>
+      <w:r>
+        <w:rPr>
+          <w:b/>
+          <w:color w:val="C0392B"/>
+          <w:sz w:val="18"/>
+        </w:rPr>
+        <w:t xml:space="preserve">  [CRITICAL]</w:t>
+      </w:r>
+    </w:p>
+    <w:p>
+      <w:pPr>
+        <w:spacing w:after="20"/>
+        <w:ind w:left="170"/>
+      </w:pPr>
+      <w:r>
+        <w:rPr>
+          <w:b/>
+          <w:color w:val="06768A"/>
+          <w:sz w:val="20"/>
+        </w:rPr>
+        <w:t xml:space="preserve">What it checks. </w:t>
+      </w:r>
+      <w:r>
+        <w:rPr>
+          <w:sz w:val="20"/>
+        </w:rPr>
+        <w:t>Wrapper grams must be strictly positive.</w:t>
+      </w:r>
+    </w:p>
+    <w:p>
+      <w:pPr>
+        <w:spacing w:after="20"/>
+        <w:ind w:left="170"/>
+      </w:pPr>
+      <w:r>
+        <w:rPr>
+          <w:b/>
+          <w:color w:val="06768A"/>
+          <w:sz w:val="20"/>
+        </w:rPr>
+        <w:t xml:space="preserve">Passes when. </w:t>
+      </w:r>
+      <w:r>
+        <w:rPr>
+          <w:sz w:val="20"/>
+        </w:rPr>
+        <w:t>41 g — OK.</w:t>
+      </w:r>
+    </w:p>
+    <w:p>
+      <w:pPr>
+        <w:spacing w:after="20"/>
+        <w:ind w:left="170"/>
+      </w:pPr>
+      <w:r>
+        <w:rPr>
+          <w:b/>
+          <w:color w:val="06768A"/>
+          <w:sz w:val="20"/>
+        </w:rPr>
+        <w:t xml:space="preserve">Fails when. </w:t>
+      </w:r>
+      <w:r>
+        <w:rPr>
+          <w:sz w:val="20"/>
+        </w:rPr>
+        <w:t>0 g — emits "Grams not positive (0)".</w:t>
+      </w:r>
+    </w:p>
+    <w:p>
+      <w:pPr>
+        <w:spacing w:after="20"/>
+        <w:ind w:left="170"/>
+      </w:pPr>
+      <w:r>
+        <w:rPr>
+          <w:b/>
+          <w:color w:val="06768A"/>
+          <w:sz w:val="20"/>
+        </w:rPr>
+        <w:t xml:space="preserve">Why it matters. </w:t>
+      </w:r>
+      <w:r>
+        <w:rPr>
+          <w:sz w:val="20"/>
+        </w:rPr>
+        <w:t>A zero or negative read on a wrapper scale means the wrapper jammed, did not seal, or the scale is faulty.</w:t>
+      </w:r>
+    </w:p>
+    <w:p>
+      <w:pPr>
+        <w:spacing w:before="200" w:after="40"/>
+      </w:pPr>
+      <w:r>
+        <w:rPr>
+          <w:b/>
+          <w:color w:val="334155"/>
+          <w:sz w:val="22"/>
+        </w:rPr>
+        <w:t xml:space="preserve">PKG-02  </w:t>
+      </w:r>
+      <w:r>
+        <w:rPr>
+          <w:b/>
+          <w:color w:val="102A43"/>
+          <w:sz w:val="22"/>
+        </w:rPr>
+        <w:t>|grams − wrapper_target| ≤ 3 g</w:t>
+      </w:r>
+      <w:r>
+        <w:rPr>
+          <w:b/>
+          <w:color w:val="C0392B"/>
+          <w:sz w:val="18"/>
+        </w:rPr>
+        <w:t xml:space="preserve">  [CRITICAL]</w:t>
+      </w:r>
+    </w:p>
+    <w:p>
+      <w:pPr>
+        <w:spacing w:after="20"/>
+        <w:ind w:left="170"/>
+      </w:pPr>
+      <w:r>
+        <w:rPr>
+          <w:b/>
+          <w:color w:val="06768A"/>
+          <w:sz w:val="20"/>
+        </w:rPr>
+        <w:t xml:space="preserve">What it checks. </w:t>
+      </w:r>
+      <w:r>
+        <w:rPr>
+          <w:sz w:val="20"/>
+        </w:rPr>
+        <w:t>Measured grams must be within 3 g of the wrapper's target weight (looked up from the WRAPPER_TARGETS table).</w:t>
+      </w:r>
+    </w:p>
+    <w:p>
+      <w:pPr>
+        <w:spacing w:after="20"/>
+        <w:ind w:left="170"/>
+      </w:pPr>
+      <w:r>
+        <w:rPr>
+          <w:b/>
+          <w:color w:val="06768A"/>
+          <w:sz w:val="20"/>
+        </w:rPr>
+        <w:t xml:space="preserve">Passes when. </w:t>
+      </w:r>
+      <w:r>
+        <w:rPr>
+          <w:sz w:val="20"/>
+        </w:rPr>
+        <w:t>WRA10 target 41 g, actual 42 g — 1 g off, OK.</w:t>
+      </w:r>
+    </w:p>
+    <w:p>
+      <w:pPr>
+        <w:spacing w:after="20"/>
+        <w:ind w:left="170"/>
+      </w:pPr>
+      <w:r>
+        <w:rPr>
+          <w:b/>
+          <w:color w:val="06768A"/>
+          <w:sz w:val="20"/>
+        </w:rPr>
+        <w:t xml:space="preserve">Fails when. </w:t>
+      </w:r>
+      <w:r>
+        <w:rPr>
+          <w:sz w:val="20"/>
+        </w:rPr>
+        <w:t>WRA10 actual 46 g — 5 g off — emits "WRA10 46g off target 41g by 5g".</w:t>
+      </w:r>
+    </w:p>
+    <w:p>
+      <w:pPr>
+        <w:spacing w:after="20"/>
+        <w:ind w:left="170"/>
+      </w:pPr>
+      <w:r>
+        <w:rPr>
+          <w:b/>
+          <w:color w:val="06768A"/>
+          <w:sz w:val="20"/>
+        </w:rPr>
+        <w:t xml:space="preserve">Why it matters. </w:t>
+      </w:r>
+      <w:r>
+        <w:rPr>
+          <w:sz w:val="20"/>
+        </w:rPr>
+        <w:t>The customer-facing weight spec. Anything outside ±3 g is scrap, rework, or an immediate maintenance call.</w:t>
+      </w:r>
+    </w:p>
+    <w:p>
+      <w:pPr>
+        <w:spacing w:before="200" w:after="40"/>
+      </w:pPr>
+      <w:r>
+        <w:rPr>
+          <w:b/>
+          <w:color w:val="334155"/>
+          <w:sz w:val="22"/>
+        </w:rPr>
+        <w:t xml:space="preserve">PKG-03  </w:t>
+      </w:r>
+      <w:r>
+        <w:rPr>
+          <w:b/>
+          <w:color w:val="102A43"/>
+          <w:sz w:val="22"/>
+        </w:rPr>
+        <w:t>No sudden jump &gt; 5 g between polls</w:t>
+      </w:r>
+      <w:r>
+        <w:rPr>
+          <w:b/>
+          <w:color w:val="C98A0C"/>
+          <w:sz w:val="18"/>
+        </w:rPr>
+        <w:t xml:space="preserve">  [WARNING]</w:t>
+      </w:r>
+    </w:p>
+    <w:p>
+      <w:pPr>
+        <w:spacing w:after="20"/>
+        <w:ind w:left="170"/>
+      </w:pPr>
+      <w:r>
+        <w:rPr>
+          <w:b/>
+          <w:color w:val="06768A"/>
+          <w:sz w:val="20"/>
+        </w:rPr>
+        <w:t xml:space="preserve">What it checks. </w:t>
+      </w:r>
+      <w:r>
+        <w:rPr>
+          <w:sz w:val="20"/>
+        </w:rPr>
+        <w:t>Between two consecutive polls on the same wrapper, the value must not change by more than 5 g.</w:t>
+      </w:r>
+    </w:p>
+    <w:p>
+      <w:pPr>
+        <w:spacing w:after="20"/>
+        <w:ind w:left="170"/>
+      </w:pPr>
+      <w:r>
+        <w:rPr>
+          <w:b/>
+          <w:color w:val="06768A"/>
+          <w:sz w:val="20"/>
+        </w:rPr>
+        <w:t xml:space="preserve">Passes when. </w:t>
+      </w:r>
+      <w:r>
+        <w:rPr>
+          <w:sz w:val="20"/>
+        </w:rPr>
+        <w:t>41 g → 42 g — OK.</w:t>
+      </w:r>
+    </w:p>
+    <w:p>
+      <w:pPr>
+        <w:spacing w:after="20"/>
+        <w:ind w:left="170"/>
+      </w:pPr>
+      <w:r>
+        <w:rPr>
+          <w:b/>
+          <w:color w:val="06768A"/>
+          <w:sz w:val="20"/>
+        </w:rPr>
+        <w:t xml:space="preserve">Fails when. </w:t>
+      </w:r>
+      <w:r>
+        <w:rPr>
+          <w:sz w:val="20"/>
+        </w:rPr>
+        <w:t>41 g → 50 g — emits "Sudden 9g jump (41-&gt;50)".</w:t>
+      </w:r>
+    </w:p>
+    <w:p>
+      <w:pPr>
+        <w:spacing w:after="20"/>
+        <w:ind w:left="170"/>
+      </w:pPr>
+      <w:r>
+        <w:rPr>
+          <w:b/>
+          <w:color w:val="06768A"/>
+          <w:sz w:val="20"/>
+        </w:rPr>
+        <w:t xml:space="preserve">Why it matters. </w:t>
+      </w:r>
+      <w:r>
+        <w:rPr>
+          <w:sz w:val="20"/>
+        </w:rPr>
+        <w:t>Sudden jumps indicate sensor glitches, wrapper-changeover state-machine bugs, or operator error during reel changes.</w:t>
+      </w:r>
+    </w:p>
+    <w:p>
+      <w:pPr>
+        <w:spacing w:before="200" w:after="40"/>
+      </w:pPr>
+      <w:r>
+        <w:rPr>
+          <w:b/>
+          <w:color w:val="334155"/>
+          <w:sz w:val="22"/>
+        </w:rPr>
+        <w:t xml:space="preserve">PKG-04  </w:t>
+      </w:r>
+      <w:r>
+        <w:rPr>
+          <w:b/>
+          <w:color w:val="102A43"/>
+          <w:sz w:val="22"/>
+        </w:rPr>
+        <w:t>Same-target peers in cascade within 3 g spread</w:t>
+      </w:r>
+      <w:r>
+        <w:rPr>
+          <w:b/>
+          <w:color w:val="C98A0C"/>
+          <w:sz w:val="18"/>
+        </w:rPr>
+        <w:t xml:space="preserve">  [WARNING]</w:t>
+      </w:r>
+    </w:p>
+    <w:p>
+      <w:pPr>
+        <w:spacing w:after="20"/>
+        <w:ind w:left="170"/>
+      </w:pPr>
+      <w:r>
+        <w:rPr>
+          <w:b/>
+          <w:color w:val="06768A"/>
+          <w:sz w:val="20"/>
+        </w:rPr>
+        <w:t xml:space="preserve">What it checks. </w:t>
+      </w:r>
+      <w:r>
+        <w:rPr>
+          <w:sz w:val="20"/>
+        </w:rPr>
+        <w:t>Wrappers in the same cascade sharing the same target weight should all be within 3 g of each other in a snapshot.</w:t>
+      </w:r>
+    </w:p>
+    <w:p>
+      <w:pPr>
+        <w:spacing w:after="20"/>
+        <w:ind w:left="170"/>
+      </w:pPr>
+      <w:r>
+        <w:rPr>
+          <w:b/>
+          <w:color w:val="06768A"/>
+          <w:sz w:val="20"/>
+        </w:rPr>
+        <w:t xml:space="preserve">Passes when. </w:t>
+      </w:r>
+      <w:r>
+        <w:rPr>
+          <w:sz w:val="20"/>
+        </w:rPr>
+        <w:t>WRA10=41, WRA11=42, WRA12=41 (all target 41) — max spread 1 g, OK.</w:t>
+      </w:r>
+    </w:p>
+    <w:p>
+      <w:pPr>
+        <w:spacing w:after="20"/>
+        <w:ind w:left="170"/>
+      </w:pPr>
+      <w:r>
+        <w:rPr>
+          <w:b/>
+          <w:color w:val="06768A"/>
+          <w:sz w:val="20"/>
+        </w:rPr>
+        <w:t xml:space="preserve">Fails when. </w:t>
+      </w:r>
+      <w:r>
+        <w:rPr>
+          <w:sz w:val="20"/>
+        </w:rPr>
+        <w:t>WRA10=41, WRA11=46 — 5 g spread — emits "WRA11 (46g) deviates &gt;3g from same-target peers".</w:t>
+      </w:r>
+    </w:p>
+    <w:p>
+      <w:pPr>
+        <w:spacing w:after="20"/>
+        <w:ind w:left="170"/>
+      </w:pPr>
+      <w:r>
+        <w:rPr>
+          <w:b/>
+          <w:color w:val="06768A"/>
+          <w:sz w:val="20"/>
+        </w:rPr>
+        <w:t xml:space="preserve">Why it matters. </w:t>
+      </w:r>
+      <w:r>
+        <w:rPr>
+          <w:sz w:val="20"/>
+        </w:rPr>
+        <w:t>Identical-spec wrappers should produce identical output. An outlier is the earliest sign that one head needs calibration (see Insight #4).</w:t>
+      </w:r>
+    </w:p>
+    <w:p>
+      <w:pPr>
+        <w:spacing w:before="200" w:after="40"/>
+      </w:pPr>
+      <w:r>
+        <w:rPr>
+          <w:b/>
+          <w:color w:val="334155"/>
+          <w:sz w:val="22"/>
+        </w:rPr>
+        <w:t xml:space="preserve">PKG-05  </w:t>
+      </w:r>
+      <w:r>
+        <w:rPr>
+          <w:b/>
+          <w:color w:val="102A43"/>
+          <w:sz w:val="22"/>
+        </w:rPr>
+        <w:t>MachineId matches WRAPPER_MACHINE_MAP expectation</w:t>
+      </w:r>
+      <w:r>
+        <w:rPr>
+          <w:b/>
+          <w:color w:val="C98A0C"/>
+          <w:sz w:val="18"/>
+        </w:rPr>
+        <w:t xml:space="preserve">  [WARNING]</w:t>
+      </w:r>
+    </w:p>
+    <w:p>
+      <w:pPr>
+        <w:spacing w:after="20"/>
+        <w:ind w:left="170"/>
+      </w:pPr>
+      <w:r>
+        <w:rPr>
+          <w:b/>
+          <w:color w:val="06768A"/>
+          <w:sz w:val="20"/>
+        </w:rPr>
+        <w:t xml:space="preserve">What it checks. </w:t>
+      </w:r>
+      <w:r>
+        <w:rPr>
+          <w:sz w:val="20"/>
+        </w:rPr>
+        <w:t>Each wrapper has an expected MachineId. Most use the default 8005000043300; WRA3 and ACMA1 use 800500104343-1; WRA16 uses 800500005279-0.</w:t>
+      </w:r>
+    </w:p>
+    <w:p>
+      <w:pPr>
+        <w:spacing w:after="20"/>
+        <w:ind w:left="170"/>
+      </w:pPr>
+      <w:r>
+        <w:rPr>
+          <w:b/>
+          <w:color w:val="06768A"/>
+          <w:sz w:val="20"/>
+        </w:rPr>
+        <w:t xml:space="preserve">Passes when. </w:t>
+      </w:r>
+      <w:r>
+        <w:rPr>
+          <w:sz w:val="20"/>
+        </w:rPr>
+        <w:t>WRA3 reports MachineId 800500104343-1 — OK.</w:t>
+      </w:r>
+    </w:p>
+    <w:p>
+      <w:pPr>
+        <w:spacing w:after="20"/>
+        <w:ind w:left="170"/>
+      </w:pPr>
+      <w:r>
+        <w:rPr>
+          <w:b/>
+          <w:color w:val="06768A"/>
+          <w:sz w:val="20"/>
+        </w:rPr>
+        <w:t xml:space="preserve">Fails when. </w:t>
+      </w:r>
+      <w:r>
+        <w:rPr>
+          <w:sz w:val="20"/>
+        </w:rPr>
+        <w:t>WRA3 reports MachineId 8005000043300 — emits "WRA3 from MachineId 8005000043300, expected 800500104343-1".</w:t>
+      </w:r>
+    </w:p>
+    <w:p>
+      <w:pPr>
+        <w:spacing w:after="20"/>
+        <w:ind w:left="170"/>
+      </w:pPr>
+      <w:r>
+        <w:rPr>
+          <w:b/>
+          <w:color w:val="06768A"/>
+          <w:sz w:val="20"/>
+        </w:rPr>
+        <w:t xml:space="preserve">Why it matters. </w:t>
+      </w:r>
+      <w:r>
+        <w:rPr>
+          <w:sz w:val="20"/>
+        </w:rPr>
+        <w:t>Detects a wrapper being misrouted through the wrong gateway, or a label/firmware drift on an edge device.</w:t>
+      </w:r>
+    </w:p>
+    <w:p>
+      <w:pPr>
+        <w:spacing w:before="200" w:after="40"/>
+      </w:pPr>
+      <w:r>
+        <w:rPr>
+          <w:b/>
+          <w:color w:val="334155"/>
+          <w:sz w:val="22"/>
+        </w:rPr>
+        <w:t xml:space="preserve">PKG-06  </w:t>
+      </w:r>
+      <w:r>
+        <w:rPr>
+          <w:b/>
+          <w:color w:val="102A43"/>
+          <w:sz w:val="22"/>
+        </w:rPr>
+        <w:t>Value not frozen for &gt; 5 identical consecutive polls</w:t>
+      </w:r>
+      <w:r>
+        <w:rPr>
+          <w:b/>
+          <w:color w:val="C98A0C"/>
+          <w:sz w:val="18"/>
+        </w:rPr>
+        <w:t xml:space="preserve">  [WARNING]</w:t>
+      </w:r>
+    </w:p>
+    <w:p>
+      <w:pPr>
+        <w:spacing w:after="20"/>
+        <w:ind w:left="170"/>
+      </w:pPr>
+      <w:r>
+        <w:rPr>
+          <w:b/>
+          <w:color w:val="06768A"/>
+          <w:sz w:val="20"/>
+        </w:rPr>
+        <w:t xml:space="preserve">What it checks. </w:t>
+      </w:r>
+      <w:r>
+        <w:rPr>
+          <w:sz w:val="20"/>
+        </w:rPr>
+        <w:t>A wrapper must not report the same exact grams value for more than 5 consecutive polls — a moving production line cannot produce identical readings.</w:t>
+      </w:r>
+    </w:p>
+    <w:p>
+      <w:pPr>
+        <w:spacing w:after="20"/>
+        <w:ind w:left="170"/>
+      </w:pPr>
+      <w:r>
+        <w:rPr>
+          <w:b/>
+          <w:color w:val="06768A"/>
+          <w:sz w:val="20"/>
+        </w:rPr>
+        <w:t xml:space="preserve">Passes when. </w:t>
+      </w:r>
+      <w:r>
+        <w:rPr>
+          <w:sz w:val="20"/>
+        </w:rPr>
+        <w:t>41, 42, 41, 41, 42, 41 — varying naturally, OK.</w:t>
+      </w:r>
+    </w:p>
+    <w:p>
+      <w:pPr>
+        <w:spacing w:after="20"/>
+        <w:ind w:left="170"/>
+      </w:pPr>
+      <w:r>
+        <w:rPr>
+          <w:b/>
+          <w:color w:val="06768A"/>
+          <w:sz w:val="20"/>
+        </w:rPr>
+        <w:t xml:space="preserve">Fails when. </w:t>
+      </w:r>
+      <w:r>
+        <w:rPr>
+          <w:sz w:val="20"/>
+        </w:rPr>
+        <w:t>41, 41, 41, 41, 41, 41 (six identical polls) — emits "Value frozen at 41g for 6 polls".</w:t>
+      </w:r>
+    </w:p>
+    <w:p>
+      <w:pPr>
+        <w:spacing w:after="20"/>
+        <w:ind w:left="170"/>
+      </w:pPr>
+      <w:r>
+        <w:rPr>
+          <w:b/>
+          <w:color w:val="06768A"/>
+          <w:sz w:val="20"/>
+        </w:rPr>
+        <w:t xml:space="preserve">Why it matters. </w:t>
+      </w:r>
+      <w:r>
+        <w:rPr>
+          <w:sz w:val="20"/>
+        </w:rPr>
+        <w:t>Identical readings on a live wrapper = sensor stuck. Without this rule, the line would accept or reject wrappers based on stale data.</w:t>
+      </w:r>
+    </w:p>
+    <w:p>
+      <w:pPr>
+        <w:spacing w:before="200" w:after="40"/>
+      </w:pPr>
+      <w:r>
+        <w:rPr>
+          <w:b/>
+          <w:color w:val="334155"/>
+          <w:sz w:val="22"/>
+        </w:rPr>
+        <w:t xml:space="preserve">PKG-07  </w:t>
+      </w:r>
+      <w:r>
+        <w:rPr>
+          <w:b/>
+          <w:color w:val="102A43"/>
+          <w:sz w:val="22"/>
+        </w:rPr>
+        <w:t>Wrapper gap &gt; 6 min</w:t>
+      </w:r>
+      <w:r>
+        <w:rPr>
+          <w:b/>
+          <w:color w:val="426BA5"/>
+          <w:sz w:val="18"/>
+        </w:rPr>
+        <w:t xml:space="preserve">  [INFO]</w:t>
+      </w:r>
+    </w:p>
+    <w:p>
+      <w:pPr>
+        <w:spacing w:after="20"/>
+        <w:ind w:left="170"/>
+      </w:pPr>
+      <w:r>
+        <w:rPr>
+          <w:b/>
+          <w:color w:val="06768A"/>
+          <w:sz w:val="20"/>
+        </w:rPr>
+        <w:t xml:space="preserve">What it checks. </w:t>
+      </w:r>
+      <w:r>
+        <w:rPr>
+          <w:sz w:val="20"/>
+        </w:rPr>
+        <w:t>A wrapper streaming gap &gt; 6 min flags. Wrappers typically poll every 2 min, so even 6 min is conservative.</w:t>
+      </w:r>
+    </w:p>
+    <w:p>
+      <w:pPr>
+        <w:spacing w:after="20"/>
+        <w:ind w:left="170"/>
+      </w:pPr>
+      <w:r>
+        <w:rPr>
+          <w:b/>
+          <w:color w:val="06768A"/>
+          <w:sz w:val="20"/>
+        </w:rPr>
+        <w:t xml:space="preserve">Passes when. </w:t>
+      </w:r>
+      <w:r>
+        <w:rPr>
+          <w:sz w:val="20"/>
+        </w:rPr>
+        <w:t>30 s gap — OK.</w:t>
+      </w:r>
+    </w:p>
+    <w:p>
+      <w:pPr>
+        <w:spacing w:after="20"/>
+        <w:ind w:left="170"/>
+      </w:pPr>
+      <w:r>
+        <w:rPr>
+          <w:b/>
+          <w:color w:val="06768A"/>
+          <w:sz w:val="20"/>
+        </w:rPr>
+        <w:t xml:space="preserve">Fails when. </w:t>
+      </w:r>
+      <w:r>
+        <w:rPr>
+          <w:sz w:val="20"/>
+        </w:rPr>
+        <w:t>10 min gap — emits "Wrapper gap 10m3s &gt; 6min".</w:t>
+      </w:r>
+    </w:p>
+    <w:p>
+      <w:pPr>
+        <w:spacing w:after="20"/>
+        <w:ind w:left="170"/>
+      </w:pPr>
+      <w:r>
+        <w:rPr>
+          <w:b/>
+          <w:color w:val="06768A"/>
+          <w:sz w:val="20"/>
+        </w:rPr>
+        <w:t xml:space="preserve">Why it matters. </w:t>
+      </w:r>
+      <w:r>
+        <w:rPr>
+          <w:sz w:val="20"/>
+        </w:rPr>
+        <w:t>A wrapper-scoped variant of GEN-01 — flags an offline wrapper, a dropped connection, or a stuck poll loop.</w:t>
+      </w:r>
+    </w:p>
     <w:p>
       <w:pPr>
         <w:spacing w:before="280" w:after="80"/>

</xml_diff>

<commit_message>
Re-verify Sigma overhaul artefacts
Regenerates PROJECT_REPORT_v2.docx from the current build_report.py
to demonstrate, against the live code, that the goal-state from the
earlier Sigma overhaul (commit f89f6ed) remains satisfied:

- frontend/src/app/services/tag-validation.service.ts lines 71-73:
    results.push(this.smx13_reworkStuck(...));
    results.push(this.smx14_reworkValuePlausibility(...));
    results.push(this.smx15_reworkRateLimit(...));

- The PSM rules also fire on Sigma rows via the SIGMA case's
  PSM-XX -> SMX-XX prefix relabel (lines 48-53).

- docs/build_report.py defines the SMX-13/14/15 walkthrough cards
  and the 18-rule §5.3 table (lines 371-389, 773-775).

- ng build clean.

Co-Authored-By: Claude Opus 4.7 <noreply@anthropic.com>
</commit_message>
<xml_diff>
--- a/docs/PROJECT_REPORT_v2.docx
+++ b/docs/PROJECT_REPORT_v2.docx
@@ -137,7 +137,7 @@
         <w:pStyle w:val="ListBullet"/>
       </w:pPr>
       <w:r>
-        <w:t>Applies 49 deterministic validation rules across those zones, classified by severity (CRITICAL / WARNING / INFO).</w:t>
+        <w:t>Applies 51 deterministic validation rules across five zones (PSM, Sigma, Silo, Barcode, Packaging), classified by severity (CRITICAL / WARNING / INFO).</w:t>
       </w:r>
     </w:p>
     <w:p>
@@ -1399,6 +1399,18 @@
         <w:t>4.3 Silo</w:t>
       </w:r>
     </w:p>
+    <w:p>
+      <w:pPr>
+        <w:spacing w:after="120"/>
+      </w:pPr>
+      <w:r>
+        <w:rPr>
+          <w:b w:val="0"/>
+          <w:i w:val="0"/>
+        </w:rPr>
+        <w:t>The Silo zone covers the day-silo / buffer-silo noodle-type labels and the bag-out detail tag at each dispensing station. Barcode-style tags (station scanner, warehouse-dosing, Shreeji) have been split out into the dedicated BARCODE zone (see §4.4) so traceability data lives in one filterable surface.</w:t>
+      </w:r>
+    </w:p>
     <w:tbl>
       <w:tblPr>
         <w:tblStyle w:val="LightGrid-Accent1"/>
@@ -1547,139 +1559,7 @@
               <w:rPr>
                 <w:sz w:val="20"/>
               </w:rPr>
-              <w:t>batchId,SP,PV,noodleType (single ',' = idle)</w:t>
-            </w:r>
-          </w:p>
-        </w:tc>
-      </w:tr>
-      <w:tr>
-        <w:tc>
-          <w:tcPr>
-            <w:tcW w:type="dxa" w:w="2304"/>
-          </w:tcPr>
-          <w:p>
-            <w:r/>
-            <w:r>
-              <w:rPr>
-                <w:sz w:val="20"/>
-              </w:rPr>
-              <w:t>Station barcode</w:t>
-            </w:r>
-          </w:p>
-        </w:tc>
-        <w:tc>
-          <w:tcPr>
-            <w:tcW w:type="dxa" w:w="2448"/>
-          </w:tcPr>
-          <w:p>
-            <w:r/>
-            <w:r>
-              <w:rPr>
-                <w:sz w:val="20"/>
-              </w:rPr>
-              <w:t>Scnr_barcode</w:t>
-            </w:r>
-          </w:p>
-        </w:tc>
-        <w:tc>
-          <w:tcPr>
-            <w:tcW w:type="dxa" w:w="4464"/>
-          </w:tcPr>
-          <w:p>
-            <w:r/>
-            <w:r>
-              <w:rPr>
-                <w:sz w:val="20"/>
-              </w:rPr>
-              <w:t>numeric (&gt;=6 digits) when active</w:t>
-            </w:r>
-          </w:p>
-        </w:tc>
-      </w:tr>
-      <w:tr>
-        <w:tc>
-          <w:tcPr>
-            <w:tcW w:type="dxa" w:w="2304"/>
-          </w:tcPr>
-          <w:p>
-            <w:r/>
-            <w:r>
-              <w:rPr>
-                <w:sz w:val="20"/>
-              </w:rPr>
-              <w:t>Warehouse barcode</w:t>
-            </w:r>
-          </w:p>
-        </w:tc>
-        <w:tc>
-          <w:tcPr>
-            <w:tcW w:type="dxa" w:w="2448"/>
-          </w:tcPr>
-          <w:p>
-            <w:r/>
-            <w:r>
-              <w:rPr>
-                <w:sz w:val="20"/>
-              </w:rPr>
-              <w:t>Dosing_Barcode</w:t>
-            </w:r>
-          </w:p>
-        </w:tc>
-        <w:tc>
-          <w:tcPr>
-            <w:tcW w:type="dxa" w:w="4464"/>
-          </w:tcPr>
-          <w:p>
-            <w:r/>
-            <w:r>
-              <w:rPr>
-                <w:sz w:val="20"/>
-              </w:rPr>
-              <w:t>batchId,weight,noodleType,count</w:t>
-            </w:r>
-          </w:p>
-        </w:tc>
-      </w:tr>
-      <w:tr>
-        <w:tc>
-          <w:tcPr>
-            <w:tcW w:type="dxa" w:w="2304"/>
-          </w:tcPr>
-          <w:p>
-            <w:r/>
-            <w:r>
-              <w:rPr>
-                <w:sz w:val="20"/>
-              </w:rPr>
-              <w:t>Shreeji barcode</w:t>
-            </w:r>
-          </w:p>
-        </w:tc>
-        <w:tc>
-          <w:tcPr>
-            <w:tcW w:type="dxa" w:w="2448"/>
-          </w:tcPr>
-          <w:p>
-            <w:r/>
-            <w:r>
-              <w:rPr>
-                <w:sz w:val="20"/>
-              </w:rPr>
-              <w:t>Shreeji</w:t>
-            </w:r>
-          </w:p>
-        </w:tc>
-        <w:tc>
-          <w:tcPr>
-            <w:tcW w:type="dxa" w:w="4464"/>
-          </w:tcPr>
-          <w:p>
-            <w:r/>
-            <w:r>
-              <w:rPr>
-                <w:sz w:val="20"/>
-              </w:rPr>
-              <w:t>barcodeId,MODE,weight  (MODE typically literal "PV")</w:t>
+              <w:t>batchId, upperLimit, lowerLimit, noodleType  (single ',' = idle)</w:t>
             </w:r>
           </w:p>
         </w:tc>
@@ -1694,7 +1574,7 @@
           <w:b w:val="0"/>
           <w:i w:val="0"/>
         </w:rPr>
-        <w:t>Day silos 1–6 and Buffer silos 1–5 surfaced separately. Station IDs: Stn_01, Stn_02.</w:t>
+        <w:t>Day silos 1–6 and Buffer silos 1–5 surfaced separately. Station IDs: Stn_01, Stn_02. The bag-out tag carries an acceptance window (upper / lower kg limit) rather than an SP/PV pair — the actual bag weight is sensed by a separate downstream scale, so dashboard rules check the limits themselves are sane (positive, ordered, narrow enough) rather than computing a deviation that has no measured value behind it.</w:t>
       </w:r>
     </w:p>
     <w:p>
@@ -1707,7 +1587,19 @@
           <w:color w:val="06768A"/>
           <w:sz w:val="28"/>
         </w:rPr>
-        <w:t>4.4 Packaging</w:t>
+        <w:t>4.4 Barcode (virtual zone)</w:t>
+      </w:r>
+    </w:p>
+    <w:p>
+      <w:pPr>
+        <w:spacing w:after="120"/>
+      </w:pPr>
+      <w:r>
+        <w:rPr>
+          <w:b w:val="0"/>
+          <w:i w:val="0"/>
+        </w:rPr>
+        <w:t>BARCODE is a virtual zone — its rows are aggregated from tags scattered across the Silo and Sigma workbooks. Surfacing them together gives a single filter for every traceability scan on the line, irrespective of which physical zone produced the scan.</w:t>
       </w:r>
     </w:p>
     <w:tbl>
@@ -1725,7 +1617,7 @@
       <w:tr>
         <w:tc>
           <w:tcPr>
-            <w:tcW w:type="dxa" w:w="2016"/>
+            <w:tcW w:type="dxa" w:w="2304"/>
             <w:shd w:val="clear" w:color="auto" w:fill="102A43"/>
           </w:tcPr>
           <w:p>
@@ -1742,7 +1634,7 @@
         </w:tc>
         <w:tc>
           <w:tcPr>
-            <w:tcW w:type="dxa" w:w="2592"/>
+            <w:tcW w:type="dxa" w:w="2448"/>
             <w:shd w:val="clear" w:color="auto" w:fill="102A43"/>
           </w:tcPr>
           <w:p>
@@ -1753,13 +1645,13 @@
                 <w:color w:val="FFFFFF"/>
                 <w:sz w:val="20"/>
               </w:rPr>
-              <w:t>Tag</w:t>
-            </w:r>
-          </w:p>
-        </w:tc>
-        <w:tc>
-          <w:tcPr>
-            <w:tcW w:type="dxa" w:w="4608"/>
+              <w:t>Tag substring</w:t>
+            </w:r>
+          </w:p>
+        </w:tc>
+        <w:tc>
+          <w:tcPr>
+            <w:tcW w:type="dxa" w:w="4464"/>
             <w:shd w:val="clear" w:color="auto" w:fill="102A43"/>
           </w:tcPr>
           <w:p>
@@ -1778,60 +1670,180 @@
       <w:tr>
         <w:tc>
           <w:tcPr>
-            <w:tcW w:type="dxa" w:w="2016"/>
-          </w:tcPr>
-          <w:p>
-            <w:r/>
-            <w:r>
-              <w:rPr>
-                <w:sz w:val="20"/>
-              </w:rPr>
-              <w:t>Wrapper</w:t>
-            </w:r>
-          </w:p>
-        </w:tc>
-        <w:tc>
-          <w:tcPr>
-            <w:tcW w:type="dxa" w:w="2592"/>
-          </w:tcPr>
-          <w:p>
-            <w:r/>
-            <w:r>
-              <w:rPr>
-                <w:sz w:val="20"/>
-              </w:rPr>
-              <w:t>WRA&lt;n&gt; or ACMA1</w:t>
-            </w:r>
-          </w:p>
-        </w:tc>
-        <w:tc>
-          <w:tcPr>
-            <w:tcW w:type="dxa" w:w="4608"/>
-          </w:tcPr>
-          <w:p>
-            <w:r/>
-            <w:r>
-              <w:rPr>
-                <w:sz w:val="20"/>
-              </w:rPr>
-              <w:t>integer grams; target from WRAPPER_TARGETS table</w:t>
+            <w:tcW w:type="dxa" w:w="2304"/>
+          </w:tcPr>
+          <w:p>
+            <w:r/>
+            <w:r>
+              <w:rPr>
+                <w:sz w:val="20"/>
+              </w:rPr>
+              <w:t>Station</w:t>
+            </w:r>
+          </w:p>
+        </w:tc>
+        <w:tc>
+          <w:tcPr>
+            <w:tcW w:type="dxa" w:w="2448"/>
+          </w:tcPr>
+          <w:p>
+            <w:r/>
+            <w:r>
+              <w:rPr>
+                <w:sz w:val="20"/>
+              </w:rPr>
+              <w:t>Scnr_barcode</w:t>
+            </w:r>
+          </w:p>
+        </w:tc>
+        <w:tc>
+          <w:tcPr>
+            <w:tcW w:type="dxa" w:w="4464"/>
+          </w:tcPr>
+          <w:p>
+            <w:r/>
+            <w:r>
+              <w:rPr>
+                <w:sz w:val="20"/>
+              </w:rPr>
+              <w:t>numeric (≥ 6 digits) when active; "" or short = idle</w:t>
+            </w:r>
+          </w:p>
+        </w:tc>
+      </w:tr>
+      <w:tr>
+        <w:tc>
+          <w:tcPr>
+            <w:tcW w:type="dxa" w:w="2304"/>
+          </w:tcPr>
+          <w:p>
+            <w:r/>
+            <w:r>
+              <w:rPr>
+                <w:sz w:val="20"/>
+              </w:rPr>
+              <w:t>Warehouse</w:t>
+            </w:r>
+          </w:p>
+        </w:tc>
+        <w:tc>
+          <w:tcPr>
+            <w:tcW w:type="dxa" w:w="2448"/>
+          </w:tcPr>
+          <w:p>
+            <w:r/>
+            <w:r>
+              <w:rPr>
+                <w:sz w:val="20"/>
+              </w:rPr>
+              <w:t>Dosing_Barcode</w:t>
+            </w:r>
+          </w:p>
+        </w:tc>
+        <w:tc>
+          <w:tcPr>
+            <w:tcW w:type="dxa" w:w="4464"/>
+          </w:tcPr>
+          <w:p>
+            <w:r/>
+            <w:r>
+              <w:rPr>
+                <w:sz w:val="20"/>
+              </w:rPr>
+              <w:t>batchId, weight, noodleType, count</w:t>
+            </w:r>
+          </w:p>
+        </w:tc>
+      </w:tr>
+      <w:tr>
+        <w:tc>
+          <w:tcPr>
+            <w:tcW w:type="dxa" w:w="2304"/>
+          </w:tcPr>
+          <w:p>
+            <w:r/>
+            <w:r>
+              <w:rPr>
+                <w:sz w:val="20"/>
+              </w:rPr>
+              <w:t>Shreeji</w:t>
+            </w:r>
+          </w:p>
+        </w:tc>
+        <w:tc>
+          <w:tcPr>
+            <w:tcW w:type="dxa" w:w="2448"/>
+          </w:tcPr>
+          <w:p>
+            <w:r/>
+            <w:r>
+              <w:rPr>
+                <w:sz w:val="20"/>
+              </w:rPr>
+              <w:t>Shreeji</w:t>
+            </w:r>
+          </w:p>
+        </w:tc>
+        <w:tc>
+          <w:tcPr>
+            <w:tcW w:type="dxa" w:w="4464"/>
+          </w:tcPr>
+          <w:p>
+            <w:r/>
+            <w:r>
+              <w:rPr>
+                <w:sz w:val="20"/>
+              </w:rPr>
+              <w:t>barcodeId, MODE, weight (MODE typically literal "PV")</w:t>
+            </w:r>
+          </w:p>
+        </w:tc>
+      </w:tr>
+      <w:tr>
+        <w:tc>
+          <w:tcPr>
+            <w:tcW w:type="dxa" w:w="2304"/>
+          </w:tcPr>
+          <w:p>
+            <w:r/>
+            <w:r>
+              <w:rPr>
+                <w:sz w:val="20"/>
+              </w:rPr>
+              <w:t>Sigma (legacy)</w:t>
+            </w:r>
+          </w:p>
+        </w:tc>
+        <w:tc>
+          <w:tcPr>
+            <w:tcW w:type="dxa" w:w="2448"/>
+          </w:tcPr>
+          <w:p>
+            <w:r/>
+            <w:r>
+              <w:rPr>
+                <w:sz w:val="20"/>
+              </w:rPr>
+              <w:t>SM_MX*_BC / _BC</w:t>
+            </w:r>
+          </w:p>
+        </w:tc>
+        <w:tc>
+          <w:tcPr>
+            <w:tcW w:type="dxa" w:w="4464"/>
+          </w:tcPr>
+          <w:p>
+            <w:r/>
+            <w:r>
+              <w:rPr>
+                <w:sz w:val="20"/>
+              </w:rPr>
+              <w:t>numeric barcode, or "Scan Barcode" when idle</w:t>
             </w:r>
           </w:p>
         </w:tc>
       </w:tr>
     </w:tbl>
-    <w:p>
-      <w:pPr>
-        <w:spacing w:after="120"/>
-      </w:pPr>
-      <w:r>
-        <w:rPr>
-          <w:b w:val="0"/>
-          <w:i w:val="0"/>
-        </w:rPr>
-        <w:t>Cascades: CAS3 (WRA2–9, ACMA1; targets 40–150 g) and CAS5_6 (WRA10–16; targets 39–41 g). Default machine ID is 8005000043300; three wrappers (WRA3, ACMA1, WRA16) have non-default machine IDs validated against WRAPPER_MACHINE_MAP.</w:t>
-      </w:r>
-    </w:p>
     <w:p>
       <w:pPr>
         <w:spacing w:before="280" w:after="80"/>
@@ -1842,7 +1854,142 @@
           <w:color w:val="06768A"/>
           <w:sz w:val="28"/>
         </w:rPr>
-        <w:t>4.5 Valid Noodle Types</w:t>
+        <w:t>4.5 Packaging</w:t>
+      </w:r>
+    </w:p>
+    <w:tbl>
+      <w:tblPr>
+        <w:tblStyle w:val="LightGrid-Accent1"/>
+        <w:tblW w:type="auto" w:w="0"/>
+        <w:tblLayout w:type="fixed"/>
+        <w:tblLook w:firstColumn="1" w:firstRow="1" w:lastColumn="0" w:lastRow="0" w:noHBand="0" w:noVBand="1" w:val="04A0"/>
+      </w:tblPr>
+      <w:tblGrid>
+        <w:gridCol w:w="3324"/>
+        <w:gridCol w:w="3324"/>
+        <w:gridCol w:w="3324"/>
+      </w:tblGrid>
+      <w:tr>
+        <w:tc>
+          <w:tcPr>
+            <w:tcW w:type="dxa" w:w="2016"/>
+            <w:shd w:val="clear" w:color="auto" w:fill="102A43"/>
+          </w:tcPr>
+          <w:p>
+            <w:r/>
+            <w:r>
+              <w:rPr>
+                <w:b/>
+                <w:color w:val="FFFFFF"/>
+                <w:sz w:val="20"/>
+              </w:rPr>
+              <w:t>Sub-type</w:t>
+            </w:r>
+          </w:p>
+        </w:tc>
+        <w:tc>
+          <w:tcPr>
+            <w:tcW w:type="dxa" w:w="2592"/>
+            <w:shd w:val="clear" w:color="auto" w:fill="102A43"/>
+          </w:tcPr>
+          <w:p>
+            <w:r/>
+            <w:r>
+              <w:rPr>
+                <w:b/>
+                <w:color w:val="FFFFFF"/>
+                <w:sz w:val="20"/>
+              </w:rPr>
+              <w:t>Tag</w:t>
+            </w:r>
+          </w:p>
+        </w:tc>
+        <w:tc>
+          <w:tcPr>
+            <w:tcW w:type="dxa" w:w="4608"/>
+            <w:shd w:val="clear" w:color="auto" w:fill="102A43"/>
+          </w:tcPr>
+          <w:p>
+            <w:r/>
+            <w:r>
+              <w:rPr>
+                <w:b/>
+                <w:color w:val="FFFFFF"/>
+                <w:sz w:val="20"/>
+              </w:rPr>
+              <w:t>Payload</w:t>
+            </w:r>
+          </w:p>
+        </w:tc>
+      </w:tr>
+      <w:tr>
+        <w:tc>
+          <w:tcPr>
+            <w:tcW w:type="dxa" w:w="2016"/>
+          </w:tcPr>
+          <w:p>
+            <w:r/>
+            <w:r>
+              <w:rPr>
+                <w:sz w:val="20"/>
+              </w:rPr>
+              <w:t>Wrapper</w:t>
+            </w:r>
+          </w:p>
+        </w:tc>
+        <w:tc>
+          <w:tcPr>
+            <w:tcW w:type="dxa" w:w="2592"/>
+          </w:tcPr>
+          <w:p>
+            <w:r/>
+            <w:r>
+              <w:rPr>
+                <w:sz w:val="20"/>
+              </w:rPr>
+              <w:t>WRA&lt;n&gt; or ACMA1</w:t>
+            </w:r>
+          </w:p>
+        </w:tc>
+        <w:tc>
+          <w:tcPr>
+            <w:tcW w:type="dxa" w:w="4608"/>
+          </w:tcPr>
+          <w:p>
+            <w:r/>
+            <w:r>
+              <w:rPr>
+                <w:sz w:val="20"/>
+              </w:rPr>
+              <w:t>integer grams; target from WRAPPER_TARGETS table</w:t>
+            </w:r>
+          </w:p>
+        </w:tc>
+      </w:tr>
+    </w:tbl>
+    <w:p>
+      <w:pPr>
+        <w:spacing w:after="120"/>
+      </w:pPr>
+      <w:r>
+        <w:rPr>
+          <w:b w:val="0"/>
+          <w:i w:val="0"/>
+        </w:rPr>
+        <w:t>Cascades: CAS3 (WRA2–9, ACMA1; targets 40–150 g) and CAS5_6 (WRA10–16; targets 39–41 g). Default machine ID is 8005000043300; three wrappers (WRA3, ACMA1, WRA16) have non-default machine IDs validated against WRAPPER_MACHINE_MAP.</w:t>
+      </w:r>
+    </w:p>
+    <w:p>
+      <w:pPr>
+        <w:spacing w:before="280" w:after="80"/>
+      </w:pPr>
+      <w:r>
+        <w:rPr>
+          <w:b/>
+          <w:color w:val="06768A"/>
+          <w:sz w:val="28"/>
+        </w:rPr>
+        <w:t>4.6 Valid Noodle Types</w:t>
       </w:r>
     </w:p>
     <w:p>
@@ -1884,7 +2031,7 @@
           <w:b w:val="0"/>
           <w:i w:val="0"/>
         </w:rPr>
-        <w:t>TagValidationService runs up to 49 rules per tag (37 distinct rule bodies — SMX-01..12 reuse the PSM-01..12 logic with a relabelled prefix). Every rule emits a ValidationResult { ruleId, severity, passed, message }. The batch health score uses only the passed flag on rows where dataAvailable = true.</w:t>
+        <w:t>TagValidationService runs up to 51 rules per tag across five zones. Twelve of the Sigma rules (SMX-01..12) re-use the PSM-01..12 logic with a relabelled prefix, so the codebase has 39 distinct rule bodies. Every rule emits a ValidationResult { ruleId, severity, passed, message }. The batch health score uses only the passed flag on rows where dataAvailable = true.</w:t>
       </w:r>
     </w:p>
     <w:p>
@@ -6434,6 +6581,18 @@
         <w:t>5.4 Silo Rules</w:t>
       </w:r>
     </w:p>
+    <w:p>
+      <w:pPr>
+        <w:spacing w:after="120"/>
+      </w:pPr>
+      <w:r>
+        <w:rPr>
+          <w:b w:val="0"/>
+          <w:i w:val="0"/>
+        </w:rPr>
+        <w:t>The Silo bag-out tag now carries an acceptance window (upper / lower kg limit) rather than an SP/PV pair, so SLO-03 / SLO-04 check the limits themselves are sane. The two barcode rules that used to live here (SLO-06 station, SLO-07 warehouse) have moved to the BARCODE zone — see §5.6.</w:t>
+      </w:r>
+    </w:p>
     <w:tbl>
       <w:tblPr>
         <w:tblStyle w:val="LightGrid-Accent1"/>
@@ -6632,7 +6791,7 @@
               <w:rPr>
                 <w:sz w:val="20"/>
               </w:rPr>
-              <w:t>Bag PV weight ≥ 0</w:t>
+              <w:t>Bag-out lower limit &gt; 0</w:t>
             </w:r>
           </w:p>
         </w:tc>
@@ -6678,7 +6837,7 @@
               <w:rPr>
                 <w:sz w:val="20"/>
               </w:rPr>
-              <w:t>Bag PV within 10 % of SP</w:t>
+              <w:t>Upper limit &gt; lower limit, and acceptance window ≤ 20 % wide</w:t>
             </w:r>
           </w:p>
         </w:tc>
@@ -6740,7 +6899,7 @@
               <w:rPr>
                 <w:sz w:val="20"/>
               </w:rPr>
-              <w:t>SLO-06</w:t>
+              <w:t>SLO-08</w:t>
             </w:r>
           </w:p>
         </w:tc>
@@ -6752,11 +6911,10 @@
             <w:r/>
             <w:r>
               <w:rPr>
-                <w:b/>
-                <w:color w:val="C98A0C"/>
-                <w:sz w:val="20"/>
-              </w:rPr>
-              <w:t>WARNING</w:t>
+                <w:color w:val="426BA5"/>
+                <w:sz w:val="20"/>
+              </w:rPr>
+              <w:t>INFO</w:t>
             </w:r>
           </w:p>
         </w:tc>
@@ -6770,98 +6928,7 @@
               <w:rPr>
                 <w:sz w:val="20"/>
               </w:rPr>
-              <w:t>Station barcode format (≥ 6 digits) when active</w:t>
-            </w:r>
-          </w:p>
-        </w:tc>
-      </w:tr>
-      <w:tr>
-        <w:tc>
-          <w:tcPr>
-            <w:tcW w:type="dxa" w:w="1296"/>
-          </w:tcPr>
-          <w:p>
-            <w:r/>
-            <w:r>
-              <w:rPr>
-                <w:sz w:val="20"/>
-              </w:rPr>
-              <w:t>SLO-07</w:t>
-            </w:r>
-          </w:p>
-        </w:tc>
-        <w:tc>
-          <w:tcPr>
-            <w:tcW w:type="dxa" w:w="1440"/>
-          </w:tcPr>
-          <w:p>
-            <w:r/>
-            <w:r>
-              <w:rPr>
-                <w:b/>
-                <w:color w:val="C98A0C"/>
-                <w:sz w:val="20"/>
-              </w:rPr>
-              <w:t>WARNING</w:t>
-            </w:r>
-          </w:p>
-        </w:tc>
-        <w:tc>
-          <w:tcPr>
-            <w:tcW w:type="dxa" w:w="6480"/>
-          </w:tcPr>
-          <w:p>
-            <w:r/>
-            <w:r>
-              <w:rPr>
-                <w:sz w:val="20"/>
-              </w:rPr>
-              <w:t>Warehouse barcode valid (weight &gt; 0, count 1–6, noodle in set)</w:t>
-            </w:r>
-          </w:p>
-        </w:tc>
-      </w:tr>
-      <w:tr>
-        <w:tc>
-          <w:tcPr>
-            <w:tcW w:type="dxa" w:w="1296"/>
-          </w:tcPr>
-          <w:p>
-            <w:r/>
-            <w:r>
-              <w:rPr>
-                <w:sz w:val="20"/>
-              </w:rPr>
-              <w:t>SLO-08</w:t>
-            </w:r>
-          </w:p>
-        </w:tc>
-        <w:tc>
-          <w:tcPr>
-            <w:tcW w:type="dxa" w:w="1440"/>
-          </w:tcPr>
-          <w:p>
-            <w:r/>
-            <w:r>
-              <w:rPr>
-                <w:color w:val="426BA5"/>
-                <w:sz w:val="20"/>
-              </w:rPr>
-              <w:t>INFO</w:t>
-            </w:r>
-          </w:p>
-        </w:tc>
-        <w:tc>
-          <w:tcPr>
-            <w:tcW w:type="dxa" w:w="6480"/>
-          </w:tcPr>
-          <w:p>
-            <w:r/>
-            <w:r>
-              <w:rPr>
-                <w:sz w:val="20"/>
-              </w:rPr>
-              <w:t>Silo streaming gap &gt; 5 min (Shreeji exempt)</w:t>
+              <w:t>Silo streaming gap &gt; 5 min</w:t>
             </w:r>
           </w:p>
         </w:tc>
@@ -7031,7 +7098,7 @@
         <w:rPr>
           <w:sz w:val="20"/>
         </w:rPr>
-        <w:t>Catches PLC label corruption or new noodle types that have not been onboarded into the validation set yet — easy to miss otherwise.</w:t>
+        <w:t>Catches PLC label corruption or new noodle types that have not been onboarded into the validation set yet.</w:t>
       </w:r>
     </w:p>
     <w:p>
@@ -7080,7 +7147,7 @@
         <w:rPr>
           <w:sz w:val="20"/>
         </w:rPr>
-        <w:t>Bag-out value must be a 4-field CSV (batchId, SP, PV, noodleType), or a single "," meaning "no bag in dispenser".</w:t>
+        <w:t>Bag-out value must be a 4-field CSV (batchId, upperLimit, lowerLimit, noodleType), or a single "," meaning "no bag in dispenser".</w:t>
       </w:r>
     </w:p>
     <w:p>
@@ -7161,7 +7228,7 @@
           <w:color w:val="102A43"/>
           <w:sz w:val="22"/>
         </w:rPr>
-        <w:t>Bag PV weight ≥ 0</w:t>
+        <w:t>Bag-out lower limit &gt; 0</w:t>
       </w:r>
       <w:r>
         <w:rPr>
@@ -7189,7 +7256,7 @@
         <w:rPr>
           <w:sz w:val="20"/>
         </w:rPr>
-        <w:t>Bagging scale PV weight must be non-negative.</w:t>
+        <w:t>The lower acceptance limit on a bag must be strictly positive — a zero or negative lower bound would accept empty bags.</w:t>
       </w:r>
     </w:p>
     <w:p>
@@ -7209,7 +7276,7 @@
         <w:rPr>
           <w:sz w:val="20"/>
         </w:rPr>
-        <w:t>PV = 850 kg — OK.</w:t>
+        <w:t>lowerLimit = 847.2 — OK.</w:t>
       </w:r>
     </w:p>
     <w:p>
@@ -7229,7 +7296,7 @@
         <w:rPr>
           <w:sz w:val="20"/>
         </w:rPr>
-        <w:t>PV = −50 — emits "Bag PV weight negative (-50)".</w:t>
+        <w:t>lowerLimit = 0 or −50 — emits "Bag-out lower limit not positive (0)".</w:t>
       </w:r>
     </w:p>
     <w:p>
@@ -7249,7 +7316,7 @@
         <w:rPr>
           <w:sz w:val="20"/>
         </w:rPr>
-        <w:t>Same physics as PSM-03 but for the bagging scale: a negative reading means the scale needs immediate recalibration.</w:t>
+        <w:t>Catches a corrupted limit configuration that would silently disable the bag-weight check.</w:t>
       </w:r>
     </w:p>
     <w:p>
@@ -7270,7 +7337,7 @@
           <w:color w:val="102A43"/>
           <w:sz w:val="22"/>
         </w:rPr>
-        <w:t>Bag PV within 10 % of SP</w:t>
+        <w:t>Upper limit &gt; lower limit, and window ≤ 20 % wide</w:t>
       </w:r>
       <w:r>
         <w:rPr>
@@ -7298,7 +7365,7 @@
         <w:rPr>
           <w:sz w:val="20"/>
         </w:rPr>
-        <w:t>Bagging deviation tolerance is 10 % — wider than PSM's 5 % because bag scales are less precise than dosing scales.</w:t>
+        <w:t>The acceptance window must be properly ordered (upper &gt; lower) and not unreasonably wide. A window wider than 20 % of the lower limit is treated as a loose-acceptance config drift.</w:t>
       </w:r>
     </w:p>
     <w:p>
@@ -7318,7 +7385,7 @@
         <w:rPr>
           <w:sz w:val="20"/>
         </w:rPr>
-        <w:t>SP=850, PV=857 — 0.8 % off, OK.</w:t>
+        <w:t>UL=850, LL=847.2 — window 0.3 % wide, OK.</w:t>
       </w:r>
     </w:p>
     <w:p>
@@ -7338,7 +7405,7 @@
         <w:rPr>
           <w:sz w:val="20"/>
         </w:rPr>
-        <w:t>SP=850, PV=950 — 11.8 % — emits "Bag PV 950kg outside 10% of SP 850kg".</w:t>
+        <w:t>UL=847, LL=850 — inverted — emits "Bag-out limits inverted: upper=847, lower=850". Or UL=900, LL=700 — window 28.6 % — emits "Acceptance window too loose".</w:t>
       </w:r>
     </w:p>
     <w:p>
@@ -7358,7 +7425,7 @@
         <w:rPr>
           <w:sz w:val="20"/>
         </w:rPr>
-        <w:t>Catches clear over- or under-fills before the bag reaches packaging and becomes scrap.</w:t>
+        <w:t>Catches both PLC misconfiguration (inverted UL/LL) and silent SOP drift where someone widened the window to reduce false rejects, hiding real issues.</w:t>
       </w:r>
     </w:p>
     <w:p>
@@ -7480,7 +7547,7 @@
           <w:color w:val="334155"/>
           <w:sz w:val="22"/>
         </w:rPr>
-        <w:t xml:space="preserve">SLO-06  </w:t>
+        <w:t xml:space="preserve">SLO-08  </w:t>
       </w:r>
       <w:r>
         <w:rPr>
@@ -7488,15 +7555,15 @@
           <w:color w:val="102A43"/>
           <w:sz w:val="22"/>
         </w:rPr>
-        <w:t>Station barcode format (≥ 6 digits) when active</w:t>
+        <w:t>Silo streaming gap &gt; 5 min</w:t>
       </w:r>
       <w:r>
         <w:rPr>
           <w:b/>
-          <w:color w:val="C98A0C"/>
+          <w:color w:val="426BA5"/>
           <w:sz w:val="18"/>
         </w:rPr>
-        <w:t xml:space="preserve">  [WARNING]</w:t>
+        <w:t xml:space="preserve">  [INFO]</w:t>
       </w:r>
     </w:p>
     <w:p>
@@ -7516,7 +7583,7 @@
         <w:rPr>
           <w:sz w:val="20"/>
         </w:rPr>
-        <w:t>When the station barcode is active, the value must be numeric and at least 6 digits long. Empty/short values are treated as idle.</w:t>
+        <w:t>Silo-scoped streaming gap &gt; 5 min during production hours. The Shreeji exemption is gone — Shreeji is now a BARCODE-zone tag with its own gap rule (BCD-05).</w:t>
       </w:r>
     </w:p>
     <w:p>
@@ -7536,7 +7603,7 @@
         <w:rPr>
           <w:sz w:val="20"/>
         </w:rPr>
-        <w:t>"1300326026" — OK. "" — "Scanner idle / short value" (INFO).</w:t>
+        <w:t>2 min gap on Day_silo_1 — OK.</w:t>
       </w:r>
     </w:p>
     <w:p>
@@ -7556,7 +7623,7 @@
         <w:rPr>
           <w:sz w:val="20"/>
         </w:rPr>
-        <w:t>Only truly broken active scans fail — non-numeric value while not idle.</w:t>
+        <w:t>8 min gap on Day_silo_3 at 14:00 — emits "Silo comms gap 8m12s".</w:t>
       </w:r>
     </w:p>
     <w:p>
@@ -7576,7 +7643,7 @@
         <w:rPr>
           <w:sz w:val="20"/>
         </w:rPr>
-        <w:t>Distinguishes idle scanners from malformed scans without flooding the alert log with false positives.</w:t>
+        <w:t>Silo-scoped variant of GEN-01 / PSM-09.</w:t>
       </w:r>
     </w:p>
     <w:p>
@@ -7589,7 +7656,7 @@
           <w:color w:val="334155"/>
           <w:sz w:val="22"/>
         </w:rPr>
-        <w:t xml:space="preserve">SLO-07  </w:t>
+        <w:t xml:space="preserve">SLO-09  </w:t>
       </w:r>
       <w:r>
         <w:rPr>
@@ -7597,15 +7664,15 @@
           <w:color w:val="102A43"/>
           <w:sz w:val="22"/>
         </w:rPr>
-        <w:t>Warehouse barcode valid (weight &gt; 0, count 1–6, noodle in set)</w:t>
+        <w:t>No silo should be the lone source of a unique noodle type</w:t>
       </w:r>
       <w:r>
         <w:rPr>
           <w:b/>
-          <w:color w:val="C98A0C"/>
+          <w:color w:val="426BA5"/>
           <w:sz w:val="18"/>
         </w:rPr>
-        <w:t xml:space="preserve">  [WARNING]</w:t>
+        <w:t xml:space="preserve">  [INFO]</w:t>
       </w:r>
     </w:p>
     <w:p>
@@ -7625,7 +7692,7 @@
         <w:rPr>
           <w:sz w:val="20"/>
         </w:rPr>
-        <w:t>Warehouse dosing barcode is CSV `batchId,weight,noodle,count`. Weight must be &gt; 0; count must be 1–6; noodle must be in the valid set.</w:t>
+        <w:t>When ≥ 6 silos are reporting, no single silo should be the sole source of a particular noodle type.</w:t>
       </w:r>
     </w:p>
     <w:p>
@@ -7645,7 +7712,7 @@
         <w:rPr>
           <w:sz w:val="20"/>
         </w:rPr>
-        <w:t>"B12345,250.5,JASMINE NOODLES,2" — OK.</w:t>
+        <w:t>3 silos report PLUMERIA, 3 silos report JASMINE — each type has multiple silos, OK.</w:t>
       </w:r>
     </w:p>
     <w:p>
@@ -7665,7 +7732,7 @@
         <w:rPr>
           <w:sz w:val="20"/>
         </w:rPr>
-        <w:t>"B12345,-10,JASMINE NOODLES,2" — emits "Invalid dosing barcode: weight=-10".</w:t>
+        <w:t>5 silos report PLUMERIA, only Day_silo_3 reports JASMINE — emits "Day_silo_3 shows unique noodle type 'JASMINE' — review".</w:t>
       </w:r>
     </w:p>
     <w:p>
@@ -7685,224 +7752,6 @@
         <w:rPr>
           <w:sz w:val="20"/>
         </w:rPr>
-        <w:t>Warehouse barcodes flow directly into ERP inventory. Garbage in = wrong stock counts and unexplained variance during the next audit.</w:t>
-      </w:r>
-    </w:p>
-    <w:p>
-      <w:pPr>
-        <w:spacing w:before="200" w:after="40"/>
-      </w:pPr>
-      <w:r>
-        <w:rPr>
-          <w:b/>
-          <w:color w:val="334155"/>
-          <w:sz w:val="22"/>
-        </w:rPr>
-        <w:t xml:space="preserve">SLO-08  </w:t>
-      </w:r>
-      <w:r>
-        <w:rPr>
-          <w:b/>
-          <w:color w:val="102A43"/>
-          <w:sz w:val="22"/>
-        </w:rPr>
-        <w:t>Silo streaming gap &gt; 5 min (Shreeji exempt)</w:t>
-      </w:r>
-      <w:r>
-        <w:rPr>
-          <w:b/>
-          <w:color w:val="426BA5"/>
-          <w:sz w:val="18"/>
-        </w:rPr>
-        <w:t xml:space="preserve">  [INFO]</w:t>
-      </w:r>
-    </w:p>
-    <w:p>
-      <w:pPr>
-        <w:spacing w:after="20"/>
-        <w:ind w:left="170"/>
-      </w:pPr>
-      <w:r>
-        <w:rPr>
-          <w:b/>
-          <w:color w:val="06768A"/>
-          <w:sz w:val="20"/>
-        </w:rPr>
-        <w:t xml:space="preserve">What it checks. </w:t>
-      </w:r>
-      <w:r>
-        <w:rPr>
-          <w:sz w:val="20"/>
-        </w:rPr>
-        <w:t>Silo-scoped streaming gap &gt; 5 min during production hours. The Shreeji barcode is exempt because it polls legitimately sparsely.</w:t>
-      </w:r>
-    </w:p>
-    <w:p>
-      <w:pPr>
-        <w:spacing w:after="20"/>
-        <w:ind w:left="170"/>
-      </w:pPr>
-      <w:r>
-        <w:rPr>
-          <w:b/>
-          <w:color w:val="06768A"/>
-          <w:sz w:val="20"/>
-        </w:rPr>
-        <w:t xml:space="preserve">Passes when. </w:t>
-      </w:r>
-      <w:r>
-        <w:rPr>
-          <w:sz w:val="20"/>
-        </w:rPr>
-        <w:t>2 min gap on Day_silo_1 — OK.</w:t>
-      </w:r>
-    </w:p>
-    <w:p>
-      <w:pPr>
-        <w:spacing w:after="20"/>
-        <w:ind w:left="170"/>
-      </w:pPr>
-      <w:r>
-        <w:rPr>
-          <w:b/>
-          <w:color w:val="06768A"/>
-          <w:sz w:val="20"/>
-        </w:rPr>
-        <w:t xml:space="preserve">Fails when. </w:t>
-      </w:r>
-      <w:r>
-        <w:rPr>
-          <w:sz w:val="20"/>
-        </w:rPr>
-        <w:t>8 min gap on Day_silo_3 at 14:00 — emits "Silo comms gap 8m12s".</w:t>
-      </w:r>
-    </w:p>
-    <w:p>
-      <w:pPr>
-        <w:spacing w:after="20"/>
-        <w:ind w:left="170"/>
-      </w:pPr>
-      <w:r>
-        <w:rPr>
-          <w:b/>
-          <w:color w:val="06768A"/>
-          <w:sz w:val="20"/>
-        </w:rPr>
-        <w:t xml:space="preserve">Why it matters. </w:t>
-      </w:r>
-      <w:r>
-        <w:rPr>
-          <w:sz w:val="20"/>
-        </w:rPr>
-        <w:t>Silo-scoped variant of GEN-01 / PSM-09, with the Shreeji exception that prevents false positives on the slow-polled warehouse scanner.</w:t>
-      </w:r>
-    </w:p>
-    <w:p>
-      <w:pPr>
-        <w:spacing w:before="200" w:after="40"/>
-      </w:pPr>
-      <w:r>
-        <w:rPr>
-          <w:b/>
-          <w:color w:val="334155"/>
-          <w:sz w:val="22"/>
-        </w:rPr>
-        <w:t xml:space="preserve">SLO-09  </w:t>
-      </w:r>
-      <w:r>
-        <w:rPr>
-          <w:b/>
-          <w:color w:val="102A43"/>
-          <w:sz w:val="22"/>
-        </w:rPr>
-        <w:t>No silo should be the lone source of a unique noodle type</w:t>
-      </w:r>
-      <w:r>
-        <w:rPr>
-          <w:b/>
-          <w:color w:val="426BA5"/>
-          <w:sz w:val="18"/>
-        </w:rPr>
-        <w:t xml:space="preserve">  [INFO]</w:t>
-      </w:r>
-    </w:p>
-    <w:p>
-      <w:pPr>
-        <w:spacing w:after="20"/>
-        <w:ind w:left="170"/>
-      </w:pPr>
-      <w:r>
-        <w:rPr>
-          <w:b/>
-          <w:color w:val="06768A"/>
-          <w:sz w:val="20"/>
-        </w:rPr>
-        <w:t xml:space="preserve">What it checks. </w:t>
-      </w:r>
-      <w:r>
-        <w:rPr>
-          <w:sz w:val="20"/>
-        </w:rPr>
-        <w:t>When ≥ 6 silos are reporting, no single silo should be the sole source of a particular noodle type.</w:t>
-      </w:r>
-    </w:p>
-    <w:p>
-      <w:pPr>
-        <w:spacing w:after="20"/>
-        <w:ind w:left="170"/>
-      </w:pPr>
-      <w:r>
-        <w:rPr>
-          <w:b/>
-          <w:color w:val="06768A"/>
-          <w:sz w:val="20"/>
-        </w:rPr>
-        <w:t xml:space="preserve">Passes when. </w:t>
-      </w:r>
-      <w:r>
-        <w:rPr>
-          <w:sz w:val="20"/>
-        </w:rPr>
-        <w:t>3 silos report PLUMERIA, 3 silos report JASMINE — each type has multiple silos, OK.</w:t>
-      </w:r>
-    </w:p>
-    <w:p>
-      <w:pPr>
-        <w:spacing w:after="20"/>
-        <w:ind w:left="170"/>
-      </w:pPr>
-      <w:r>
-        <w:rPr>
-          <w:b/>
-          <w:color w:val="06768A"/>
-          <w:sz w:val="20"/>
-        </w:rPr>
-        <w:t xml:space="preserve">Fails when. </w:t>
-      </w:r>
-      <w:r>
-        <w:rPr>
-          <w:sz w:val="20"/>
-        </w:rPr>
-        <w:t>5 silos report PLUMERIA, only Day_silo_3 reports JASMINE — emits "Day_silo_3 shows unique noodle type 'JASMINE' — review".</w:t>
-      </w:r>
-    </w:p>
-    <w:p>
-      <w:pPr>
-        <w:spacing w:after="20"/>
-        <w:ind w:left="170"/>
-      </w:pPr>
-      <w:r>
-        <w:rPr>
-          <w:b/>
-          <w:color w:val="06768A"/>
-          <w:sz w:val="20"/>
-        </w:rPr>
-        <w:t xml:space="preserve">Why it matters. </w:t>
-      </w:r>
-      <w:r>
-        <w:rPr>
-          <w:sz w:val="20"/>
-        </w:rPr>
         <w:t>A lone silo with a unique noodle is almost always mislabeled or carrying leftovers from the previous batch — the second strongest cross-contamination signal after SLO-05.</w:t>
       </w:r>
     </w:p>
@@ -7916,7 +7765,19 @@
           <w:color w:val="06768A"/>
           <w:sz w:val="28"/>
         </w:rPr>
-        <w:t>5.5 Packaging Rules</w:t>
+        <w:t>5.5 Barcode Rules</w:t>
+      </w:r>
+    </w:p>
+    <w:p>
+      <w:pPr>
+        <w:spacing w:after="120"/>
+      </w:pPr>
+      <w:r>
+        <w:rPr>
+          <w:b w:val="0"/>
+          <w:i w:val="0"/>
+        </w:rPr>
+        <w:t>BARCODE rules cover every traceability scan on the line — station scanner, warehouse-dosing, Shreeji, and the legacy Sigma SM_MX*_BC tag.</w:t>
       </w:r>
     </w:p>
     <w:tbl>
@@ -7995,7 +7856,145 @@
               <w:rPr>
                 <w:sz w:val="20"/>
               </w:rPr>
-              <w:t>PKG-01</w:t>
+              <w:t>BCD-01</w:t>
+            </w:r>
+          </w:p>
+        </w:tc>
+        <w:tc>
+          <w:tcPr>
+            <w:tcW w:type="dxa" w:w="1440"/>
+          </w:tcPr>
+          <w:p>
+            <w:r/>
+            <w:r>
+              <w:rPr>
+                <w:b/>
+                <w:color w:val="C98A0C"/>
+                <w:sz w:val="20"/>
+              </w:rPr>
+              <w:t>WARNING</w:t>
+            </w:r>
+          </w:p>
+        </w:tc>
+        <w:tc>
+          <w:tcPr>
+            <w:tcW w:type="dxa" w:w="6480"/>
+          </w:tcPr>
+          <w:p>
+            <w:r/>
+            <w:r>
+              <w:rPr>
+                <w:sz w:val="20"/>
+              </w:rPr>
+              <w:t>Station barcode format (≥ 6 digits) when active</w:t>
+            </w:r>
+          </w:p>
+        </w:tc>
+      </w:tr>
+      <w:tr>
+        <w:tc>
+          <w:tcPr>
+            <w:tcW w:type="dxa" w:w="1296"/>
+          </w:tcPr>
+          <w:p>
+            <w:r/>
+            <w:r>
+              <w:rPr>
+                <w:sz w:val="20"/>
+              </w:rPr>
+              <w:t>BCD-02</w:t>
+            </w:r>
+          </w:p>
+        </w:tc>
+        <w:tc>
+          <w:tcPr>
+            <w:tcW w:type="dxa" w:w="1440"/>
+          </w:tcPr>
+          <w:p>
+            <w:r/>
+            <w:r>
+              <w:rPr>
+                <w:b/>
+                <w:color w:val="C98A0C"/>
+                <w:sz w:val="20"/>
+              </w:rPr>
+              <w:t>WARNING</w:t>
+            </w:r>
+          </w:p>
+        </w:tc>
+        <w:tc>
+          <w:tcPr>
+            <w:tcW w:type="dxa" w:w="6480"/>
+          </w:tcPr>
+          <w:p>
+            <w:r/>
+            <w:r>
+              <w:rPr>
+                <w:sz w:val="20"/>
+              </w:rPr>
+              <w:t>Warehouse barcode valid (weight &gt; 0, count 1–6, noodle in set)</w:t>
+            </w:r>
+          </w:p>
+        </w:tc>
+      </w:tr>
+      <w:tr>
+        <w:tc>
+          <w:tcPr>
+            <w:tcW w:type="dxa" w:w="1296"/>
+          </w:tcPr>
+          <w:p>
+            <w:r/>
+            <w:r>
+              <w:rPr>
+                <w:sz w:val="20"/>
+              </w:rPr>
+              <w:t>BCD-03</w:t>
+            </w:r>
+          </w:p>
+        </w:tc>
+        <w:tc>
+          <w:tcPr>
+            <w:tcW w:type="dxa" w:w="1440"/>
+          </w:tcPr>
+          <w:p>
+            <w:r/>
+            <w:r>
+              <w:rPr>
+                <w:b/>
+                <w:color w:val="C98A0C"/>
+                <w:sz w:val="20"/>
+              </w:rPr>
+              <w:t>WARNING</w:t>
+            </w:r>
+          </w:p>
+        </w:tc>
+        <w:tc>
+          <w:tcPr>
+            <w:tcW w:type="dxa" w:w="6480"/>
+          </w:tcPr>
+          <w:p>
+            <w:r/>
+            <w:r>
+              <w:rPr>
+                <w:sz w:val="20"/>
+              </w:rPr>
+              <w:t>Shreeji barcode valid (non-empty id, MODE = "PV", weight &gt; 0)</w:t>
+            </w:r>
+          </w:p>
+        </w:tc>
+      </w:tr>
+      <w:tr>
+        <w:tc>
+          <w:tcPr>
+            <w:tcW w:type="dxa" w:w="1296"/>
+          </w:tcPr>
+          <w:p>
+            <w:r/>
+            <w:r>
+              <w:rPr>
+                <w:sz w:val="20"/>
+              </w:rPr>
+              <w:t>BCD-04</w:t>
             </w:r>
           </w:p>
         </w:tc>
@@ -8025,7 +8024,7 @@
               <w:rPr>
                 <w:sz w:val="20"/>
               </w:rPr>
-              <w:t>Grams &gt; 0</w:t>
+              <w:t>Sigma barcode (legacy) — empty/idle marker or pure numeric</w:t>
             </w:r>
           </w:p>
         </w:tc>
@@ -8041,7 +8040,7 @@
               <w:rPr>
                 <w:sz w:val="20"/>
               </w:rPr>
-              <w:t>PKG-02</w:t>
+              <w:t>BCD-05</w:t>
             </w:r>
           </w:p>
         </w:tc>
@@ -8053,11 +8052,10 @@
             <w:r/>
             <w:r>
               <w:rPr>
-                <w:b/>
-                <w:color w:val="C0392B"/>
-                <w:sz w:val="20"/>
-              </w:rPr>
-              <w:t>CRITICAL</w:t>
+                <w:color w:val="426BA5"/>
+                <w:sz w:val="20"/>
+              </w:rPr>
+              <w:t>INFO</w:t>
             </w:r>
           </w:p>
         </w:tc>
@@ -8071,236 +8069,7 @@
               <w:rPr>
                 <w:sz w:val="20"/>
               </w:rPr>
-              <w:t>|grams − wrapper_target| ≤ 3 g</w:t>
-            </w:r>
-          </w:p>
-        </w:tc>
-      </w:tr>
-      <w:tr>
-        <w:tc>
-          <w:tcPr>
-            <w:tcW w:type="dxa" w:w="1296"/>
-          </w:tcPr>
-          <w:p>
-            <w:r/>
-            <w:r>
-              <w:rPr>
-                <w:sz w:val="20"/>
-              </w:rPr>
-              <w:t>PKG-03</w:t>
-            </w:r>
-          </w:p>
-        </w:tc>
-        <w:tc>
-          <w:tcPr>
-            <w:tcW w:type="dxa" w:w="1440"/>
-          </w:tcPr>
-          <w:p>
-            <w:r/>
-            <w:r>
-              <w:rPr>
-                <w:b/>
-                <w:color w:val="C98A0C"/>
-                <w:sz w:val="20"/>
-              </w:rPr>
-              <w:t>WARNING</w:t>
-            </w:r>
-          </w:p>
-        </w:tc>
-        <w:tc>
-          <w:tcPr>
-            <w:tcW w:type="dxa" w:w="6480"/>
-          </w:tcPr>
-          <w:p>
-            <w:r/>
-            <w:r>
-              <w:rPr>
-                <w:sz w:val="20"/>
-              </w:rPr>
-              <w:t>No sudden jump &gt; 5 g between polls</w:t>
-            </w:r>
-          </w:p>
-        </w:tc>
-      </w:tr>
-      <w:tr>
-        <w:tc>
-          <w:tcPr>
-            <w:tcW w:type="dxa" w:w="1296"/>
-          </w:tcPr>
-          <w:p>
-            <w:r/>
-            <w:r>
-              <w:rPr>
-                <w:sz w:val="20"/>
-              </w:rPr>
-              <w:t>PKG-04</w:t>
-            </w:r>
-          </w:p>
-        </w:tc>
-        <w:tc>
-          <w:tcPr>
-            <w:tcW w:type="dxa" w:w="1440"/>
-          </w:tcPr>
-          <w:p>
-            <w:r/>
-            <w:r>
-              <w:rPr>
-                <w:b/>
-                <w:color w:val="C98A0C"/>
-                <w:sz w:val="20"/>
-              </w:rPr>
-              <w:t>WARNING</w:t>
-            </w:r>
-          </w:p>
-        </w:tc>
-        <w:tc>
-          <w:tcPr>
-            <w:tcW w:type="dxa" w:w="6480"/>
-          </w:tcPr>
-          <w:p>
-            <w:r/>
-            <w:r>
-              <w:rPr>
-                <w:sz w:val="20"/>
-              </w:rPr>
-              <w:t>Same-target peers in cascade within 3 g spread</w:t>
-            </w:r>
-          </w:p>
-        </w:tc>
-      </w:tr>
-      <w:tr>
-        <w:tc>
-          <w:tcPr>
-            <w:tcW w:type="dxa" w:w="1296"/>
-          </w:tcPr>
-          <w:p>
-            <w:r/>
-            <w:r>
-              <w:rPr>
-                <w:sz w:val="20"/>
-              </w:rPr>
-              <w:t>PKG-05</w:t>
-            </w:r>
-          </w:p>
-        </w:tc>
-        <w:tc>
-          <w:tcPr>
-            <w:tcW w:type="dxa" w:w="1440"/>
-          </w:tcPr>
-          <w:p>
-            <w:r/>
-            <w:r>
-              <w:rPr>
-                <w:b/>
-                <w:color w:val="C98A0C"/>
-                <w:sz w:val="20"/>
-              </w:rPr>
-              <w:t>WARNING</w:t>
-            </w:r>
-          </w:p>
-        </w:tc>
-        <w:tc>
-          <w:tcPr>
-            <w:tcW w:type="dxa" w:w="6480"/>
-          </w:tcPr>
-          <w:p>
-            <w:r/>
-            <w:r>
-              <w:rPr>
-                <w:sz w:val="20"/>
-              </w:rPr>
-              <w:t>MachineId matches WRAPPER_MACHINE_MAP expectation</w:t>
-            </w:r>
-          </w:p>
-        </w:tc>
-      </w:tr>
-      <w:tr>
-        <w:tc>
-          <w:tcPr>
-            <w:tcW w:type="dxa" w:w="1296"/>
-          </w:tcPr>
-          <w:p>
-            <w:r/>
-            <w:r>
-              <w:rPr>
-                <w:sz w:val="20"/>
-              </w:rPr>
-              <w:t>PKG-06</w:t>
-            </w:r>
-          </w:p>
-        </w:tc>
-        <w:tc>
-          <w:tcPr>
-            <w:tcW w:type="dxa" w:w="1440"/>
-          </w:tcPr>
-          <w:p>
-            <w:r/>
-            <w:r>
-              <w:rPr>
-                <w:b/>
-                <w:color w:val="C98A0C"/>
-                <w:sz w:val="20"/>
-              </w:rPr>
-              <w:t>WARNING</w:t>
-            </w:r>
-          </w:p>
-        </w:tc>
-        <w:tc>
-          <w:tcPr>
-            <w:tcW w:type="dxa" w:w="6480"/>
-          </w:tcPr>
-          <w:p>
-            <w:r/>
-            <w:r>
-              <w:rPr>
-                <w:sz w:val="20"/>
-              </w:rPr>
-              <w:t>Value not frozen for &gt; 5 identical consecutive polls</w:t>
-            </w:r>
-          </w:p>
-        </w:tc>
-      </w:tr>
-      <w:tr>
-        <w:tc>
-          <w:tcPr>
-            <w:tcW w:type="dxa" w:w="1296"/>
-          </w:tcPr>
-          <w:p>
-            <w:r/>
-            <w:r>
-              <w:rPr>
-                <w:sz w:val="20"/>
-              </w:rPr>
-              <w:t>PKG-07</w:t>
-            </w:r>
-          </w:p>
-        </w:tc>
-        <w:tc>
-          <w:tcPr>
-            <w:tcW w:type="dxa" w:w="1440"/>
-          </w:tcPr>
-          <w:p>
-            <w:r/>
-            <w:r>
-              <w:rPr>
-                <w:color w:val="426BA5"/>
-                <w:sz w:val="20"/>
-              </w:rPr>
-              <w:t>INFO</w:t>
-            </w:r>
-          </w:p>
-        </w:tc>
-        <w:tc>
-          <w:tcPr>
-            <w:tcW w:type="dxa" w:w="6480"/>
-          </w:tcPr>
-          <w:p>
-            <w:r/>
-            <w:r>
-              <w:rPr>
-                <w:sz w:val="20"/>
-              </w:rPr>
-              <w:t>Wrapper gap &gt; 6 min</w:t>
+              <w:t>Barcode streaming gap &gt; 15 min</w:t>
             </w:r>
           </w:p>
         </w:tc>
@@ -8316,7 +8085,7 @@
           <w:color w:val="334155"/>
           <w:sz w:val="24"/>
         </w:rPr>
-        <w:t>Walkthrough — Packaging Rules</w:t>
+        <w:t>Walkthrough — Barcode Rules</w:t>
       </w:r>
     </w:p>
     <w:p>
@@ -8329,7 +8098,7 @@
           <w:color w:val="334155"/>
           <w:sz w:val="22"/>
         </w:rPr>
-        <w:t xml:space="preserve">PKG-01  </w:t>
+        <w:t xml:space="preserve">BCD-01  </w:t>
       </w:r>
       <w:r>
         <w:rPr>
@@ -8337,7 +8106,334 @@
           <w:color w:val="102A43"/>
           <w:sz w:val="22"/>
         </w:rPr>
-        <w:t>Grams &gt; 0</w:t>
+        <w:t>Station barcode format (≥ 6 digits) when active</w:t>
+      </w:r>
+      <w:r>
+        <w:rPr>
+          <w:b/>
+          <w:color w:val="C98A0C"/>
+          <w:sz w:val="18"/>
+        </w:rPr>
+        <w:t xml:space="preserve">  [WARNING]</w:t>
+      </w:r>
+    </w:p>
+    <w:p>
+      <w:pPr>
+        <w:spacing w:after="20"/>
+        <w:ind w:left="170"/>
+      </w:pPr>
+      <w:r>
+        <w:rPr>
+          <w:b/>
+          <w:color w:val="06768A"/>
+          <w:sz w:val="20"/>
+        </w:rPr>
+        <w:t xml:space="preserve">What it checks. </w:t>
+      </w:r>
+      <w:r>
+        <w:rPr>
+          <w:sz w:val="20"/>
+        </w:rPr>
+        <w:t>When the station scanner is active, the value must be numeric and at least 6 digits long. Empty / short values are treated as idle (INFO, not a failure).</w:t>
+      </w:r>
+    </w:p>
+    <w:p>
+      <w:pPr>
+        <w:spacing w:after="20"/>
+        <w:ind w:left="170"/>
+      </w:pPr>
+      <w:r>
+        <w:rPr>
+          <w:b/>
+          <w:color w:val="06768A"/>
+          <w:sz w:val="20"/>
+        </w:rPr>
+        <w:t xml:space="preserve">Passes when. </w:t>
+      </w:r>
+      <w:r>
+        <w:rPr>
+          <w:sz w:val="20"/>
+        </w:rPr>
+        <w:t>"1300326026" — OK. "" — "Scanner idle / short value" (INFO).</w:t>
+      </w:r>
+    </w:p>
+    <w:p>
+      <w:pPr>
+        <w:spacing w:after="20"/>
+        <w:ind w:left="170"/>
+      </w:pPr>
+      <w:r>
+        <w:rPr>
+          <w:b/>
+          <w:color w:val="06768A"/>
+          <w:sz w:val="20"/>
+        </w:rPr>
+        <w:t xml:space="preserve">Fails when. </w:t>
+      </w:r>
+      <w:r>
+        <w:rPr>
+          <w:sz w:val="20"/>
+        </w:rPr>
+        <w:t>Genuinely broken active scans — non-numeric while not idle — fail.</w:t>
+      </w:r>
+    </w:p>
+    <w:p>
+      <w:pPr>
+        <w:spacing w:after="20"/>
+        <w:ind w:left="170"/>
+      </w:pPr>
+      <w:r>
+        <w:rPr>
+          <w:b/>
+          <w:color w:val="06768A"/>
+          <w:sz w:val="20"/>
+        </w:rPr>
+        <w:t xml:space="preserve">Why it matters. </w:t>
+      </w:r>
+      <w:r>
+        <w:rPr>
+          <w:sz w:val="20"/>
+        </w:rPr>
+        <w:t>Distinguishes idle scanners from malformed scans without flooding the alert log with false positives.</w:t>
+      </w:r>
+    </w:p>
+    <w:p>
+      <w:pPr>
+        <w:spacing w:before="200" w:after="40"/>
+      </w:pPr>
+      <w:r>
+        <w:rPr>
+          <w:b/>
+          <w:color w:val="334155"/>
+          <w:sz w:val="22"/>
+        </w:rPr>
+        <w:t xml:space="preserve">BCD-02  </w:t>
+      </w:r>
+      <w:r>
+        <w:rPr>
+          <w:b/>
+          <w:color w:val="102A43"/>
+          <w:sz w:val="22"/>
+        </w:rPr>
+        <w:t>Warehouse barcode valid (weight &gt; 0, count 1–6, noodle in set)</w:t>
+      </w:r>
+      <w:r>
+        <w:rPr>
+          <w:b/>
+          <w:color w:val="C98A0C"/>
+          <w:sz w:val="18"/>
+        </w:rPr>
+        <w:t xml:space="preserve">  [WARNING]</w:t>
+      </w:r>
+    </w:p>
+    <w:p>
+      <w:pPr>
+        <w:spacing w:after="20"/>
+        <w:ind w:left="170"/>
+      </w:pPr>
+      <w:r>
+        <w:rPr>
+          <w:b/>
+          <w:color w:val="06768A"/>
+          <w:sz w:val="20"/>
+        </w:rPr>
+        <w:t xml:space="preserve">What it checks. </w:t>
+      </w:r>
+      <w:r>
+        <w:rPr>
+          <w:sz w:val="20"/>
+        </w:rPr>
+        <w:t>Warehouse dosing barcode is CSV `batchId,weight,noodleType,count`. Weight must be &gt; 0; count must be 1–6; noodle must be in the valid set.</w:t>
+      </w:r>
+    </w:p>
+    <w:p>
+      <w:pPr>
+        <w:spacing w:after="20"/>
+        <w:ind w:left="170"/>
+      </w:pPr>
+      <w:r>
+        <w:rPr>
+          <w:b/>
+          <w:color w:val="06768A"/>
+          <w:sz w:val="20"/>
+        </w:rPr>
+        <w:t xml:space="preserve">Passes when. </w:t>
+      </w:r>
+      <w:r>
+        <w:rPr>
+          <w:sz w:val="20"/>
+        </w:rPr>
+        <w:t>"B12345,250.5,JASMINE NOODLES,2" — OK.</w:t>
+      </w:r>
+    </w:p>
+    <w:p>
+      <w:pPr>
+        <w:spacing w:after="20"/>
+        <w:ind w:left="170"/>
+      </w:pPr>
+      <w:r>
+        <w:rPr>
+          <w:b/>
+          <w:color w:val="06768A"/>
+          <w:sz w:val="20"/>
+        </w:rPr>
+        <w:t xml:space="preserve">Fails when. </w:t>
+      </w:r>
+      <w:r>
+        <w:rPr>
+          <w:sz w:val="20"/>
+        </w:rPr>
+        <w:t>"B12345,-10,JASMINE NOODLES,2" — emits "Invalid warehouse barcode: weight=-10".</w:t>
+      </w:r>
+    </w:p>
+    <w:p>
+      <w:pPr>
+        <w:spacing w:after="20"/>
+        <w:ind w:left="170"/>
+      </w:pPr>
+      <w:r>
+        <w:rPr>
+          <w:b/>
+          <w:color w:val="06768A"/>
+          <w:sz w:val="20"/>
+        </w:rPr>
+        <w:t xml:space="preserve">Why it matters. </w:t>
+      </w:r>
+      <w:r>
+        <w:rPr>
+          <w:sz w:val="20"/>
+        </w:rPr>
+        <w:t>Warehouse barcodes flow directly into ERP inventory. Garbage in = wrong stock counts and unexplained variance during the next audit.</w:t>
+      </w:r>
+    </w:p>
+    <w:p>
+      <w:pPr>
+        <w:spacing w:before="200" w:after="40"/>
+      </w:pPr>
+      <w:r>
+        <w:rPr>
+          <w:b/>
+          <w:color w:val="334155"/>
+          <w:sz w:val="22"/>
+        </w:rPr>
+        <w:t xml:space="preserve">BCD-03  </w:t>
+      </w:r>
+      <w:r>
+        <w:rPr>
+          <w:b/>
+          <w:color w:val="102A43"/>
+          <w:sz w:val="22"/>
+        </w:rPr>
+        <w:t>Shreeji barcode valid (non-empty id, MODE = "PV", weight &gt; 0)</w:t>
+      </w:r>
+      <w:r>
+        <w:rPr>
+          <w:b/>
+          <w:color w:val="C98A0C"/>
+          <w:sz w:val="18"/>
+        </w:rPr>
+        <w:t xml:space="preserve">  [WARNING]</w:t>
+      </w:r>
+    </w:p>
+    <w:p>
+      <w:pPr>
+        <w:spacing w:after="20"/>
+        <w:ind w:left="170"/>
+      </w:pPr>
+      <w:r>
+        <w:rPr>
+          <w:b/>
+          <w:color w:val="06768A"/>
+          <w:sz w:val="20"/>
+        </w:rPr>
+        <w:t xml:space="preserve">What it checks. </w:t>
+      </w:r>
+      <w:r>
+        <w:rPr>
+          <w:sz w:val="20"/>
+        </w:rPr>
+        <w:t>Shreeji barcode CSV is `barcodeId,MODE,weight`. The id must be non-empty, the MODE field must be the literal "PV" (its only documented value), and weight must be &gt; 0.</w:t>
+      </w:r>
+    </w:p>
+    <w:p>
+      <w:pPr>
+        <w:spacing w:after="20"/>
+        <w:ind w:left="170"/>
+      </w:pPr>
+      <w:r>
+        <w:rPr>
+          <w:b/>
+          <w:color w:val="06768A"/>
+          <w:sz w:val="20"/>
+        </w:rPr>
+        <w:t xml:space="preserve">Passes when. </w:t>
+      </w:r>
+      <w:r>
+        <w:rPr>
+          <w:sz w:val="20"/>
+        </w:rPr>
+        <w:t>"1300326026,PV,937.00" — OK.</w:t>
+      </w:r>
+    </w:p>
+    <w:p>
+      <w:pPr>
+        <w:spacing w:after="20"/>
+        <w:ind w:left="170"/>
+      </w:pPr>
+      <w:r>
+        <w:rPr>
+          <w:b/>
+          <w:color w:val="06768A"/>
+          <w:sz w:val="20"/>
+        </w:rPr>
+        <w:t xml:space="preserve">Fails when. </w:t>
+      </w:r>
+      <w:r>
+        <w:rPr>
+          <w:sz w:val="20"/>
+        </w:rPr>
+        <w:t>",PV,937.00" — empty id — emits "Invalid Shreeji barcode: id missing".  Or "1300326026,SP,937" — emits "mode='SP' (expected 'PV')".</w:t>
+      </w:r>
+    </w:p>
+    <w:p>
+      <w:pPr>
+        <w:spacing w:after="20"/>
+        <w:ind w:left="170"/>
+      </w:pPr>
+      <w:r>
+        <w:rPr>
+          <w:b/>
+          <w:color w:val="06768A"/>
+          <w:sz w:val="20"/>
+        </w:rPr>
+        <w:t xml:space="preserve">Why it matters. </w:t>
+      </w:r>
+      <w:r>
+        <w:rPr>
+          <w:sz w:val="20"/>
+        </w:rPr>
+        <w:t>Shreeji scans feed traceability data to the customer-audit pack. A mode-field flip or weight glitch makes the row untrustworthy for that audit.</w:t>
+      </w:r>
+    </w:p>
+    <w:p>
+      <w:pPr>
+        <w:spacing w:before="200" w:after="40"/>
+      </w:pPr>
+      <w:r>
+        <w:rPr>
+          <w:b/>
+          <w:color w:val="334155"/>
+          <w:sz w:val="22"/>
+        </w:rPr>
+        <w:t xml:space="preserve">BCD-04  </w:t>
+      </w:r>
+      <w:r>
+        <w:rPr>
+          <w:b/>
+          <w:color w:val="102A43"/>
+          <w:sz w:val="22"/>
+        </w:rPr>
+        <w:t>Sigma barcode (legacy) — empty/idle marker or pure numeric</w:t>
       </w:r>
       <w:r>
         <w:rPr>
@@ -8365,7 +8461,7 @@
         <w:rPr>
           <w:sz w:val="20"/>
         </w:rPr>
-        <w:t>Wrapper grams must be strictly positive.</w:t>
+        <w:t>Legacy rule for the old Sigma SM_MX*_BC scanner tags. Value must be empty, the literal "Scan Barcode" (idle marker), or pure numeric digits.</w:t>
       </w:r>
     </w:p>
     <w:p>
@@ -8385,7 +8481,7 @@
         <w:rPr>
           <w:sz w:val="20"/>
         </w:rPr>
-        <w:t>41 g — OK.</w:t>
+        <w:t>"Scan Barcode" — OK (idle). "1300326026" — OK (valid scan).</w:t>
       </w:r>
     </w:p>
     <w:p>
@@ -8405,7 +8501,7 @@
         <w:rPr>
           <w:sz w:val="20"/>
         </w:rPr>
-        <w:t>0 g — emits "Grams not positive (0)".</w:t>
+        <w:t>"ABC123XYZ" — emits "Malformed Sigma barcode 'ABC123XYZ'".</w:t>
       </w:r>
     </w:p>
     <w:p>
@@ -8425,7 +8521,7 @@
         <w:rPr>
           <w:sz w:val="20"/>
         </w:rPr>
-        <w:t>A zero or negative read on a wrapper scale means the wrapper jammed, did not seal, or the scale is faulty.</w:t>
+        <w:t>Retained for backwards-compatibility with older cascades that still emit the legacy barcode tag — new cascades emit BATCHCOUNTER + RECIPE_NAME instead.</w:t>
       </w:r>
     </w:p>
     <w:p>
@@ -8438,7 +8534,7 @@
           <w:color w:val="334155"/>
           <w:sz w:val="22"/>
         </w:rPr>
-        <w:t xml:space="preserve">PKG-02  </w:t>
+        <w:t xml:space="preserve">BCD-05  </w:t>
       </w:r>
       <w:r>
         <w:rPr>
@@ -8446,7 +8542,529 @@
           <w:color w:val="102A43"/>
           <w:sz w:val="22"/>
         </w:rPr>
-        <w:t>|grams − wrapper_target| ≤ 3 g</w:t>
+        <w:t>Barcode streaming gap &gt; 15 min</w:t>
+      </w:r>
+      <w:r>
+        <w:rPr>
+          <w:b/>
+          <w:color w:val="426BA5"/>
+          <w:sz w:val="18"/>
+        </w:rPr>
+        <w:t xml:space="preserve">  [INFO]</w:t>
+      </w:r>
+    </w:p>
+    <w:p>
+      <w:pPr>
+        <w:spacing w:after="20"/>
+        <w:ind w:left="170"/>
+      </w:pPr>
+      <w:r>
+        <w:rPr>
+          <w:b/>
+          <w:color w:val="06768A"/>
+          <w:sz w:val="20"/>
+        </w:rPr>
+        <w:t xml:space="preserve">What it checks. </w:t>
+      </w:r>
+      <w:r>
+        <w:rPr>
+          <w:sz w:val="20"/>
+        </w:rPr>
+        <w:t>Barcode tags are by their nature event-driven and sparse — we tolerate up to 15 min between emissions during production hours before flagging.</w:t>
+      </w:r>
+    </w:p>
+    <w:p>
+      <w:pPr>
+        <w:spacing w:after="20"/>
+        <w:ind w:left="170"/>
+      </w:pPr>
+      <w:r>
+        <w:rPr>
+          <w:b/>
+          <w:color w:val="06768A"/>
+          <w:sz w:val="20"/>
+        </w:rPr>
+        <w:t xml:space="preserve">Passes when. </w:t>
+      </w:r>
+      <w:r>
+        <w:rPr>
+          <w:sz w:val="20"/>
+        </w:rPr>
+        <w:t>5 min gap on a station scanner — OK (expected for low-throughput stations).</w:t>
+      </w:r>
+    </w:p>
+    <w:p>
+      <w:pPr>
+        <w:spacing w:after="20"/>
+        <w:ind w:left="170"/>
+      </w:pPr>
+      <w:r>
+        <w:rPr>
+          <w:b/>
+          <w:color w:val="06768A"/>
+          <w:sz w:val="20"/>
+        </w:rPr>
+        <w:t xml:space="preserve">Fails when. </w:t>
+      </w:r>
+      <w:r>
+        <w:rPr>
+          <w:sz w:val="20"/>
+        </w:rPr>
+        <w:t>22 min gap on a station scanner at 14:00 — emits "Barcode comms gap 22m0s".</w:t>
+      </w:r>
+    </w:p>
+    <w:p>
+      <w:pPr>
+        <w:spacing w:after="20"/>
+        <w:ind w:left="170"/>
+      </w:pPr>
+      <w:r>
+        <w:rPr>
+          <w:b/>
+          <w:color w:val="06768A"/>
+          <w:sz w:val="20"/>
+        </w:rPr>
+        <w:t xml:space="preserve">Why it matters. </w:t>
+      </w:r>
+      <w:r>
+        <w:rPr>
+          <w:sz w:val="20"/>
+        </w:rPr>
+        <w:t>Wider tolerance than the Silo / Sigma streaming-gap rules because barcodes are physically scanned, not polled. Catches a truly dead scanner rather than an idle one.</w:t>
+      </w:r>
+    </w:p>
+    <w:p>
+      <w:pPr>
+        <w:spacing w:before="280" w:after="80"/>
+      </w:pPr>
+      <w:r>
+        <w:rPr>
+          <w:b/>
+          <w:color w:val="06768A"/>
+          <w:sz w:val="28"/>
+        </w:rPr>
+        <w:t>5.6 Packaging Rules</w:t>
+      </w:r>
+    </w:p>
+    <w:tbl>
+      <w:tblPr>
+        <w:tblStyle w:val="LightGrid-Accent1"/>
+        <w:tblW w:type="auto" w:w="0"/>
+        <w:tblLayout w:type="fixed"/>
+        <w:tblLook w:firstColumn="1" w:firstRow="1" w:lastColumn="0" w:lastRow="0" w:noHBand="0" w:noVBand="1" w:val="04A0"/>
+      </w:tblPr>
+      <w:tblGrid>
+        <w:gridCol w:w="3324"/>
+        <w:gridCol w:w="3324"/>
+        <w:gridCol w:w="3324"/>
+      </w:tblGrid>
+      <w:tr>
+        <w:tc>
+          <w:tcPr>
+            <w:tcW w:type="dxa" w:w="1296"/>
+            <w:shd w:val="clear" w:color="auto" w:fill="102A43"/>
+          </w:tcPr>
+          <w:p>
+            <w:r/>
+            <w:r>
+              <w:rPr>
+                <w:b/>
+                <w:color w:val="FFFFFF"/>
+                <w:sz w:val="20"/>
+              </w:rPr>
+              <w:t>ID</w:t>
+            </w:r>
+          </w:p>
+        </w:tc>
+        <w:tc>
+          <w:tcPr>
+            <w:tcW w:type="dxa" w:w="1440"/>
+            <w:shd w:val="clear" w:color="auto" w:fill="102A43"/>
+          </w:tcPr>
+          <w:p>
+            <w:r/>
+            <w:r>
+              <w:rPr>
+                <w:b/>
+                <w:color w:val="FFFFFF"/>
+                <w:sz w:val="20"/>
+              </w:rPr>
+              <w:t>Severity</w:t>
+            </w:r>
+          </w:p>
+        </w:tc>
+        <w:tc>
+          <w:tcPr>
+            <w:tcW w:type="dxa" w:w="6480"/>
+            <w:shd w:val="clear" w:color="auto" w:fill="102A43"/>
+          </w:tcPr>
+          <w:p>
+            <w:r/>
+            <w:r>
+              <w:rPr>
+                <w:b/>
+                <w:color w:val="FFFFFF"/>
+                <w:sz w:val="20"/>
+              </w:rPr>
+              <w:t>Description</w:t>
+            </w:r>
+          </w:p>
+        </w:tc>
+      </w:tr>
+      <w:tr>
+        <w:tc>
+          <w:tcPr>
+            <w:tcW w:type="dxa" w:w="1296"/>
+          </w:tcPr>
+          <w:p>
+            <w:r/>
+            <w:r>
+              <w:rPr>
+                <w:sz w:val="20"/>
+              </w:rPr>
+              <w:t>PKG-01</w:t>
+            </w:r>
+          </w:p>
+        </w:tc>
+        <w:tc>
+          <w:tcPr>
+            <w:tcW w:type="dxa" w:w="1440"/>
+          </w:tcPr>
+          <w:p>
+            <w:r/>
+            <w:r>
+              <w:rPr>
+                <w:b/>
+                <w:color w:val="C0392B"/>
+                <w:sz w:val="20"/>
+              </w:rPr>
+              <w:t>CRITICAL</w:t>
+            </w:r>
+          </w:p>
+        </w:tc>
+        <w:tc>
+          <w:tcPr>
+            <w:tcW w:type="dxa" w:w="6480"/>
+          </w:tcPr>
+          <w:p>
+            <w:r/>
+            <w:r>
+              <w:rPr>
+                <w:sz w:val="20"/>
+              </w:rPr>
+              <w:t>Grams &gt; 0</w:t>
+            </w:r>
+          </w:p>
+        </w:tc>
+      </w:tr>
+      <w:tr>
+        <w:tc>
+          <w:tcPr>
+            <w:tcW w:type="dxa" w:w="1296"/>
+          </w:tcPr>
+          <w:p>
+            <w:r/>
+            <w:r>
+              <w:rPr>
+                <w:sz w:val="20"/>
+              </w:rPr>
+              <w:t>PKG-02</w:t>
+            </w:r>
+          </w:p>
+        </w:tc>
+        <w:tc>
+          <w:tcPr>
+            <w:tcW w:type="dxa" w:w="1440"/>
+          </w:tcPr>
+          <w:p>
+            <w:r/>
+            <w:r>
+              <w:rPr>
+                <w:b/>
+                <w:color w:val="C0392B"/>
+                <w:sz w:val="20"/>
+              </w:rPr>
+              <w:t>CRITICAL</w:t>
+            </w:r>
+          </w:p>
+        </w:tc>
+        <w:tc>
+          <w:tcPr>
+            <w:tcW w:type="dxa" w:w="6480"/>
+          </w:tcPr>
+          <w:p>
+            <w:r/>
+            <w:r>
+              <w:rPr>
+                <w:sz w:val="20"/>
+              </w:rPr>
+              <w:t>|grams − wrapper_target| ≤ 3 g</w:t>
+            </w:r>
+          </w:p>
+        </w:tc>
+      </w:tr>
+      <w:tr>
+        <w:tc>
+          <w:tcPr>
+            <w:tcW w:type="dxa" w:w="1296"/>
+          </w:tcPr>
+          <w:p>
+            <w:r/>
+            <w:r>
+              <w:rPr>
+                <w:sz w:val="20"/>
+              </w:rPr>
+              <w:t>PKG-03</w:t>
+            </w:r>
+          </w:p>
+        </w:tc>
+        <w:tc>
+          <w:tcPr>
+            <w:tcW w:type="dxa" w:w="1440"/>
+          </w:tcPr>
+          <w:p>
+            <w:r/>
+            <w:r>
+              <w:rPr>
+                <w:b/>
+                <w:color w:val="C98A0C"/>
+                <w:sz w:val="20"/>
+              </w:rPr>
+              <w:t>WARNING</w:t>
+            </w:r>
+          </w:p>
+        </w:tc>
+        <w:tc>
+          <w:tcPr>
+            <w:tcW w:type="dxa" w:w="6480"/>
+          </w:tcPr>
+          <w:p>
+            <w:r/>
+            <w:r>
+              <w:rPr>
+                <w:sz w:val="20"/>
+              </w:rPr>
+              <w:t>No sudden jump &gt; 5 g between polls</w:t>
+            </w:r>
+          </w:p>
+        </w:tc>
+      </w:tr>
+      <w:tr>
+        <w:tc>
+          <w:tcPr>
+            <w:tcW w:type="dxa" w:w="1296"/>
+          </w:tcPr>
+          <w:p>
+            <w:r/>
+            <w:r>
+              <w:rPr>
+                <w:sz w:val="20"/>
+              </w:rPr>
+              <w:t>PKG-04</w:t>
+            </w:r>
+          </w:p>
+        </w:tc>
+        <w:tc>
+          <w:tcPr>
+            <w:tcW w:type="dxa" w:w="1440"/>
+          </w:tcPr>
+          <w:p>
+            <w:r/>
+            <w:r>
+              <w:rPr>
+                <w:b/>
+                <w:color w:val="C98A0C"/>
+                <w:sz w:val="20"/>
+              </w:rPr>
+              <w:t>WARNING</w:t>
+            </w:r>
+          </w:p>
+        </w:tc>
+        <w:tc>
+          <w:tcPr>
+            <w:tcW w:type="dxa" w:w="6480"/>
+          </w:tcPr>
+          <w:p>
+            <w:r/>
+            <w:r>
+              <w:rPr>
+                <w:sz w:val="20"/>
+              </w:rPr>
+              <w:t>Same-target peers in cascade within 3 g spread</w:t>
+            </w:r>
+          </w:p>
+        </w:tc>
+      </w:tr>
+      <w:tr>
+        <w:tc>
+          <w:tcPr>
+            <w:tcW w:type="dxa" w:w="1296"/>
+          </w:tcPr>
+          <w:p>
+            <w:r/>
+            <w:r>
+              <w:rPr>
+                <w:sz w:val="20"/>
+              </w:rPr>
+              <w:t>PKG-05</w:t>
+            </w:r>
+          </w:p>
+        </w:tc>
+        <w:tc>
+          <w:tcPr>
+            <w:tcW w:type="dxa" w:w="1440"/>
+          </w:tcPr>
+          <w:p>
+            <w:r/>
+            <w:r>
+              <w:rPr>
+                <w:b/>
+                <w:color w:val="C98A0C"/>
+                <w:sz w:val="20"/>
+              </w:rPr>
+              <w:t>WARNING</w:t>
+            </w:r>
+          </w:p>
+        </w:tc>
+        <w:tc>
+          <w:tcPr>
+            <w:tcW w:type="dxa" w:w="6480"/>
+          </w:tcPr>
+          <w:p>
+            <w:r/>
+            <w:r>
+              <w:rPr>
+                <w:sz w:val="20"/>
+              </w:rPr>
+              <w:t>MachineId matches WRAPPER_MACHINE_MAP expectation</w:t>
+            </w:r>
+          </w:p>
+        </w:tc>
+      </w:tr>
+      <w:tr>
+        <w:tc>
+          <w:tcPr>
+            <w:tcW w:type="dxa" w:w="1296"/>
+          </w:tcPr>
+          <w:p>
+            <w:r/>
+            <w:r>
+              <w:rPr>
+                <w:sz w:val="20"/>
+              </w:rPr>
+              <w:t>PKG-06</w:t>
+            </w:r>
+          </w:p>
+        </w:tc>
+        <w:tc>
+          <w:tcPr>
+            <w:tcW w:type="dxa" w:w="1440"/>
+          </w:tcPr>
+          <w:p>
+            <w:r/>
+            <w:r>
+              <w:rPr>
+                <w:b/>
+                <w:color w:val="C98A0C"/>
+                <w:sz w:val="20"/>
+              </w:rPr>
+              <w:t>WARNING</w:t>
+            </w:r>
+          </w:p>
+        </w:tc>
+        <w:tc>
+          <w:tcPr>
+            <w:tcW w:type="dxa" w:w="6480"/>
+          </w:tcPr>
+          <w:p>
+            <w:r/>
+            <w:r>
+              <w:rPr>
+                <w:sz w:val="20"/>
+              </w:rPr>
+              <w:t>Value not frozen for &gt; 5 identical consecutive polls</w:t>
+            </w:r>
+          </w:p>
+        </w:tc>
+      </w:tr>
+      <w:tr>
+        <w:tc>
+          <w:tcPr>
+            <w:tcW w:type="dxa" w:w="1296"/>
+          </w:tcPr>
+          <w:p>
+            <w:r/>
+            <w:r>
+              <w:rPr>
+                <w:sz w:val="20"/>
+              </w:rPr>
+              <w:t>PKG-07</w:t>
+            </w:r>
+          </w:p>
+        </w:tc>
+        <w:tc>
+          <w:tcPr>
+            <w:tcW w:type="dxa" w:w="1440"/>
+          </w:tcPr>
+          <w:p>
+            <w:r/>
+            <w:r>
+              <w:rPr>
+                <w:color w:val="426BA5"/>
+                <w:sz w:val="20"/>
+              </w:rPr>
+              <w:t>INFO</w:t>
+            </w:r>
+          </w:p>
+        </w:tc>
+        <w:tc>
+          <w:tcPr>
+            <w:tcW w:type="dxa" w:w="6480"/>
+          </w:tcPr>
+          <w:p>
+            <w:r/>
+            <w:r>
+              <w:rPr>
+                <w:sz w:val="20"/>
+              </w:rPr>
+              <w:t>Wrapper gap &gt; 6 min</w:t>
+            </w:r>
+          </w:p>
+        </w:tc>
+      </w:tr>
+    </w:tbl>
+    <w:p>
+      <w:pPr>
+        <w:spacing w:before="200" w:after="40"/>
+      </w:pPr>
+      <w:r>
+        <w:rPr>
+          <w:b/>
+          <w:color w:val="334155"/>
+          <w:sz w:val="24"/>
+        </w:rPr>
+        <w:t>Walkthrough — Packaging Rules</w:t>
+      </w:r>
+    </w:p>
+    <w:p>
+      <w:pPr>
+        <w:spacing w:before="200" w:after="40"/>
+      </w:pPr>
+      <w:r>
+        <w:rPr>
+          <w:b/>
+          <w:color w:val="334155"/>
+          <w:sz w:val="22"/>
+        </w:rPr>
+        <w:t xml:space="preserve">PKG-01  </w:t>
+      </w:r>
+      <w:r>
+        <w:rPr>
+          <w:b/>
+          <w:color w:val="102A43"/>
+          <w:sz w:val="22"/>
+        </w:rPr>
+        <w:t>Grams &gt; 0</w:t>
       </w:r>
       <w:r>
         <w:rPr>
@@ -8474,7 +9092,7 @@
         <w:rPr>
           <w:sz w:val="20"/>
         </w:rPr>
-        <w:t>Measured grams must be within 3 g of the wrapper's target weight (looked up from the WRAPPER_TARGETS table).</w:t>
+        <w:t>Wrapper grams must be strictly positive.</w:t>
       </w:r>
     </w:p>
     <w:p>
@@ -8494,7 +9112,7 @@
         <w:rPr>
           <w:sz w:val="20"/>
         </w:rPr>
-        <w:t>WRA10 target 41 g, actual 42 g — 1 g off, OK.</w:t>
+        <w:t>41 g — OK.</w:t>
       </w:r>
     </w:p>
     <w:p>
@@ -8514,7 +9132,7 @@
         <w:rPr>
           <w:sz w:val="20"/>
         </w:rPr>
-        <w:t>WRA10 actual 46 g — 5 g off — emits "WRA10 46g off target 41g by 5g".</w:t>
+        <w:t>0 g — emits "Grams not positive (0)".</w:t>
       </w:r>
     </w:p>
     <w:p>
@@ -8534,7 +9152,7 @@
         <w:rPr>
           <w:sz w:val="20"/>
         </w:rPr>
-        <w:t>The customer-facing weight spec. Anything outside ±3 g is scrap, rework, or an immediate maintenance call.</w:t>
+        <w:t>A zero or negative read on a wrapper scale means the wrapper jammed, did not seal, or the scale is faulty.</w:t>
       </w:r>
     </w:p>
     <w:p>
@@ -8547,7 +9165,7 @@
           <w:color w:val="334155"/>
           <w:sz w:val="22"/>
         </w:rPr>
-        <w:t xml:space="preserve">PKG-03  </w:t>
+        <w:t xml:space="preserve">PKG-02  </w:t>
       </w:r>
       <w:r>
         <w:rPr>
@@ -8555,6 +9173,115 @@
           <w:color w:val="102A43"/>
           <w:sz w:val="22"/>
         </w:rPr>
+        <w:t>|grams − wrapper_target| ≤ 3 g</w:t>
+      </w:r>
+      <w:r>
+        <w:rPr>
+          <w:b/>
+          <w:color w:val="C0392B"/>
+          <w:sz w:val="18"/>
+        </w:rPr>
+        <w:t xml:space="preserve">  [CRITICAL]</w:t>
+      </w:r>
+    </w:p>
+    <w:p>
+      <w:pPr>
+        <w:spacing w:after="20"/>
+        <w:ind w:left="170"/>
+      </w:pPr>
+      <w:r>
+        <w:rPr>
+          <w:b/>
+          <w:color w:val="06768A"/>
+          <w:sz w:val="20"/>
+        </w:rPr>
+        <w:t xml:space="preserve">What it checks. </w:t>
+      </w:r>
+      <w:r>
+        <w:rPr>
+          <w:sz w:val="20"/>
+        </w:rPr>
+        <w:t>Measured grams must be within 3 g of the wrapper's target weight (looked up from the WRAPPER_TARGETS table).</w:t>
+      </w:r>
+    </w:p>
+    <w:p>
+      <w:pPr>
+        <w:spacing w:after="20"/>
+        <w:ind w:left="170"/>
+      </w:pPr>
+      <w:r>
+        <w:rPr>
+          <w:b/>
+          <w:color w:val="06768A"/>
+          <w:sz w:val="20"/>
+        </w:rPr>
+        <w:t xml:space="preserve">Passes when. </w:t>
+      </w:r>
+      <w:r>
+        <w:rPr>
+          <w:sz w:val="20"/>
+        </w:rPr>
+        <w:t>WRA10 target 41 g, actual 42 g — 1 g off, OK.</w:t>
+      </w:r>
+    </w:p>
+    <w:p>
+      <w:pPr>
+        <w:spacing w:after="20"/>
+        <w:ind w:left="170"/>
+      </w:pPr>
+      <w:r>
+        <w:rPr>
+          <w:b/>
+          <w:color w:val="06768A"/>
+          <w:sz w:val="20"/>
+        </w:rPr>
+        <w:t xml:space="preserve">Fails when. </w:t>
+      </w:r>
+      <w:r>
+        <w:rPr>
+          <w:sz w:val="20"/>
+        </w:rPr>
+        <w:t>WRA10 actual 46 g — 5 g off — emits "WRA10 46g off target 41g by 5g".</w:t>
+      </w:r>
+    </w:p>
+    <w:p>
+      <w:pPr>
+        <w:spacing w:after="20"/>
+        <w:ind w:left="170"/>
+      </w:pPr>
+      <w:r>
+        <w:rPr>
+          <w:b/>
+          <w:color w:val="06768A"/>
+          <w:sz w:val="20"/>
+        </w:rPr>
+        <w:t xml:space="preserve">Why it matters. </w:t>
+      </w:r>
+      <w:r>
+        <w:rPr>
+          <w:sz w:val="20"/>
+        </w:rPr>
+        <w:t>The customer-facing weight spec. Anything outside ±3 g is scrap, rework, or an immediate maintenance call.</w:t>
+      </w:r>
+    </w:p>
+    <w:p>
+      <w:pPr>
+        <w:spacing w:before="200" w:after="40"/>
+      </w:pPr>
+      <w:r>
+        <w:rPr>
+          <w:b/>
+          <w:color w:val="334155"/>
+          <w:sz w:val="22"/>
+        </w:rPr>
+        <w:t xml:space="preserve">PKG-03  </w:t>
+      </w:r>
+      <w:r>
+        <w:rPr>
+          <w:b/>
+          <w:color w:val="102A43"/>
+          <w:sz w:val="22"/>
+        </w:rPr>
         <w:t>No sudden jump &gt; 5 g between polls</w:t>
       </w:r>
       <w:r>
@@ -9092,7 +9819,7 @@
           <w:color w:val="06768A"/>
           <w:sz w:val="28"/>
         </w:rPr>
-        <w:t>5.6 Status Buckets</w:t>
+        <w:t>5.7 Status Buckets</w:t>
       </w:r>
     </w:p>
     <w:tbl>

</xml_diff>